<commit_message>
Schrodinger's Paperwork strict rescore 8.8 to 9.2: links rule (no visible URLs; Further Reading titles to Open Library/DOI, 107 links checked, 5 video dates fixed, citations link to entries), Lecture->Lesson references, Lolly's age, Tengelman composite, long-future figure redrawn, single review ask, ILWM subtitle; KDP blurb/keywords/categories; SCORES row
</commit_message>
<xml_diff>
--- a/Lolly Wren's Curious Science Adventures - SERIES/Book 1 - Schrodingers Paperwork/Schrodingers_Paperwork_BOOK_1_KINDLE_FINAL.docx
+++ b/Lolly Wren's Curious Science Adventures - SERIES/Book 1 - Schrodingers Paperwork/Schrodingers_Paperwork_BOOK_1_KINDLE_FINAL.docx
@@ -166,7 +166,7 @@
           <w:sz w:val="28"/>
           <w:szCs w:val="28"/>
         </w:rPr>
-        <w:t xml:space="preserve">Lolly Wren’s Curious Science Adventures </w:t>
+        <w:t xml:space="preserve">Lolly Wren’s Curious Science Adventures</w:t>
       </w:r>
     </w:p>
     <w:p>
@@ -307,7 +307,7 @@
           <w:sz w:val="18"/>
           <w:szCs w:val="18"/>
         </w:rPr>
-        <w:t>The physics explained in the lectures in the Appendix is presented in good faith and to the best of the author’s understanding. Where the science is unsettled, the text says so. Readers intending to sit an examination are warmly encouraged to consult a textbook as well.</w:t>
+        <w:t>The physics explained in the lessons at the back of the book is presented in good faith and to the best of the author’s understanding. Where the science is unsettled, the text says so. Readers intending to sit an examination are warmly encouraged to consult a textbook as well.</w:t>
       </w:r>
     </w:p>
     <w:p>
@@ -1067,7 +1067,7 @@
         <w:rPr>
           <w:color w:val="0070C0"/>
         </w:rPr>
-        <w:t xml:space="preserve"> </w:t>
+        <w:t xml:space="preserve"/>
       </w:r>
     </w:p>
     <w:p>
@@ -1301,7 +1301,7 @@
             <w:color w:val="0070C0"/>
             <w:u w:val="single"/>
           </w:rPr>
-          <w:t>If You Enjoyed This Book</w:t>
+          <w:t>Before You Go</w:t>
         </w:r>
       </w:hyperlink>
     </w:p>
@@ -15338,7 +15338,7 @@
     </w:p>
     <w:p>
       <w:r>
-        <w:t xml:space="preserve">“That is exactly wrong, and exactly what I wanted you to say,” Schrottfinger replied, delighted. “It is doing something. It is losing heat to the room, evenly, honestly, asking for nothing back — the way everything is supposed to. You, on the other hand, are thirty-five years of a losing argument with the second law, fought and, so far, won, locally, on credit.</w:t>
+        <w:t xml:space="preserve">“That is exactly wrong, and exactly what I wanted you to say,” Schrottfinger replied, delighted. “It is doing something. It is losing heat to the room, evenly, honestly, asking for nothing back — the way everything is supposed to. You, on the other hand, are thirty-four years of a losing argument with the second law, fought and, so far, won, locally, on credit.</w:t>
       </w:r>
     </w:p>
     <w:p>
@@ -15403,7 +15403,7 @@
       <w:r>
         <w:t>“The whole trouble with </w:t>
       </w:r>
-      <w:hyperlink r:id="rId123">
+      <w:hyperlink r:id="rId73">
         <w:r>
           <w:t xml:space="preserve">my cat</w:t>
         </w:r>
@@ -16024,20 +16024,6 @@
     </w:p>
     <w:p>
       <w:pPr>
-        <w:pStyle w:val="ListParagraph"/>
-        <w:spacing w:line="240" w:lineRule="auto"/>
-        <w:ind w:left="360"/>
-      </w:pPr>
-    </w:p>
-    <w:p>
-      <w:pPr>
-        <w:pStyle w:val="ListParagraph"/>
-        <w:spacing w:line="240" w:lineRule="auto"/>
-        <w:ind w:left="360"/>
-      </w:pPr>
-    </w:p>
-    <w:p>
-      <w:pPr>
         <w:jc w:val="both"/>
         <w:rPr>
           <w:sz w:val="22"/>
@@ -16061,7 +16047,7 @@
           <w:sz w:val="22"/>
           <w:szCs w:val="22"/>
         </w:rPr>
-        <w:t xml:space="preserve">One promise, kept throughout: where the science is genuinely unsettled, and a great deal of it is, this book says so plainly rather than tidying it away. </w:t>
+        <w:t xml:space="preserve">One promise, kept throughout: where the science is genuinely unsettled, and a great deal of it is, this book says so plainly rather than tidying it away.</w:t>
       </w:r>
     </w:p>
     <w:p>
@@ -16870,7 +16856,7 @@
           <w:sz w:val="20"/>
           <w:szCs w:val="20"/>
         </w:rPr>
-        <w:t>Max Tegmark</w:t>
+        <w:t>a composite: Hugh Everett III’s many worlds and Max Tegmark’s mathematical universe</w:t>
       </w:r>
       <w:r>
         <w:br/>
@@ -17206,7 +17192,7 @@
     </w:p>
     <w:p>
       <w:r>
-        <w:t xml:space="preserve">The following document was recovered from the Ministry’s internal circulation system. </w:t>
+        <w:t xml:space="preserve">The following document was recovered from the Ministry’s internal circulation system.</w:t>
       </w:r>
     </w:p>
     <w:p>
@@ -17241,7 +17227,7 @@
     </w:p>
     <w:p>
       <w:r>
-        <w:t xml:space="preserve">Restricted Purpose: To permit officers to discuss the physics without reading any of it </w:t>
+        <w:t xml:space="preserve">Restricted Purpose: To permit officers to discuss the physics without reading any of it</w:t>
       </w:r>
     </w:p>
     <w:p>
@@ -17286,7 +17272,7 @@
         </w:r>
       </w:hyperlink>
       <w:r>
-        <w:t xml:space="preserve">: it has no definite value for some property until that property is measured. </w:t>
+        <w:t xml:space="preserve">: it has no definite value for some property until that property is measured.</w:t>
       </w:r>
     </w:p>
     <w:p>
@@ -17650,7 +17636,7 @@
           <w:sz w:val="22"/>
           <w:szCs w:val="22"/>
         </w:rPr>
-        <w:t xml:space="preserve"> proves that no theory in which distant things have their own separate pre-existing properties can reproduce the correlations we measure. </w:t>
+        <w:t xml:space="preserve"> proves that no theory in which distant things have their own separate pre-existing properties can reproduce the correlations we measure.</w:t>
       </w:r>
     </w:p>
     <w:p>
@@ -17757,7 +17743,7 @@
           <w:sz w:val="22"/>
           <w:szCs w:val="22"/>
         </w:rPr>
-        <w:t xml:space="preserve"> propose that everything is made of extended objects in more dimensions than are currently invoiced. </w:t>
+        <w:t xml:space="preserve"> propose that everything is made of extended objects in more dimensions than are currently invoiced.</w:t>
       </w:r>
     </w:p>
     <w:p>
@@ -17776,7 +17762,7 @@
           <w:sz w:val="22"/>
           <w:szCs w:val="22"/>
         </w:rPr>
-        <w:t xml:space="preserve">The mathematics is extraordinary. </w:t>
+        <w:t xml:space="preserve">The mathematics is extraordinary.</w:t>
       </w:r>
     </w:p>
     <w:p>
@@ -17942,7 +17928,7 @@
           <w:sz w:val="22"/>
           <w:szCs w:val="22"/>
         </w:rPr>
-        <w:t xml:space="preserve">The universe contains very few places where it is described. These are the scarce resource. </w:t>
+        <w:t xml:space="preserve">The universe contains very few places where it is described. These are the scarce resource.</w:t>
       </w:r>
     </w:p>
     <w:p>
@@ -17984,7 +17970,7 @@
           <w:sz w:val="22"/>
           <w:szCs w:val="22"/>
         </w:rPr>
-        <w:t xml:space="preserve">There is no moment at which a state is finally settled and may be filed. </w:t>
+        <w:t xml:space="preserve">There is no moment at which a state is finally settled and may be filed.</w:t>
       </w:r>
     </w:p>
     <w:p>
@@ -18181,12 +18167,12 @@
     </w:p>
     <w:p>
       <w:r>
-        <w:t xml:space="preserve">The only standard that matters here is an old one, attributed to several famous physicists and reliably traced to none of them: </w:t>
-      </w:r>
-    </w:p>
-    <w:p>
-      <w:r>
-        <w:t xml:space="preserve">if you cannot explain it simply, you do not understand it yet, and pretending otherwise is the beginning of every disaster in this novel. </w:t>
+        <w:t xml:space="preserve">The only standard that matters here is an old one, attributed to several famous physicists and reliably traced to none of them:</w:t>
+      </w:r>
+    </w:p>
+    <w:p>
+      <w:r>
+        <w:t xml:space="preserve">if you cannot explain it simply, you do not understand it yet, and pretending otherwise is the beginning of every disaster in this novel.</w:t>
       </w:r>
     </w:p>
     <w:p>
@@ -18197,32 +18183,32 @@
     <w:p/>
     <w:p>
       <w:r>
-        <w:t xml:space="preserve">How to sit in this class. Eighteen lectures, in the order the story forced the questions </w:t>
-      </w:r>
-    </w:p>
-    <w:p>
-      <w:r>
-        <w:t xml:space="preserve">(Lecture 14 in two hours). </w:t>
-      </w:r>
-    </w:p>
-    <w:p>
-      <w:r>
-        <w:t xml:space="preserve">Each follows a chapter of the novel; Chapter 14 has two, and Chapter 15 has none of its own. </w:t>
-      </w:r>
-    </w:p>
-    <w:p>
-      <w:r>
-        <w:t xml:space="preserve">Take them after the novel, cold, and in order. Nothing in the story sends you here, and nothing here is needed for the story. </w:t>
-      </w:r>
-    </w:p>
-    <w:p>
-      <w:r>
-        <w:t xml:space="preserve">Skip the equations if you must; never skip the picture. </w:t>
-      </w:r>
-    </w:p>
-    <w:p>
-      <w:r>
-        <w:t xml:space="preserve">At the end of each lecture, stop and explain the idea out loud as if Mrs Chain were sitting in that chair. If she looks unconvinced, go back. </w:t>
+        <w:t xml:space="preserve">How to sit in this class. Eighteen lectures, in the order the story forced the questions</w:t>
+      </w:r>
+    </w:p>
+    <w:p>
+      <w:r>
+        <w:t xml:space="preserve">(Lecture 14 in two hours).</w:t>
+      </w:r>
+    </w:p>
+    <w:p>
+      <w:r>
+        <w:t xml:space="preserve">Each follows a chapter of the novel; Chapter 14 has two, and Chapter 15 has none of its own.</w:t>
+      </w:r>
+    </w:p>
+    <w:p>
+      <w:r>
+        <w:t xml:space="preserve">Take them after the novel, cold, and in order. Nothing in the story sends you here, and nothing here is needed for the story.</w:t>
+      </w:r>
+    </w:p>
+    <w:p>
+      <w:r>
+        <w:t xml:space="preserve">Skip the equations if you must; never skip the picture.</w:t>
+      </w:r>
+    </w:p>
+    <w:p>
+      <w:r>
+        <w:t xml:space="preserve">At the end of each lecture, stop and explain the idea out loud as if Mrs Chain were sitting in that chair. If she looks unconvinced, go back.</w:t>
       </w:r>
     </w:p>
     <w:p>
@@ -18267,7 +18253,7 @@
     </w:p>
     <w:p>
       <w:r>
-        <w:t xml:space="preserve">Superposition; the question your apparatus can ask; asking too soon; </w:t>
+        <w:t xml:space="preserve">Superposition; the question your apparatus can ask; asking too soon;</w:t>
       </w:r>
     </w:p>
     <w:p>
@@ -18295,12 +18281,12 @@
         <w:rPr>
           <w:b/>
         </w:rPr>
-        <w:t xml:space="preserve"> </w:t>
-      </w:r>
-    </w:p>
-    <w:p>
-      <w:r>
-        <w:t xml:space="preserve">Evaporating holes; entanglement; why you cannot copy a secret; </w:t>
+        <w:t xml:space="preserve"/>
+      </w:r>
+    </w:p>
+    <w:p>
+      <w:r>
+        <w:t xml:space="preserve">Evaporating holes; entanglement; why you cannot copy a secret;</w:t>
       </w:r>
     </w:p>
     <w:p>
@@ -18423,7 +18409,7 @@
     <w:p/>
     <w:p>
       <w:r>
-        <w:t xml:space="preserve">You are done when you can say each lecture’s last sentence in your own words, and answer the stop-question without peeking. </w:t>
+        <w:t xml:space="preserve">You are done when you can say each lecture’s last sentence in your own words, and answer the stop-question without peeking.</w:t>
       </w:r>
     </w:p>
     <w:p>
@@ -18545,7 +18531,7 @@
           <w:sz w:val="22"/>
           <w:szCs w:val="22"/>
         </w:rPr>
-        <w:t xml:space="preserve">  </w:t>
+        <w:t xml:space="preserve"/>
       </w:r>
     </w:p>
     <w:p>
@@ -18700,14 +18686,14 @@
     </w:p>
     <w:p>
       <w:r>
-        <w:t xml:space="preserve">A number of the experiments described in the lectures have also been rebuilt as interactive demonstrations, viewable at </w:t>
+        <w:t xml:space="preserve">A number of the experiments described in the lessons have also been rebuilt as interactive demonstrations, viewable on </w:t>
       </w:r>
       <w:hyperlink r:id="rId6" w:history="1">
         <w:r>
           <w:rPr>
             <w:rStyle w:val="Hyperlink"/>
           </w:rPr>
-          <w:t>lotmus.github.io/lolly-wren-companion</w:t>
+          <w:t>the Lolly Wren companion site</w:t>
         </w:r>
       </w:hyperlink>
       <w:r>
@@ -18716,12 +18702,12 @@
     </w:p>
     <w:p>
       <w:r>
-        <w:t xml:space="preserve">If a demonstration is mentioned in a lecture’s Going-deeper block, the companion page for that lecture is the one whose number matches the lesson. Lecture 1’s superposition toy is not a plot device. It is the thing Lolly wrote in pencil and then covered with her hand.</w:t>
-      </w:r>
-    </w:p>
-    <w:p>
-      <w:r>
-        <w:t xml:space="preserve">Lecture 1: </w:t>
+        <w:t xml:space="preserve">If a demonstration is mentioned in a lesson’s Going-deeper block, the companion page for that lesson is the one whose number matches the lesson. Lesson 1’s superposition toy is not a plot device. It is the thing Lolly wrote in pencil and then covered with her hand.</w:t>
+      </w:r>
+    </w:p>
+    <w:p>
+      <w:r>
+        <w:t xml:space="preserve">Lesson 1: </w:t>
       </w:r>
       <w:hyperlink r:id="rId124" w:history="1">
         <w:r>
@@ -18732,7 +18718,7 @@
         </w:r>
       </w:hyperlink>
       <w:r>
-        <w:t xml:space="preserve"> — a two-path superposition you can refuse to collapse. Lecture 2: </w:t>
+        <w:t xml:space="preserve"> — a two-path superposition you can refuse to collapse. Lesson 2: </w:t>
       </w:r>
       <w:hyperlink r:id="rId125" w:history="1">
         <w:r>
@@ -18743,7 +18729,7 @@
         </w:r>
       </w:hyperlink>
       <w:r>
-        <w:t xml:space="preserve"> — polarisers as a measurement basis. Lecture 4: </w:t>
+        <w:t xml:space="preserve"> — polarisers as a measurement basis. Lesson 4: </w:t>
       </w:r>
       <w:hyperlink r:id="rId126" w:history="1">
         <w:r>
@@ -18754,7 +18740,7 @@
         </w:r>
       </w:hyperlink>
       <w:r>
-        <w:t xml:space="preserve"> — a Zeno slider that makes Venn look less hypothetical. Lecture 13: </w:t>
+        <w:t xml:space="preserve"> — a Zeno slider that makes Venn look less hypothetical. Lesson 13: </w:t>
       </w:r>
       <w:hyperlink r:id="rId127" w:history="1">
         <w:r>
@@ -18765,7 +18751,7 @@
         </w:r>
       </w:hyperlink>
       <w:r>
-        <w:t xml:space="preserve"> — a CHSH scoreboard that will not let you beat 2√2. If a demo is down, the lecture still stands. The universe is not hosted on GitHub.</w:t>
+        <w:t xml:space="preserve"> — a CHSH scoreboard that will not let you beat 2√2. If a demo is down, the lesson still stands. The universe is not hosted on GitHub.</w:t>
       </w:r>
     </w:p>
     <w:p>
@@ -19451,13 +19437,6 @@
     <w:p/>
     <w:p>
       <w:pPr>
-        <w:spacing w:after="60"/>
-        <w:ind w:left="360"/>
-        <w:jc w:val="both"/>
-      </w:pPr>
-    </w:p>
-    <w:p>
-      <w:pPr>
         <w:spacing w:after="160"/>
         <w:jc w:val="both"/>
       </w:pPr>
@@ -22197,7 +22176,7 @@
         </w:r>
       </w:hyperlink>
       <w:r>
-        <w:t xml:space="preserve">, </w:t>
+        <w:t xml:space="preserve">,</w:t>
       </w:r>
     </w:p>
     <w:p>
@@ -22268,7 +22247,7 @@
         <w:jc w:val="both"/>
       </w:pPr>
       <w:r>
-        <w:t xml:space="preserve">which preserves total probability and can be reversed mathematically. </w:t>
+        <w:t xml:space="preserve">which preserves total probability and can be reversed mathematically.</w:t>
       </w:r>
     </w:p>
     <w:p>
@@ -23904,14 +23883,6 @@
     </w:p>
     <w:p>
       <w:pPr>
-        <w:rPr>
-          <w:sz w:val="8"/>
-          <w:szCs w:val="8"/>
-        </w:rPr>
-      </w:pPr>
-    </w:p>
-    <w:p>
-      <w:pPr>
         <w:spacing w:after="160"/>
         <w:jc w:val="both"/>
       </w:pPr>
@@ -24156,7 +24127,7 @@
         <w:t xml:space="preserve">Going deeper (skip freely).</w:t>
       </w:r>
       <w:r>
-        <w:t xml:space="preserve"> The no-cloning theorem (1982) is short and final: </w:t>
+        <w:t xml:space="preserve"> The no-cloning theorem (1982) is short and final:</w:t>
       </w:r>
     </w:p>
     <w:p>
@@ -24211,7 +24182,7 @@
         <w:t>⟩</w:t>
       </w:r>
       <w:r>
-        <w:t xml:space="preserve">, </w:t>
+        <w:t xml:space="preserve">,</w:t>
       </w:r>
     </w:p>
     <w:p>
@@ -24304,7 +24275,7 @@
           <w:b/>
           <w:bCs/>
         </w:rPr>
-        <w:t xml:space="preserve"> </w:t>
+        <w:t xml:space="preserve"/>
       </w:r>
     </w:p>
     <w:p>
@@ -24402,7 +24373,7 @@
         <w:t>2</w:t>
       </w:r>
       <w:r>
-        <w:t xml:space="preserve">. </w:t>
+        <w:t xml:space="preserve">.</w:t>
       </w:r>
     </w:p>
     <w:p>
@@ -24865,15 +24836,15 @@
         <w:t>Where the popular version goes wrong.</w:t>
       </w:r>
       <w:r>
-        <w:t xml:space="preserve"> The usual story says that a particle secretly has an exact place and an exact motion, but an observer inevitably knocks it about while looking. That can happen in a real experiment, yet it is not what Heisenberg’s principle says. </w:t>
-      </w:r>
-    </w:p>
-    <w:p>
-      <w:pPr>
-        <w:jc w:val="both"/>
-      </w:pPr>
-      <w:r>
-        <w:t xml:space="preserve">Quantum theory does not merely hide two exact pre-existing answers behind bad instruments; it sets a limit on how narrowly the two corresponding distributions can coexist in one state. </w:t>
+        <w:t xml:space="preserve"> The usual story says that a particle secretly has an exact place and an exact motion, but an observer inevitably knocks it about while looking. That can happen in a real experiment, yet it is not what Heisenberg’s principle says.</w:t>
+      </w:r>
+    </w:p>
+    <w:p>
+      <w:pPr>
+        <w:jc w:val="both"/>
+      </w:pPr>
+      <w:r>
+        <w:t xml:space="preserve">Quantum theory does not merely hide two exact pre-existing answers behind bad instruments; it sets a limit on how narrowly the two corresponding distributions can coexist in one state.</w:t>
       </w:r>
     </w:p>
     <w:p>
@@ -24926,7 +24897,7 @@
         <w:t xml:space="preserve">Going deeper (skip freely).</w:t>
       </w:r>
       <w:r>
-        <w:t xml:space="preserve"> Heisenberg stated the uncertainty idea in 1927; the precise statistical form below is a property of the quantum state itself, not merely of clumsy instruments. </w:t>
+        <w:t xml:space="preserve"> Heisenberg stated the uncertainty idea in 1927; the precise statistical form below is a property of the quantum state itself, not merely of clumsy instruments.</w:t>
       </w:r>
     </w:p>
     <w:p>
@@ -25031,7 +25002,7 @@
         <w:t>ℏ</w:t>
       </w:r>
       <w:r>
-        <w:t xml:space="preserve"> is Planck’s constant divided by 2π, a very small quantity, which is why the restriction is usually invisible for houses and people. </w:t>
+        <w:t xml:space="preserve"> is Planck’s constant divided by 2π, a very small quantity, which is why the restriction is usually invisible for houses and people.</w:t>
       </w:r>
     </w:p>
     <w:p>
@@ -25040,7 +25011,7 @@
         <w:jc w:val="both"/>
       </w:pPr>
       <w:r>
-        <w:t xml:space="preserve">The mathematical reason is a Fourier relation: narrowing a position wave pattern requires combining a broad range of wavelengths, while a narrow range of wavelengths makes the pattern spatially broad. </w:t>
+        <w:t xml:space="preserve">The mathematical reason is a Fourier relation: narrowing a position wave pattern requires combining a broad range of wavelengths, while a narrow range of wavelengths makes the pattern spatially broad.</w:t>
       </w:r>
     </w:p>
     <w:p>
@@ -25738,7 +25709,7 @@
         <w:rPr>
           <w:bCs/>
         </w:rPr>
-        <w:t xml:space="preserve"> problem; </w:t>
+        <w:t xml:space="preserve"> problem;</w:t>
       </w:r>
     </w:p>
     <w:p>
@@ -25756,7 +25727,7 @@
         <w:rPr>
           <w:bCs/>
         </w:rPr>
-        <w:t xml:space="preserve">pilot waves; </w:t>
+        <w:t xml:space="preserve">pilot waves;</w:t>
       </w:r>
     </w:p>
     <w:p>
@@ -25774,7 +25745,7 @@
         <w:rPr>
           <w:bCs/>
         </w:rPr>
-        <w:t xml:space="preserve">strings, horizons, and </w:t>
+        <w:t xml:space="preserve">strings, horizons, and</w:t>
       </w:r>
     </w:p>
     <w:p>
@@ -27900,7 +27871,7 @@
           <w:sz w:val="16"/>
           <w:szCs w:val="16"/>
         </w:rPr>
-        <w:t xml:space="preserve"> </w:t>
+        <w:t xml:space="preserve"/>
       </w:r>
     </w:p>
     <w:p>
@@ -28344,17 +28315,6 @@
       </w:pPr>
     </w:p>
     <w:p>
-      <w:pPr>
-        <w:jc w:val="both"/>
-        <w:rPr>
-          <w:i/>
-          <w:iCs/>
-          <w:sz w:val="10"/>
-          <w:szCs w:val="10"/>
-        </w:rPr>
-      </w:pPr>
-    </w:p>
-    <w:p>
       <w:r>
         <w:rPr>
           <w:b/>
@@ -30744,8 +30704,18 @@
         <w:t>Going deeper (skip freely).</w:t>
       </w:r>
       <w:r>
-        <w:rPr/>
-        <w:t> In What Is Life? (1944), Schrödinger said that organisms feed on “negative entropy”; modern thermodynamics states the point more precisely as entropy export by an open system. Formally, for an organism and its surroundings together:</w:t>
+        <w:t xml:space="preserve"> In </w:t>
+      </w:r>
+      <w:hyperlink w:anchor="frSchrodingerWhatIsLife" w:history="1">
+        <w:r>
+          <w:rPr>
+            <w:rStyle w:val="Hyperlink"/>
+          </w:rPr>
+          <w:t xml:space="preserve">What Is Life?</w:t>
+        </w:r>
+      </w:hyperlink>
+      <w:r>
+        <w:t xml:space="preserve"> (1944), Schrödinger said that organisms feed on “negative entropy”; modern thermodynamics states the point more precisely as entropy export by an open system. Formally, for an organism and its surroundings together:</w:t>
       </w:r>
     </w:p>
     <w:p>
@@ -30970,7 +30940,7 @@
         </w:rPr>
         <w:drawing>
           <wp:inline distT="0" distB="0" distL="0" distR="0" wp14:anchorId="4F04F242" wp14:editId="4DCCE34A">
-            <wp:extent cx="6772383" cy="2956956"/>
+            <wp:extent cx="6772383" cy="2575413"/>
             <wp:effectExtent l="0" t="0" r="0" b="0"/>
             <wp:docPr id="9019" name="Figure 9019"/>
             <wp:cNvGraphicFramePr>
@@ -30994,7 +30964,7 @@
                   <pic:spPr bwMode="auto">
                     <a:xfrm>
                       <a:off x="0" y="0"/>
-                      <a:ext cx="6798299" cy="2968272"/>
+                      <a:ext cx="6798299" cy="2575413"/>
                     </a:xfrm>
                     <a:prstGeom prst="rect">
                       <a:avLst/>
@@ -31469,7 +31439,7 @@
         <w:jc w:val="both"/>
       </w:pPr>
       <w:r>
-        <w:t>Not every good fact fit its assigned lecture. These did not want to be cut, and did not have a chapter of their own to live in, so they live here instead — optional, as ever, and not needed for anything that happens in the book.</w:t>
+        <w:t>Not every good fact fit its assigned lesson. These did not want to be cut, and did not have a chapter of their own to live in, so they live here instead — optional, as ever, and not needed for anything that happens in the book.</w:t>
       </w:r>
     </w:p>
     <w:p/>
@@ -31485,7 +31455,7 @@
         <w:rPr>
           <w:b/>
         </w:rPr>
-        <w:t xml:space="preserve">On the wavelength of a proton (from Lecture 12). </w:t>
+        <w:t xml:space="preserve">On the wavelength of a proton (from Lesson 12). </w:t>
       </w:r>
       <w:r>
         <w:rPr>
@@ -31500,7 +31470,7 @@
         <w:jc w:val="both"/>
       </w:pPr>
       <w:r>
-        <w:t>A heavy particle is not thereby a classical one. Solar-core temperatures are nowhere near hot enough, classically, for protons to overcome their mutual electrical repulsion; the Sun fuses hydrogen only because protons can cross that Coulomb barrier by quantum tunnelling, the same barrier-crossing effect met in Lecture 6, applied here to stellar cores rather than event horizons. And the reason some isotopes are stable while their near neighbours are not is that protons and neutrons fill discrete </w:t>
+        <w:t>A heavy particle is not thereby a classical one. Solar-core temperatures are nowhere near hot enough, classically, for protons to overcome their mutual electrical repulsion; the Sun fuses hydrogen only because protons can cross that Coulomb barrier by quantum tunnelling, the same barrier-crossing effect met in Lesson 6, applied here to stellar cores rather than event horizons. And the reason some isotopes are stable while their near neighbours are not is that protons and neutrons fill discrete </w:t>
       </w:r>
       <w:hyperlink w:anchor="glNuclearShell">
         <w:r>
@@ -31524,7 +31494,7 @@
         <w:rPr>
           <w:b/>
         </w:rPr>
-        <w:t xml:space="preserve">On the number nobody derived (from Lecture 18). </w:t>
+        <w:t xml:space="preserve">On the number nobody derived (from Lesson 18). </w:t>
       </w:r>
       <w:r>
         <w:rPr>
@@ -31594,7 +31564,7 @@
         <w:rPr>
           <w:b/>
         </w:rPr>
-        <w:t xml:space="preserve">On the vacuum that is not empty (from Lectures 6 and 14). </w:t>
+        <w:t xml:space="preserve">On the vacuum that is not empty (from Lessons 6 and 14). </w:t>
       </w:r>
       <w:r>
         <w:t>What a distant observer calls empty space around a hole is not a cleared desk. Quantum fields have a lowest-energy arrangement, and which arrangement counts as “lowest” depends on the observer’s motion and on the spacetime they inhabit. That is why Hawking radiation does not require a particle factory, and why the Unruh effect can warm an accelerating thermometer in a vacuum another observer still calls cold. The Ministry’s phrase for this would be “legacy emptiness.” It is not recommended.</w:t>
@@ -31613,13 +31583,12 @@
           <w:b/>
         </w:rPr>
         <w:lastRenderedPageBreak/>
-        <w:t xml:space="preserve">On the number that is a bound, not a score (from Lecture 13). </w:t>
+        <w:t xml:space="preserve">On the number that is a bound, not a score (from Lesson 13). </w:t>
       </w:r>
       <w:r>
         <w:t>Tsirelson’s 2√2 is not a target for staff appraisals. It is the most quantum mechanics itself will give you in a CHSH test. Local hidden variables cannot pass 2. Nature passes 2 and stops before 4. Any spreadsheet that prints a 4 has not discovered new physics. Check the sample, the selection rules, and the arithmetic before anyone commissions a new universe.</w:t>
       </w:r>
     </w:p>
-    <w:p/>
     <w:p/>
     <w:p>
       <w:pPr>
@@ -31675,7 +31644,7 @@
         <w:t>Amplitude (probability)</w:t>
       </w:r>
       <w:r>
-        <w:t xml:space="preserve">  —  The complex weight attached to an alternative in a superposition. Square its size for a probability; keep the phase if you want interference. Lose the phase and you have only a list of odds, which is what decoherence sells you.  (Chapter 1)</w:t>
+        <w:t xml:space="preserve"> — The complex weight attached to an alternative in a superposition. Square its size for a probability; keep the phase if you want interference. Lose the phase and you have only a list of odds, which is what decoherence sells you.  (Chapter 1)</w:t>
       </w:r>
     </w:p>
     <w:p>
@@ -31700,7 +31669,7 @@
         </w:r>
       </w:hyperlink>
       <w:r>
-        <w:t xml:space="preserve"> YouTube, 13 Sept. 2017, youtube.com/watch?v=MzRCDLre1b4.</w:t>
+        <w:t xml:space="preserve"> YouTube, 13 Sept. 2017.</w:t>
       </w:r>
     </w:p>
     <w:p>
@@ -31735,7 +31704,7 @@
         <w:t>Bell’s theorem</w:t>
       </w:r>
       <w:r>
-        <w:t xml:space="preserve">  —  The proof that no theory in which separated things carry their own pre-existing properties and cannot influence one another faster than light can reproduce the correlations quantum mechanics predicts. Experiment sides with quantum mechanics.  (Chapter 13)</w:t>
+        <w:t xml:space="preserve"> — The proof that no theory in which separated things carry their own pre-existing properties and cannot influence one another faster than light can reproduce the correlations quantum mechanics predicts. Experiment sides with quantum mechanics.  (Chapter 13)</w:t>
       </w:r>
     </w:p>
     <w:p>
@@ -31763,7 +31732,7 @@
         </w:r>
       </w:hyperlink>
       <w:r>
-        <w:t xml:space="preserve"> YouTube, 13 Sept. 2017, youtube.com/watch?v=zcqZHYo7ONs.</w:t>
+        <w:t xml:space="preserve"> YouTube, 13 Sept. 2017.</w:t>
       </w:r>
     </w:p>
     <w:p>
@@ -31800,7 +31769,7 @@
         <w:t>Black Hole</w:t>
       </w:r>
       <w:r>
-        <w:t xml:space="preserve">  —  A region whose gravity is strong enough that light cannot escape past its event horizon, once formed. Despite the name, not perfectly black: it emits Hawking radiation and slowly evaporates.  (Chapter 6)</w:t>
+        <w:t xml:space="preserve"> — A region whose gravity is strong enough that light cannot escape past its event horizon, once formed. Despite the name, not perfectly black: it emits Hawking radiation and slowly evaporates.  (Chapter 6)</w:t>
       </w:r>
     </w:p>
     <w:p>
@@ -31879,7 +31848,7 @@
         </w:r>
       </w:hyperlink>
       <w:r>
-        <w:t xml:space="preserve"> YouTube, 5 Sept. 2018, youtube.com/watch?v=Ab8JIzckx_M.</w:t>
+        <w:t xml:space="preserve"> YouTube, 5 Sept. 2018.</w:t>
       </w:r>
     </w:p>
     <w:p>
@@ -31915,7 +31884,7 @@
         <w:t>Born rule</w:t>
       </w:r>
       <w:r>
-        <w:t xml:space="preserve">  —  The working rule that the squared size of an amplitude is the probability of that outcome. It is how a superposition becomes a set of odds rather than a mood.  (Chapter 1)</w:t>
+        <w:t xml:space="preserve"> — The working rule that the squared size of an amplitude is the probability of that outcome. It is how a superposition becomes a set of odds rather than a mood.  (Chapter 1)</w:t>
       </w:r>
     </w:p>
     <w:p>
@@ -31951,7 +31920,7 @@
           <w:b/>
           <w:bCs/>
         </w:rPr>
-        <w:t>Bra–Ket Notation  —  The standard shorthand for quantum states, written |like this⟩. Lolly writes in it when frightened, which turns out to be often.  (Chapter 1)</w:t>
+        <w:t>Bra–Ket Notation — The standard shorthand for quantum states, written |like this⟩. Lolly writes in it when frightened, which turns out to be often.  (Chapter 1)</w:t>
       </w:r>
     </w:p>
     <w:p>
@@ -31979,7 +31948,7 @@
         </w:r>
       </w:hyperlink>
       <w:r>
-        <w:t xml:space="preserve"> YouTube, 10 Jan. 2023, youtube.com/watch?v=lRR-qgjaKlg.</w:t>
+        <w:t xml:space="preserve"> YouTube, 10 Jan. 2023.</w:t>
       </w:r>
     </w:p>
     <w:p>
@@ -32031,7 +32000,7 @@
         <w:t>nequality</w:t>
       </w:r>
       <w:r>
-        <w:t xml:space="preserve">  —  A testable four-setting form of Bell’s theorem. Local hidden-variable theories cannot push the combined correlation S above 2; quantum mechanics reaches 2√2 ≈ 2.83.  (Chapter 13)</w:t>
+        <w:t xml:space="preserve"> — A testable four-setting form of Bell’s theorem. Local hidden-variable theories cannot push the combined correlation S above 2; quantum mechanics reaches 2√2 ≈ 2.83.  (Chapter 13)</w:t>
       </w:r>
     </w:p>
     <w:p>
@@ -32059,7 +32028,7 @@
         </w:r>
       </w:hyperlink>
       <w:r>
-        <w:t xml:space="preserve"> YouTube, 7 Mar. 2022, youtube.com/watch?v=v7jctqKsUMA.</w:t>
+        <w:t xml:space="preserve"> YouTube, 7 Mar. 2022.</w:t>
       </w:r>
     </w:p>
     <w:p>
@@ -32093,7 +32062,7 @@
           <w:b/>
           <w:bCs/>
         </w:rPr>
-        <w:t>Collapse  —  Textbook shorthand for the abrupt update of a state to one definite outcome when a measurement records a result. Whether it is a real physical event is the measurement problem. See also State Reduction, the idealised version of the same update.  (Chapter 2)</w:t>
+        <w:t>Collapse — Textbook shorthand for the abrupt update of a state to one definite outcome when a measurement records a result. Whether it is a real physical event is the measurement problem. See also State Reduction, the idealised version of the same update.  (Chapter 2)</w:t>
       </w:r>
     </w:p>
     <w:p>
@@ -32133,7 +32102,7 @@
         <w:rPr>
           <w:bCs/>
         </w:rPr>
-        <w:t xml:space="preserve">  —  The historically dominant account, associated with Bohr and Heisenberg: quantum mechanics gives the probabilities for what a measurement will show, and treats questions about what is ‘really’ happening in between as outside what physics can answer. Often paired, in practice, with the collapse postulate as a working rule rather than a claim about physical mechanism.  (Chapter 11)</w:t>
+        <w:t xml:space="preserve"> — The historically dominant account, associated with Bohr and Heisenberg: quantum mechanics gives the probabilities for what a measurement will show, and treats questions about what is ‘really’ happening in between as outside what physics can answer. Often paired, in practice, with the collapse postulate as a working rule rather than a claim about physical mechanism.  (Chapter 11)</w:t>
       </w:r>
     </w:p>
     <w:p>
@@ -32161,7 +32130,7 @@
         </w:r>
       </w:hyperlink>
       <w:r>
-        <w:t xml:space="preserve"> YouTube, 27 July 2016, youtube.com/watch?v=p-MNSLsjjdo.</w:t>
+        <w:t xml:space="preserve"> YouTube, 27 July 2016.</w:t>
       </w:r>
     </w:p>
     <w:p>
@@ -32212,7 +32181,7 @@
         <w:t>avelength</w:t>
       </w:r>
       <w:r>
-        <w:t xml:space="preserve">  —  The wavelength associated with any moving object, shorter for greater momentum: λ = h/p. Far too small to notice for anything larger than a molecule.  (Chapter 12)</w:t>
+        <w:t xml:space="preserve"> — The wavelength associated with any moving object, shorter for greater momentum: λ = h/p. Far too small to notice for anything larger than a molecule.  (Chapter 12)</w:t>
       </w:r>
     </w:p>
     <w:p>
@@ -32240,7 +32209,7 @@
         </w:r>
       </w:hyperlink>
       <w:r>
-        <w:t xml:space="preserve"> YouTube, 8 Apr. 2020, youtube.com/watch?v=xspKG4zU2W4.</w:t>
+        <w:t xml:space="preserve"> YouTube, 8 Apr. 2020.</w:t>
       </w:r>
     </w:p>
     <w:p>
@@ -32277,7 +32246,7 @@
         <w:t>Decoherence</w:t>
       </w:r>
       <w:r>
-        <w:t xml:space="preserve">  —  The leakage of a system’s quantum relationships into its uncontrolled surroundings, which makes interference between alternatives practically unrecoverable and is why large objects look definite. Not a solution to the measurement problem.  (Chapter 10)</w:t>
+        <w:t xml:space="preserve"> — The leakage of a system’s quantum relationships into its uncontrolled surroundings, which makes interference between alternatives practically unrecoverable and is why large objects look definite. Not a solution to the measurement problem.  (Chapter 10)</w:t>
       </w:r>
     </w:p>
     <w:p>
@@ -32305,7 +32274,7 @@
         </w:r>
       </w:hyperlink>
       <w:r>
-        <w:t xml:space="preserve"> YouTube, 24 Feb. 2020, youtube.com/watch?v=GlOwJWJWPUs.</w:t>
+        <w:t xml:space="preserve"> YouTube, 24 Feb. 2020.</w:t>
       </w:r>
     </w:p>
     <w:p>
@@ -32342,7 +32311,7 @@
         <w:t>Determinism</w:t>
       </w:r>
       <w:r>
-        <w:t xml:space="preserve">  —  The property of a theory in which the present state fixes the future exactly. Quantum evolution is deterministic between measurements; pilot-wave theory is deterministic throughout.  (Chapter 5)</w:t>
+        <w:t xml:space="preserve"> — The property of a theory in which the present state fixes the future exactly. Quantum evolution is deterministic between measurements; pilot-wave theory is deterministic throughout.  (Chapter 5)</w:t>
       </w:r>
     </w:p>
     <w:p>
@@ -32370,7 +32339,7 @@
         </w:r>
       </w:hyperlink>
       <w:r>
-        <w:t xml:space="preserve"> YouTube, 20 Oct. 2020, youtube.com/watch?v=1JCRDaa3ehk.</w:t>
+        <w:t xml:space="preserve"> YouTube, 20 Oct. 2020.</w:t>
       </w:r>
     </w:p>
     <w:p>
@@ -32407,7 +32376,7 @@
         <w:t>Duality</w:t>
       </w:r>
       <w:r>
-        <w:t xml:space="preserve">  —  A relation showing that two apparently different physical descriptions are one theory seen from different sides — the reason the five string theories turned out to be one.  (Chapter 14)</w:t>
+        <w:t xml:space="preserve"> — A relation showing that two apparently different physical descriptions are one theory seen from different sides — the reason the five string theories turned out to be one.  (Chapter 14)</w:t>
       </w:r>
     </w:p>
     <w:p>
@@ -32436,7 +32405,7 @@
         </w:r>
       </w:hyperlink>
       <w:r>
-        <w:t xml:space="preserve"> YouTube, 6 Dec. 2023, youtube.com/watch?v=plU31-qtZ78.</w:t>
+        <w:t xml:space="preserve"> YouTube, 6 Dec. 2023.</w:t>
       </w:r>
     </w:p>
     <w:p>
@@ -32473,7 +32442,7 @@
         <w:t>Einselection</w:t>
       </w:r>
       <w:r>
-        <w:t xml:space="preserve">  —  Environment-induced superselection: the way constant environmental interaction singles out a small set of robust, stable pointer states from all the states a system could in principle occupy.  (Chapter 10)</w:t>
+        <w:t xml:space="preserve"> — Environment-induced superselection: the way constant environmental interaction singles out a small set of robust, stable pointer states from all the states a system could in principle occupy.  (Chapter 10)</w:t>
       </w:r>
     </w:p>
     <w:p>
@@ -32510,7 +32479,7 @@
         <w:t>Entanglement</w:t>
       </w:r>
       <w:r>
-        <w:t xml:space="preserve">  —  A single quantum description shared by two or more objects, so that neither has a definite individual value for the relevant property — only a shared, correlated one. It sends no usable signal faster than light.  (Chapter 7)</w:t>
+        <w:t xml:space="preserve"> — A single quantum description shared by two or more objects, so that neither has a definite individual value for the relevant property — only a shared, correlated one. It sends no usable signal faster than light.  (Chapter 7)</w:t>
       </w:r>
     </w:p>
     <w:p>
@@ -32538,7 +32507,7 @@
         </w:r>
       </w:hyperlink>
       <w:r>
-        <w:t xml:space="preserve"> YouTube, 12 Feb. 2020, youtube.com/watch?v=JFozGfxmi8A.</w:t>
+        <w:t xml:space="preserve"> YouTube, 12 Feb. 2020.</w:t>
       </w:r>
     </w:p>
     <w:p>
@@ -32575,7 +32544,7 @@
         <w:t>Entropy</w:t>
       </w:r>
       <w:r>
-        <w:t xml:space="preserve">  —  A measure of how many microscopic arrangements are consistent with a system’s observable, large-scale state; more such arrangements means higher entropy. The quantity the second law of thermodynamics says cannot, overall, decrease.  (Chapter 17)</w:t>
+        <w:t xml:space="preserve"> — A measure of how many microscopic arrangements are consistent with a system’s observable, large-scale state; more such arrangements means higher entropy. The quantity the second law of thermodynamics says cannot, overall, decrease.  (Chapter 17)</w:t>
       </w:r>
     </w:p>
     <w:p>
@@ -32603,7 +32572,7 @@
         </w:r>
       </w:hyperlink>
       <w:r>
-        <w:t xml:space="preserve"> YouTube, 1 July 2023, youtube.com/watch?v=DxL2HoqLbyA.</w:t>
+        <w:t xml:space="preserve"> YouTube, 1 July 2023.</w:t>
       </w:r>
     </w:p>
     <w:p>
@@ -32654,7 +32623,7 @@
         <w:t>orizon</w:t>
       </w:r>
       <w:r>
-        <w:t xml:space="preserve">  —  The surface of a black hole: the boundary past which nothing, light included, can return to a distant observer. It is a boundary for distant observers, not a steel lid: nothing piles up against it like post at a closed office.  (Chapter 6)</w:t>
+        <w:t xml:space="preserve"> — The surface of a black hole: the boundary past which nothing, light included, can return to a distant observer. It is a boundary for distant observers, not a steel lid: nothing piles up against it like post at a closed office.  (Chapter 6)</w:t>
       </w:r>
     </w:p>
     <w:p>
@@ -32682,7 +32651,7 @@
         </w:r>
       </w:hyperlink>
       <w:r>
-        <w:t xml:space="preserve"> YouTube, 8 Dec. 2016, youtube.com/watch?v=mht-1c4wc0Q.</w:t>
+        <w:t xml:space="preserve"> YouTube, 8 Dec. 2016.</w:t>
       </w:r>
     </w:p>
     <w:p>
@@ -32716,7 +32685,7 @@
           <w:b/>
           <w:bCs/>
         </w:rPr>
-        <w:t>Fine-Structure Constant  —  The dimensionless number (α ≈ 1/137.036) that fixes how strongly an electron and a photon interact. Measured to about ten significant figures; never derived from anything more basic.  (Backlog)</w:t>
+        <w:t>Fine-Structure Constant — The dimensionless number (α ≈ 1/137.036) that fixes how strongly an electron and a photon interact. Measured to about ten significant figures; never derived from anything more basic.  (Backlog)</w:t>
       </w:r>
     </w:p>
     <w:p>
@@ -32744,7 +32713,7 @@
         </w:r>
       </w:hyperlink>
       <w:r>
-        <w:t xml:space="preserve"> YouTube, 28 Sept. 2022, youtube.com/watch?v=RCSSgxV9qNw.</w:t>
+        <w:t xml:space="preserve"> YouTube, 28 Sept. 2022.</w:t>
       </w:r>
     </w:p>
     <w:p>
@@ -32795,7 +32764,7 @@
         <w:t>adiation</w:t>
       </w:r>
       <w:r>
-        <w:t xml:space="preserve">  —  The faint thermal radiation a black hole emits by quantum processes, causing it to lose mass. Smaller black holes are hotter and evaporate faster.  (Chapter 6)</w:t>
+        <w:t xml:space="preserve"> — The faint thermal radiation a black hole emits by quantum processes, causing it to lose mass. Smaller black holes are hotter and evaporate faster.  (Chapter 6)</w:t>
       </w:r>
     </w:p>
     <w:p>
@@ -32823,7 +32792,7 @@
         </w:r>
       </w:hyperlink>
       <w:r>
-        <w:t xml:space="preserve"> YouTube, 15 Mar. 2018, youtube.com/watch?v=qPKj0YnKANw.</w:t>
+        <w:t xml:space="preserve"> YouTube, 15 Mar. 2018.</w:t>
       </w:r>
     </w:p>
     <w:p>
@@ -32875,7 +32844,7 @@
         <w:t>ariables</w:t>
       </w:r>
       <w:r>
-        <w:t xml:space="preserve">  —  Proposed extra properties a system carries in advance that would fix measurement outcomes. Bell’s theorem rules out the local kind; pilot-wave theory is a surviving nonlocal kind.  (Chapter 13)</w:t>
+        <w:t xml:space="preserve"> — Proposed extra properties a system carries in advance that would fix measurement outcomes. Bell’s theorem rules out the local kind; pilot-wave theory is a surviving nonlocal kind.  (Chapter 13)</w:t>
       </w:r>
     </w:p>
     <w:p>
@@ -32903,7 +32872,7 @@
         </w:r>
       </w:hyperlink>
       <w:r>
-        <w:t xml:space="preserve"> YouTube, 12 Oct. 2022, youtube.com/watch?v=t35Q7C-DhaU.</w:t>
+        <w:t xml:space="preserve"> YouTube, 12 Oct. 2022.</w:t>
       </w:r>
     </w:p>
     <w:p>
@@ -32939,7 +32908,7 @@
         <w:t>Hilbert space</w:t>
       </w:r>
       <w:r>
-        <w:t xml:space="preserve">  —  The mathematical room in which quantum states live as vectors. Superposition is addition in that room. It is not a building in Coldharrow, though several clerks have asked.  (Chapter 1)</w:t>
+        <w:t xml:space="preserve"> — The mathematical room in which quantum states live as vectors. Superposition is addition in that room. It is not a building in Coldharrow, though several clerks have asked.  (Chapter 1)</w:t>
       </w:r>
     </w:p>
     <w:p>
@@ -32971,7 +32940,7 @@
           <w:b/>
           <w:bCs/>
         </w:rPr>
-        <w:t xml:space="preserve">Holographic Duality (sometimes labelled AdS/CFT)  —  A fully worked example of holography: gravity in a curved box of space is exactly equivalent to an ordinary quantum theory, with no gravity, living only on that box’s boundary. Same physics, two descriptions; the boundary carries the whole story. See also Holographic Principle, the general claim this entry makes good on.  (Chapter 14)</w:t>
+        <w:t xml:space="preserve">Holographic Duality (sometimes labelled AdS/CFT) — A fully worked example of holography: gravity in a curved box of space is exactly equivalent to an ordinary quantum theory, with no gravity, living only on that box’s boundary. Same physics, two descriptions; the boundary carries the whole story. See also Holographic Principle, the general claim this entry makes good on.  (Chapter 14)</w:t>
       </w:r>
       <w:r>
         <w:rPr>
@@ -33016,7 +32985,7 @@
         </w:r>
       </w:hyperlink>
       <w:r>
-        <w:t xml:space="preserve"> YouTube, 21 Mar. 2024, youtube.com/watch?v=DoCYY9sa2kU.</w:t>
+        <w:t xml:space="preserve"> YouTube, 21 Mar. 2024.</w:t>
       </w:r>
     </w:p>
     <w:p>
@@ -33050,7 +33019,7 @@
           <w:b/>
           <w:bCs/>
         </w:rPr>
-        <w:t xml:space="preserve">Holographic Principle  —  The proposal that everything happening inside a region of space, gravity included, can be fully described by information on its lower-dimensional boundary. See also Holographic Duality, the one fully worked example of it.  (Chapter 14)</w:t>
+        <w:t xml:space="preserve">Holographic Principle — The proposal that everything happening inside a region of space, gravity included, can be fully described by information on its lower-dimensional boundary. See also Holographic Duality, the one fully worked example of it.  (Chapter 14)</w:t>
       </w:r>
       <w:r>
         <w:rPr>
@@ -33095,7 +33064,7 @@
         </w:r>
       </w:hyperlink>
       <w:r>
-        <w:t xml:space="preserve"> YouTube, 10 Apr. 2019, youtube.com/watch?v=klpDHn8viX8.</w:t>
+        <w:t xml:space="preserve"> YouTube, 10 Apr. 2019.</w:t>
       </w:r>
     </w:p>
     <w:p>
@@ -33146,7 +33115,7 @@
         <w:t>roblem (black-hole)</w:t>
       </w:r>
       <w:r>
-        <w:t xml:space="preserve">  —  The unresolved question of what becomes of the detailed quantum information in everything a black hole swallows, given that its radiation looks merely thermal. Most physicists expect the information survives.  (Chapter 6)</w:t>
+        <w:t xml:space="preserve"> — The unresolved question of what becomes of the detailed quantum information in everything a black hole swallows, given that its radiation looks merely thermal. Most physicists expect the information survives.  (Chapter 6)</w:t>
       </w:r>
     </w:p>
     <w:p>
@@ -33174,7 +33143,7 @@
         </w:r>
       </w:hyperlink>
       <w:r>
-        <w:t xml:space="preserve"> YouTube, 15 June 2022, youtube.com/watch?v=epSev7ovVew.</w:t>
+        <w:t xml:space="preserve"> YouTube, 15 June 2022.</w:t>
       </w:r>
     </w:p>
     <w:p>
@@ -33211,7 +33180,7 @@
         <w:t>Interference</w:t>
       </w:r>
       <w:r>
-        <w:t xml:space="preserve">  —  The reinforcing or cancelling of quantum alternatives that have not been recorded, and the observable sign that a superposition is more than ordinary ignorance.  (Chapter 1)</w:t>
+        <w:t xml:space="preserve"> — The reinforcing or cancelling of quantum alternatives that have not been recorded, and the observable sign that a superposition is more than ordinary ignorance.  (Chapter 1)</w:t>
       </w:r>
     </w:p>
     <w:p>
@@ -33245,7 +33214,7 @@
           <w:b/>
           <w:bCs/>
         </w:rPr>
-        <w:t xml:space="preserve">Landauer’s Principle  —  The result that erasing one bit of information has a minimum unavoidable energy cost, released as heat. The genuine, narrow link between information and thermodynamics. See Lesson 16’s aside on Maxwell’s demon, ancestor of every clerk who thinks information is free.  (Chapter 17)</w:t>
+        <w:t xml:space="preserve">Landauer’s Principle — The result that erasing one bit of information has a minimum unavoidable energy cost, released as heat. The genuine, narrow link between information and thermodynamics. See Lesson 16’s aside on Maxwell’s demon, ancestor of every clerk who thinks information is free.  (Chapter 17)</w:t>
       </w:r>
       <w:r>
         <w:rPr>
@@ -33290,7 +33259,7 @@
         </w:r>
       </w:hyperlink>
       <w:r>
-        <w:t xml:space="preserve"> YouTube, 29 July 2022, youtube.com/watch?v=XY-mbr-aAZE.</w:t>
+        <w:t xml:space="preserve"> YouTube, 29 July 2022.</w:t>
       </w:r>
     </w:p>
     <w:p>
@@ -33328,7 +33297,7 @@
         <w:t>Locality</w:t>
       </w:r>
       <w:r>
-        <w:t xml:space="preserve">  —  The assumption that what is true here cannot depend on a distant, freely chosen measurement except through influences no faster than light. Bell’s theorem shows nature does not respect it in the way local hidden variables would require.  (Chapter 13)</w:t>
+        <w:t xml:space="preserve"> — The assumption that what is true here cannot depend on a distant, freely chosen measurement except through influences no faster than light. Bell’s theorem shows nature does not respect it in the way local hidden variables would require.  (Chapter 13)</w:t>
       </w:r>
     </w:p>
     <w:p>
@@ -33356,7 +33325,7 @@
         </w:r>
       </w:hyperlink>
       <w:r>
-        <w:t xml:space="preserve"> YouTube, 25 Dec. 2025, youtube.com/watch?v=NIk_0AW5hFU.</w:t>
+        <w:t xml:space="preserve"> YouTube, 18 Dec. 2025.</w:t>
       </w:r>
     </w:p>
     <w:p>
@@ -33393,7 +33362,7 @@
         <w:t>M-theory</w:t>
       </w:r>
       <w:r>
-        <w:t xml:space="preserve">  —  The still-incomplete eleven-dimensional framework in which the five string theories are one structure seen five ways, and the fundamental objects include membranes as well as strings.  (Chapter 14)</w:t>
+        <w:t xml:space="preserve"> — The still-incomplete eleven-dimensional framework in which the five string theories are one structure seen five ways, and the fundamental objects include membranes as well as strings.  (Chapter 14)</w:t>
       </w:r>
     </w:p>
     <w:p>
@@ -33458,7 +33427,7 @@
         <w:t>nterpretation</w:t>
       </w:r>
       <w:r>
-        <w:t xml:space="preserve">  —  The view that the smooth quantum law never breaks down and every measurement-like interaction branches the universe, all outcomes occurring in branches that no longer interact. No collapse; unlimited branches.  (Chapter 11)</w:t>
+        <w:t xml:space="preserve"> — The view that the smooth quantum law never breaks down and every measurement-like interaction branches the universe, all outcomes occurring in branches that no longer interact. No collapse; unlimited branches.  (Chapter 11)</w:t>
       </w:r>
     </w:p>
     <w:p>
@@ -33486,7 +33455,7 @@
         </w:r>
       </w:hyperlink>
       <w:r>
-        <w:t xml:space="preserve"> YouTube, 13 Jul. 2021, youtube.com/watch?v=z-syaCoqkZA.</w:t>
+        <w:t xml:space="preserve"> YouTube, 13 July 2021.</w:t>
       </w:r>
     </w:p>
     <w:p>
@@ -33520,7 +33489,7 @@
           <w:b/>
           <w:bCs/>
         </w:rPr>
-        <w:t>Matter Wave  —  The wave aspect of material particles — the reason electrons produce diffraction and interference patterns.  (Chapter 12)</w:t>
+        <w:t>Matter Wave — The wave aspect of material particles — the reason electrons produce diffraction and interference patterns.  (Chapter 12)</w:t>
       </w:r>
     </w:p>
     <w:p>
@@ -33548,7 +33517,7 @@
         </w:r>
       </w:hyperlink>
       <w:r>
-        <w:t xml:space="preserve"> YouTube, 17 May 2011, youtube.com/watch?v=JIGI-eXK0tg.</w:t>
+        <w:t xml:space="preserve"> YouTube, 17 May 2011.</w:t>
       </w:r>
     </w:p>
     <w:p>
@@ -33585,7 +33554,7 @@
         <w:t>Measurement</w:t>
       </w:r>
       <w:r>
-        <w:t xml:space="preserve">  —  In physics, any physical interaction that records or spreads information about an outcome. Not an act of attention: no mind, eye or clipboard required.  (Chapter 1)</w:t>
+        <w:t xml:space="preserve"> — In physics, any physical interaction that records or spreads information about an outcome. Not an act of attention: no mind, eye or clipboard required.  (Chapter 1)</w:t>
       </w:r>
     </w:p>
     <w:p>
@@ -33613,7 +33582,7 @@
         </w:r>
       </w:hyperlink>
       <w:r>
-        <w:t xml:space="preserve"> YouTube, 4 Dec. 2013, youtube.com/watch?v=8DGgvE6hLAU.</w:t>
+        <w:t xml:space="preserve"> YouTube, 5 Dec. 2013.</w:t>
       </w:r>
     </w:p>
     <w:p>
@@ -33650,7 +33619,7 @@
         <w:t>Measurement Basis</w:t>
       </w:r>
       <w:r>
-        <w:t xml:space="preserve">  —  The particular set of alternatives a given apparatus can tell apart. For incompatible quantum properties there is no basis-independent set of true values waiting to be read off.  (Chapter 2)</w:t>
+        <w:t xml:space="preserve"> — The particular set of alternatives a given apparatus can tell apart. For incompatible quantum properties there is no basis-independent set of true values waiting to be read off.  (Chapter 2)</w:t>
       </w:r>
     </w:p>
     <w:p>
@@ -33687,7 +33656,7 @@
         <w:t>Measurement Problem</w:t>
       </w:r>
       <w:r>
-        <w:t xml:space="preserve">  —  The open question of what, if anything, turns the smooth quantum description into the single definite outcome an experiment records.  (Chapter 11)</w:t>
+        <w:t xml:space="preserve"> — The open question of what, if anything, turns the smooth quantum description into the single definite outcome an experiment records.  (Chapter 11)</w:t>
       </w:r>
     </w:p>
     <w:p>
@@ -33716,7 +33685,7 @@
         </w:r>
       </w:hyperlink>
       <w:r>
-        <w:t xml:space="preserve"> YouTube, 22 Oct. 2019, youtube.com/watch?v=Be3HlA_9968.</w:t>
+        <w:t xml:space="preserve"> YouTube, 22 Oct. 2019.</w:t>
       </w:r>
     </w:p>
     <w:p>
@@ -33750,7 +33719,7 @@
           <w:b/>
           <w:bCs/>
         </w:rPr>
-        <w:t xml:space="preserve">Negentropy  —  </w:t>
+        <w:t xml:space="preserve">Negentropy — </w:t>
       </w:r>
       <w:r>
         <w:t>Schrödinger’s phrase for the usable order a living thing takes in to maintain itself while exporting disorder to its surroundings. A scheme within the second law’s accounts, not an exemption from them.  (Chapter 18)</w:t>
@@ -33781,7 +33750,7 @@
         </w:r>
       </w:hyperlink>
       <w:r>
-        <w:t xml:space="preserve"> YouTube, 11 Apr. 2018, youtube.com/watch?v=GcfLZSL7YGw.</w:t>
+        <w:t xml:space="preserve"> YouTube, 11 Apr. 2018.</w:t>
       </w:r>
     </w:p>
     <w:p>
@@ -33832,7 +33801,7 @@
         <w:t>heorem</w:t>
       </w:r>
       <w:r>
-        <w:t xml:space="preserve">  —  The proof that no physical process can make a perfect copy of an unknown arbitrary quantum state. Moving a state, or re-preparing a known one, is still allowed.  (Chapter 8)</w:t>
+        <w:t xml:space="preserve"> — The proof that no physical process can make a perfect copy of an unknown arbitrary quantum state. Moving a state, or re-preparing a known one, is still allowed.  (Chapter 8)</w:t>
       </w:r>
     </w:p>
     <w:p>
@@ -33860,7 +33829,7 @@
         </w:r>
       </w:hyperlink>
       <w:r>
-        <w:t xml:space="preserve"> YouTube, 27 Dec. 2016, youtube.com/watch?v=owPC60Ue0BE.</w:t>
+        <w:t xml:space="preserve"> YouTube, 27 Dec. 2016.</w:t>
       </w:r>
     </w:p>
     <w:p>
@@ -33896,7 +33865,7 @@
         <w:t>No-communication theorem</w:t>
       </w:r>
       <w:r>
-        <w:t xml:space="preserve">  —  The proof that entanglement’s correlations carry no usable signal between distant parties. Each local notebook looks random until the two are compared later, slowly.  (Chapter 7)</w:t>
+        <w:t xml:space="preserve"> — The proof that entanglement’s correlations carry no usable signal between distant parties. Each local notebook looks random until the two are compared later, slowly.  (Chapter 7)</w:t>
       </w:r>
     </w:p>
     <w:p>
@@ -33921,7 +33890,7 @@
         </w:r>
       </w:hyperlink>
       <w:r>
-        <w:t xml:space="preserve"> YouTube, 12 Jan. 2015, youtube.com/watch?v=ZuvK-od647c.</w:t>
+        <w:t xml:space="preserve"> YouTube, 12 Jan. 2015.</w:t>
       </w:r>
     </w:p>
     <w:p>
@@ -33955,7 +33924,7 @@
         <w:t>No-deleting theorem</w:t>
       </w:r>
       <w:r>
-        <w:t xml:space="preserve">  —  The counterpart of no-cloning: from two copies of an unknown quantum state you cannot remove one cleanly, because the missing information has to show up elsewhere. The vault fails in both directions.  (Chapter 8)</w:t>
+        <w:t xml:space="preserve"> — The counterpart of no-cloning: from two copies of an unknown quantum state you cannot remove one cleanly, because the missing information has to show up elsewhere. The vault fails in both directions.  (Chapter 8)</w:t>
       </w:r>
     </w:p>
     <w:p>
@@ -33990,7 +33959,7 @@
         <w:t>Nonlocality</w:t>
       </w:r>
       <w:r>
-        <w:t xml:space="preserve">  —  A dependence of what is true here on a distant configuration, with no signal passing between. Pilot-wave theory is openly nonlocal; Bell’s theorem shows nature is not locally real.  (Chapter 13)</w:t>
+        <w:t xml:space="preserve"> — A dependence of what is true here on a distant configuration, with no signal passing between. Pilot-wave theory is openly nonlocal; Bell’s theorem shows nature is not locally real.  (Chapter 13)</w:t>
       </w:r>
     </w:p>
     <w:p>
@@ -34024,7 +33993,7 @@
           <w:b/>
           <w:bCs/>
         </w:rPr>
-        <w:t>Nuclear Shell Model  —  Why some isotopes are stable and their neighbours are not: protons and neutrons occupy discrete nuclear energy levels, as electrons do in atoms, at far higher energies.</w:t>
+        <w:t>Nuclear Shell Model — Why some isotopes are stable and their neighbours are not: protons and neutrons occupy discrete nuclear energy levels, as electrons do in atoms, at far higher energies.</w:t>
       </w:r>
     </w:p>
     <w:p>
@@ -34052,7 +34021,7 @@
         </w:r>
       </w:hyperlink>
       <w:r>
-        <w:t xml:space="preserve"> YouTube, Sept. 2012, youtube.com/watch?v=8vMwzkOi0v4.</w:t>
+        <w:t xml:space="preserve"> YouTube, 26 Sept. 2012.</w:t>
       </w:r>
     </w:p>
     <w:p>
@@ -34089,7 +34058,7 @@
         <w:t>Page curve</w:t>
       </w:r>
       <w:r>
-        <w:t xml:space="preserve">  —  The expected rise-then-fall of the entropy carried by a black hole’s emitted radiation, if the information is preserved. The early radiation looks thermal, and the later radiation carries correlations with it, which brings the entropy back down.  (Chapter 14)</w:t>
+        <w:t xml:space="preserve"> — The expected rise-then-fall of the entropy carried by a black hole’s emitted radiation, if the information is preserved. The early radiation looks thermal, and the later radiation carries correlations with it, which brings the entropy back down.  (Chapter 14)</w:t>
       </w:r>
     </w:p>
     <w:p>
@@ -34152,7 +34121,7 @@
         <w:t>heory (de Broglie–Bohm)</w:t>
       </w:r>
       <w:r>
-        <w:t xml:space="preserve">  —  An interpretation in which particles always have definite positions and are guided by a real, non-collapsing wave spread over every possible configuration. Deterministic and explicitly nonlocal.  (Chapter 12)</w:t>
+        <w:t xml:space="preserve"> — An interpretation in which particles always have definite positions and are guided by a real, non-collapsing wave spread over every possible configuration. Deterministic and explicitly nonlocal.  (Chapter 12)</w:t>
       </w:r>
     </w:p>
     <w:p>
@@ -34180,7 +34149,7 @@
         </w:r>
       </w:hyperlink>
       <w:r>
-        <w:t xml:space="preserve"> YouTube, 30 Nov. 2016, youtube.com/watch?v=RlXdsyctD50.</w:t>
+        <w:t xml:space="preserve"> YouTube, 30 Nov. 2016.</w:t>
       </w:r>
     </w:p>
     <w:p>
@@ -34231,7 +34200,7 @@
         <w:t>tates</w:t>
       </w:r>
       <w:r>
-        <w:t xml:space="preserve">  —  The robust, stable states — typically well-defined positions — that survive constant environmental monitoring and make up the everyday classical world. They are the states that survive being photocopied by the environment; superpositions of very different positions do not photocopy.  (Chapter 10)</w:t>
+        <w:t xml:space="preserve"> — The robust, stable states — typically well-defined positions — that survive constant environmental monitoring and make up the everyday classical world. They are the states that survive being photocopied by the environment; superpositions of very different positions do not photocopy.  (Chapter 10)</w:t>
       </w:r>
     </w:p>
     <w:p>
@@ -34259,7 +34228,7 @@
         </w:r>
       </w:hyperlink>
       <w:r>
-        <w:t xml:space="preserve"> YouTube, 16 Mar. 2020, youtube.com/watch?v=vSnq5Hs3_wI.</w:t>
+        <w:t xml:space="preserve"> YouTube, 16 Mar. 2020.</w:t>
       </w:r>
     </w:p>
     <w:p>
@@ -34292,7 +34261,7 @@
         <w:rPr>
           <w:b/>
         </w:rPr>
-        <w:t>QBism  —  An interpretation that treats the quantum state as an agent’s own degree of belief about what they will experience next, not as an objective, mind-independent description of the world.  (Chapter 11)</w:t>
+        <w:t>QBism — An interpretation that treats the quantum state as an agent’s own degree of belief about what they will experience next, not as an objective, mind-independent description of the world.  (Chapter 11)</w:t>
       </w:r>
       <w:r>
         <w:t xml:space="preserve"/>
@@ -34333,7 +34302,7 @@
         <w:rPr>
           <w:bCs/>
         </w:rPr>
-        <w:t xml:space="preserve">  —  The idea that especially robust states get copied redundantly into many parts of the environment, so that independent observers checking different fragments of it agree on the same outcome. The physical content behind Lolly’s phrase about agreement spreading at the speed of gossip.  (Chapter 11)</w:t>
+        <w:t xml:space="preserve"> — The idea that especially robust states get copied redundantly into many parts of the environment, so that independent observers checking different fragments of it agree on the same outcome. The physical content behind Lolly’s phrase about agreement spreading at the speed of gossip.  (Chapter 11)</w:t>
       </w:r>
     </w:p>
     <w:p>
@@ -34398,7 +34367,7 @@
         <w:t>orrection</w:t>
       </w:r>
       <w:r>
-        <w:t xml:space="preserve">  —  Protecting information by spreading it across many systems as a pattern, then checking for damage with syndrome measurements that locate errors without reading the protected data. Works below a threshold error rate, not above it.  (Chapter 16)</w:t>
+        <w:t xml:space="preserve"> — Protecting information by spreading it across many systems as a pattern, then checking for damage with syndrome measurements that locate errors without reading the protected data. Works below a threshold error rate, not above it.  (Chapter 16)</w:t>
       </w:r>
     </w:p>
     <w:p>
@@ -34426,7 +34395,7 @@
         </w:r>
       </w:hyperlink>
       <w:r>
-        <w:t xml:space="preserve"> YouTube, 22 Feb. 2023, youtube.com/watch?v=_ugJLuJ1_gM.</w:t>
+        <w:t xml:space="preserve"> YouTube, 22 Feb. 2023.</w:t>
       </w:r>
     </w:p>
     <w:p>
@@ -34459,7 +34428,7 @@
         <w:rPr>
           <w:b/>
         </w:rPr>
-        <w:t>Quantum tunnelling  —  A system’s amplitude leaks through a barrier that classical energy accounting would call closed. Alpha decay, the scanning tunnelling microscope, and the Sun’s fusion all depend on it.  (Chapter 6 / Backlog)</w:t>
+        <w:t>Quantum tunnelling — A system’s amplitude leaks through a barrier that classical energy accounting would call closed. Alpha decay, the scanning tunnelling microscope, and the Sun’s fusion all depend on it.  (Chapter 6 / Backlog)</w:t>
       </w:r>
     </w:p>
     <w:p>
@@ -34485,7 +34454,7 @@
         </w:r>
       </w:hyperlink>
       <w:r>
-        <w:t xml:space="preserve"> YouTube, 2 June 2016, youtube.com/watch?v=-IfmgyXs7z8.</w:t>
+        <w:t xml:space="preserve"> YouTube, 1 June 2016.</w:t>
       </w:r>
     </w:p>
     <w:p>
@@ -34517,7 +34486,7 @@
           <w:b/>
           <w:bCs/>
         </w:rPr>
-        <w:t>Quantum Zeno Effect  —  The real, observed effect by which very frequent measurements of a quantum system can inhibit its normal change. Not a licence for anyone to freeze a thing by watching it.  (Chapter 4)</w:t>
+        <w:t>Quantum Zeno Effect — The real, observed effect by which very frequent measurements of a quantum system can inhibit its normal change. Not a licence for anyone to freeze a thing by watching it.  (Chapter 4)</w:t>
       </w:r>
     </w:p>
     <w:p>
@@ -34545,7 +34514,7 @@
         </w:r>
       </w:hyperlink>
       <w:r>
-        <w:t xml:space="preserve"> YouTube, 23 Mar. 2021, youtube.com/watch?v=SMPid7Sh0EE.</w:t>
+        <w:t xml:space="preserve"> YouTube, 23 Mar. 2021.</w:t>
       </w:r>
     </w:p>
     <w:p>
@@ -34581,7 +34550,7 @@
         <w:t>Relational quantum mechanics</w:t>
       </w:r>
       <w:r>
-        <w:t xml:space="preserve">  —  Rovelli’s account: facts about a system are relative to another system, not absolute. Wigner and his friend need not share one official list.  (Chapter 11)</w:t>
+        <w:t xml:space="preserve"> — Rovelli’s account: facts about a system are relative to another system, not absolute. Wigner and his friend need not share one official list.  (Chapter 11)</w:t>
       </w:r>
     </w:p>
     <w:p>
@@ -34630,7 +34599,7 @@
         <w:t>quation</w:t>
       </w:r>
       <w:r>
-        <w:t xml:space="preserve">  —  The rule governing how an isolated quantum state changes between measurements: smoothly, predictably and reversibly. The least mysterious part of the subject.  (Chapter 5)</w:t>
+        <w:t xml:space="preserve"> — The rule governing how an isolated quantum state changes between measurements: smoothly, predictably and reversibly. The least mysterious part of the subject.  (Chapter 5)</w:t>
       </w:r>
     </w:p>
     <w:p>
@@ -34658,7 +34627,7 @@
         </w:r>
       </w:hyperlink>
       <w:r>
-        <w:t xml:space="preserve"> YouTube, 6 July 2018, youtube.com/watch?v=QeUMFo8sODk.</w:t>
+        <w:t xml:space="preserve"> YouTube, 6 July 2018.</w:t>
       </w:r>
     </w:p>
     <w:p>
@@ -34706,7 +34675,7 @@
           <w:b/>
           <w:bCs/>
         </w:rPr>
-        <w:t xml:space="preserve">at  —  </w:t>
+        <w:t xml:space="preserve">at — </w:t>
       </w:r>
       <w:r>
         <w:t>Schrödinger’s 1935 thought experiment, meant as a reductio ad absurdum of an unexplained measurement process — not a claim that a cat is literally half alive.  (Chapter 19)</w:t>
@@ -34737,7 +34706,7 @@
         </w:r>
       </w:hyperlink>
       <w:r>
-        <w:t xml:space="preserve"> YouTube, 14 Oct. 2014, youtube.com/watch?v=UjaAxUO6-Uw.</w:t>
+        <w:t xml:space="preserve"> YouTube, 14 Oct. 2014.</w:t>
       </w:r>
     </w:p>
     <w:p>
@@ -34774,7 +34743,7 @@
         <w:t>Second Law of Thermodynamics</w:t>
       </w:r>
       <w:r>
-        <w:t xml:space="preserve">  —  Total entropy never decreases, so local order has to be paid for by exporting more disorder elsewhere.  (Chapter 17)</w:t>
+        <w:t xml:space="preserve"> — Total entropy never decreases, so local order has to be paid for by exporting more disorder elsewhere.  (Chapter 17)</w:t>
       </w:r>
     </w:p>
     <w:p>
@@ -34825,7 +34794,7 @@
         <w:t>uantum state)</w:t>
       </w:r>
       <w:r>
-        <w:t xml:space="preserve">  —  The complete account physics can give of a system: what results its possible measurements can produce, and with what probabilities. Not a location, and not a hidden ledger of answers.  (Chapter 1)</w:t>
+        <w:t xml:space="preserve"> — The complete account physics can give of a system: what results its possible measurements can produce, and with what probabilities. Not a location, and not a hidden ledger of answers.  (Chapter 1)</w:t>
       </w:r>
     </w:p>
     <w:p>
@@ -34853,7 +34822,7 @@
         </w:r>
       </w:hyperlink>
       <w:r>
-        <w:t xml:space="preserve"> YouTube, 10 June 2024, youtube.com/watch?v=jk0jWzlvA5w.</w:t>
+        <w:t xml:space="preserve"> YouTube, 10 June 2024.</w:t>
       </w:r>
     </w:p>
     <w:p>
@@ -34887,7 +34856,7 @@
           <w:b/>
           <w:bCs/>
         </w:rPr>
-        <w:t xml:space="preserve">State Reduction  —  The idealised update of a state to the outcome just recorded; an immediate repeat of the same measurement then returns the same result with certainty. See also Collapse, the everyday name for the same jump.  (Chapter 4)</w:t>
+        <w:t xml:space="preserve">State Reduction — The idealised update of a state to the outcome just recorded; an immediate repeat of the same measurement then returns the same result with certainty. See also Collapse, the everyday name for the same jump.  (Chapter 4)</w:t>
       </w:r>
       <w:r>
         <w:rPr>
@@ -34932,7 +34901,7 @@
         </w:r>
       </w:hyperlink>
       <w:r>
-        <w:t xml:space="preserve"> YouTube, 16 Feb. 2022, youtube.com/watch?v=FP6iyVJ70OU.</w:t>
+        <w:t xml:space="preserve"> YouTube, 16 Feb. 2022.</w:t>
       </w:r>
     </w:p>
     <w:p>
@@ -34967,7 +34936,7 @@
           <w:bCs/>
         </w:rPr>
         <w:lastRenderedPageBreak/>
-        <w:t xml:space="preserve">String Theory  —  The proposal that the basic objects of nature are tiny vibrating extended things rather than points, with different vibrations appearing as different particles. Five different, independently consistent versions were developed before physicists realised they were one theory seen five ways — see Duality and M-theory. Mathematically rich, experimentally unconfirmed.  (Chapter 14)</w:t>
+        <w:t xml:space="preserve">String Theory — The proposal that the basic objects of nature are tiny vibrating extended things rather than points, with different vibrations appearing as different particles. Five different, independently consistent versions were developed before physicists realised they were one theory seen five ways — see Duality and M-theory. Mathematically rich, experimentally unconfirmed.  (Chapter 14)</w:t>
       </w:r>
       <w:r>
         <w:rPr>
@@ -35012,7 +34981,7 @@
         </w:r>
       </w:hyperlink>
       <w:r>
-        <w:t xml:space="preserve"> YouTube, 1 Mar. 2018, youtube.com/watch?v=Da-2h2B4faU.</w:t>
+        <w:t xml:space="preserve"> YouTube, 1 Mar. 2018.</w:t>
       </w:r>
     </w:p>
     <w:p>
@@ -35049,7 +35018,7 @@
         <w:t>Superposition</w:t>
       </w:r>
       <w:r>
-        <w:t xml:space="preserve">  —  A quantum state that combines alternatives without secretly holding one definite answer to the question being asked; its alternatives can interfere. Not “two places at once” in the naive sense.  (Chapter 1)</w:t>
+        <w:t xml:space="preserve"> — A quantum state that combines alternatives without secretly holding one definite answer to the question being asked; its alternatives can interfere. Not “two places at once” in the naive sense.  (Chapter 1)</w:t>
       </w:r>
     </w:p>
     <w:p>
@@ -35077,7 +35046,7 @@
         </w:r>
       </w:hyperlink>
       <w:r>
-        <w:t xml:space="preserve"> YouTube, 9 Aug. 2018, youtube.com/watch?v=VwWRX9IdblE.</w:t>
+        <w:t xml:space="preserve"> YouTube, 9 Aug. 2018.</w:t>
       </w:r>
     </w:p>
     <w:p>
@@ -35128,7 +35097,7 @@
         <w:t>easurement</w:t>
       </w:r>
       <w:r>
-        <w:t xml:space="preserve">  —  A measurement, in quantum error correction, that reveals which kind of damage has occurred without reading out, and so without disturbing, the protected logical state itself.  (Chapter 16)</w:t>
+        <w:t xml:space="preserve"> — A measurement, in quantum error correction, that reveals which kind of damage has occurred without reading out, and so without disturbing, the protected logical state itself.  (Chapter 16)</w:t>
       </w:r>
     </w:p>
     <w:p>
@@ -35156,7 +35125,7 @@
         </w:r>
       </w:hyperlink>
       <w:r>
-        <w:t xml:space="preserve"> YouTube, 8 Apr. 2025, youtube.com/watch?v=9TCIOm8gcVQ.</w:t>
+        <w:t xml:space="preserve"> YouTube, 8 Apr. 2025.</w:t>
       </w:r>
     </w:p>
     <w:p>
@@ -35207,7 +35176,7 @@
         <w:t>ound</w:t>
       </w:r>
       <w:r>
-        <w:t xml:space="preserve">  —  The ceiling quantum mechanics puts on its own Bell (CHSH) correlations: S ≤ 2√2 ≈ 2.83 — above the local-realistic limit of 2, but not unlimited.  (Chapter 13)</w:t>
+        <w:t xml:space="preserve"> — The ceiling quantum mechanics puts on its own Bell (CHSH) correlations: S ≤ 2√2 ≈ 2.83 — above the local-realistic limit of 2, but not unlimited.  (Chapter 13)</w:t>
       </w:r>
     </w:p>
     <w:p>
@@ -35235,7 +35204,7 @@
         </w:r>
       </w:hyperlink>
       <w:r>
-        <w:t xml:space="preserve"> YouTube, 24 Oct. 2021, youtube.com/watch?v=IgzMNjVQVnc.</w:t>
+        <w:t xml:space="preserve"> YouTube, 24 Oct. 2021.</w:t>
       </w:r>
     </w:p>
     <w:p>
@@ -35286,7 +35255,7 @@
         <w:t>rinciple</w:t>
       </w:r>
       <w:r>
-        <w:t xml:space="preserve">  —  The intrinsic limit that a quantum system cannot be prepared with arbitrarily sharp values of both position and momentum at once: Δx·Δp ≥ ℏ/2. A fact about states, not about instruments.  (Chapter 9)</w:t>
+        <w:t xml:space="preserve"> — The intrinsic limit that a quantum system cannot be prepared with arbitrarily sharp values of both position and momentum at once: Δx·Δp ≥ ℏ/2. A fact about states, not about instruments.  (Chapter 9)</w:t>
       </w:r>
     </w:p>
     <w:p>
@@ -35314,7 +35283,7 @@
         </w:r>
       </w:hyperlink>
       <w:r>
-        <w:t xml:space="preserve"> YouTube, 2017, youtube.com/watch?v=TQKELOE9eY4.</w:t>
+        <w:t xml:space="preserve"> YouTube, 16 Sept. 2014.</w:t>
       </w:r>
     </w:p>
     <w:p>
@@ -35372,7 +35341,7 @@
         <w:t>volution</w:t>
       </w:r>
       <w:r>
-        <w:t xml:space="preserve">  —  The technical name for the smooth, reversible, probability-preserving change a state undergoes under the Schrödinger equation.  (Chapter 5)</w:t>
+        <w:t xml:space="preserve"> — The technical name for the smooth, reversible, probability-preserving change a state undergoes under the Schrödinger equation.  (Chapter 5)</w:t>
       </w:r>
     </w:p>
     <w:p>
@@ -35400,7 +35369,7 @@
         </w:r>
       </w:hyperlink>
       <w:r>
-        <w:t xml:space="preserve"> YouTube, 23 May 2018, youtube.com/watch?v=HF-9Dy6iB_4.</w:t>
+        <w:t xml:space="preserve"> YouTube, 23 May 2018.</w:t>
       </w:r>
     </w:p>
     <w:p>
@@ -35436,7 +35405,7 @@
         <w:t>Unruh effect</w:t>
       </w:r>
       <w:r>
-        <w:t xml:space="preserve">  —  An accelerating observer can find a warm bath in a vacuum that an inertial observer calls empty. Cousin to Hawking radiation; a different reason to distrust the word “nothing.”  (Chapter 6)</w:t>
+        <w:t xml:space="preserve"> — An accelerating observer can find a warm bath in a vacuum that an inertial observer calls empty. Cousin to Hawking radiation; a different reason to distrust the word “nothing.”  (Chapter 6)</w:t>
       </w:r>
     </w:p>
     <w:p>
@@ -35461,7 +35430,7 @@
         </w:r>
       </w:hyperlink>
       <w:r>
-        <w:t xml:space="preserve"> YouTube, 4 Apr. 2018, youtube.com/watch?v=7cj6oiFDEXc.</w:t>
+        <w:t xml:space="preserve"> YouTube, 4 Apr. 2018.</w:t>
       </w:r>
     </w:p>
     <w:p>
@@ -35511,7 +35480,7 @@
         <w:t>riend</w:t>
       </w:r>
       <w:r>
-        <w:t xml:space="preserve">  —  A thought experiment in which an observer inside a sealed laboratory records a definite result while an observer outside must still describe the whole laboratory as one unresolved quantum system. It sharpens the measurement problem.  (Chapter 11)</w:t>
+        <w:t xml:space="preserve"> — A thought experiment in which an observer inside a sealed laboratory records a definite result while an observer outside must still describe the whole laboratory as one unresolved quantum system. It sharpens the measurement problem.  (Chapter 11)</w:t>
       </w:r>
     </w:p>
     <w:p>
@@ -35539,7 +35508,7 @@
         </w:r>
       </w:hyperlink>
       <w:r>
-        <w:t xml:space="preserve"> YouTube, 19 Feb. 2022, youtube.com/watch?v=Wsjgtp9XZxo.</w:t>
+        <w:t xml:space="preserve"> YouTube, 19 Feb. 2022.</w:t>
       </w:r>
     </w:p>
     <w:p>
@@ -35606,7 +35575,18 @@
         <w:spacing w:line="240" w:lineRule="auto"/>
       </w:pPr>
       <w:r>
-        <w:t>Al-Khalili, Jim. Quantum: A Guide for the Perplexed. Weidenfeld &amp; Nicolson, 2003.</w:t>
+        <w:t xml:space="preserve">Al-Khalili, Jim. </w:t>
+      </w:r>
+      <w:hyperlink r:id="rId128" w:history="1">
+        <w:r>
+          <w:rPr>
+            <w:rStyle w:val="Hyperlink"/>
+          </w:rPr>
+          <w:t xml:space="preserve">Quantum: A Guide for the Perplexed</w:t>
+        </w:r>
+      </w:hyperlink>
+      <w:r>
+        <w:t xml:space="preserve">. Weidenfeld &amp; Nicolson, 2003.</w:t>
       </w:r>
     </w:p>
     <w:p>
@@ -35625,40 +35605,59 @@
         <w:rPr>
           <w:i/>
         </w:rPr>
-        <w:t>Friendly without being false. A spare on-ramp if Gribbin is already on the shelf.</w:t>
-      </w:r>
-    </w:p>
-    <w:p>
-      <w:pPr>
-        <w:spacing w:after="120" w:line="240" w:lineRule="auto"/>
-        <w:jc w:val="center"/>
-        <w:rPr>
-          <w:bCs/>
-          <w:sz w:val="8"/>
-          <w:szCs w:val="8"/>
-        </w:rPr>
-      </w:pPr>
-    </w:p>
-    <w:p>
-      <w:pPr>
-        <w:spacing w:line="240" w:lineRule="auto"/>
-      </w:pPr>
-      <w:hyperlink r:id="rId85" w:history="1">
+        <w:t xml:space="preserve">Friendly without being false. A spare on-ramp if </w:t>
+      </w:r>
+      <w:hyperlink w:anchor="frGribbinSchrodingersCat" w:history="1">
         <w:r>
           <w:rPr>
             <w:rStyle w:val="Hyperlink"/>
+            <w:i/>
           </w:rPr>
-          <w:t>Barbour, Julian</w:t>
+          <w:t xml:space="preserve">Gribbin</w:t>
         </w:r>
       </w:hyperlink>
       <w:r>
         <w:rPr>
-          <w:b/>
-        </w:rPr>
-        <w:t>.</w:t>
-      </w:r>
-      <w:r>
-        <w:t xml:space="preserve"> The End of Time: The Next Revolution in Physics. Oxford University Press, 1999.</w:t>
+          <w:i/>
+        </w:rPr>
+        <w:t xml:space="preserve"> is already on the shelf.</w:t>
+      </w:r>
+    </w:p>
+    <w:p>
+      <w:pPr>
+        <w:spacing w:after="120" w:line="240" w:lineRule="auto"/>
+        <w:jc w:val="center"/>
+        <w:rPr>
+          <w:bCs/>
+          <w:sz w:val="8"/>
+          <w:szCs w:val="8"/>
+        </w:rPr>
+      </w:pPr>
+    </w:p>
+    <w:p>
+      <w:pPr>
+        <w:spacing w:line="240" w:lineRule="auto"/>
+      </w:pPr>
+      <w:r>
+        <w:rPr>
+          <w:b/>
+        </w:rPr>
+        <w:t xml:space="preserve">Barbour, Julian. </w:t>
+      </w:r>
+      <w:hyperlink r:id="rId129" w:history="1">
+        <w:r>
+          <w:rPr>
+            <w:rStyle w:val="Hyperlink"/>
+            <w:b/>
+          </w:rPr>
+          <w:t xml:space="preserve">The End of Time: The Next Revolution in Physics</w:t>
+        </w:r>
+      </w:hyperlink>
+      <w:r>
+        <w:rPr>
+          <w:b/>
+        </w:rPr>
+        <w:t xml:space="preserve">. Oxford University Press, 1999.</w:t>
       </w:r>
     </w:p>
     <w:p>
@@ -35678,37 +35677,24 @@
           <w:i/>
           <w:iCs/>
         </w:rPr>
-        <w:t>Time as a change in the configuration of the world</w:t>
-      </w:r>
+        <w:t xml:space="preserve">Time as a change in the configuration of the world. A challenging read. Watch: </w:t>
+      </w:r>
+      <w:hyperlink r:id="rId85" w:history="1">
+        <w:r>
+          <w:rPr>
+            <w:rStyle w:val="Hyperlink"/>
+            <w:i/>
+            <w:iCs/>
+          </w:rPr>
+          <w:t xml:space="preserve">Barbour on the same idea, at the Institute of Art and Ideas</w:t>
+        </w:r>
+      </w:hyperlink>
       <w:r>
         <w:rPr>
           <w:i/>
           <w:iCs/>
         </w:rPr>
-        <w:t>.</w:t>
-      </w:r>
-      <w:r>
-        <w:rPr>
-          <w:i/>
-          <w:iCs/>
-        </w:rPr>
-        <w:t xml:space="preserve"> </w:t>
-      </w:r>
-      <w:r>
-        <w:rPr>
-          <w:i/>
-          <w:iCs/>
-          <w:lang w:val="en-US" w:eastAsia="en-US"/>
-        </w:rPr>
-        <w:t>A challenging read</w:t>
-      </w:r>
-      <w:r>
-        <w:rPr>
-          <w:i/>
-          <w:iCs/>
-          <w:lang w:val="en-US" w:eastAsia="en-US"/>
-        </w:rPr>
-        <w:t>.</w:t>
+        <w:t xml:space="preserve">.</w:t>
       </w:r>
     </w:p>
     <w:p>
@@ -35716,7 +35702,18 @@
         <w:spacing w:line="240" w:lineRule="auto"/>
       </w:pPr>
       <w:r>
-        <w:t>Becker, Adam. What Is Real? Basic Books, 2018.</w:t>
+        <w:t xml:space="preserve">Becker, Adam. </w:t>
+      </w:r>
+      <w:hyperlink r:id="rId130" w:history="1">
+        <w:r>
+          <w:rPr>
+            <w:rStyle w:val="Hyperlink"/>
+          </w:rPr>
+          <w:t xml:space="preserve">What Is Real?</w:t>
+        </w:r>
+      </w:hyperlink>
+      <w:r>
+        <w:t xml:space="preserve"> Basic Books, 2018.</w:t>
       </w:r>
     </w:p>
     <w:p>
@@ -35743,7 +35740,18 @@
         <w:spacing w:line="240" w:lineRule="auto"/>
       </w:pPr>
       <w:r>
-        <w:t>Bekenstein, Jacob D. “Black Holes and Entropy.” Physical Review D, vol. 7, no. 8, 1973, pp. 2333–2346.</w:t>
+        <w:t xml:space="preserve">Bekenstein, Jacob D. “</w:t>
+      </w:r>
+      <w:hyperlink r:id="rId131" w:history="1">
+        <w:r>
+          <w:rPr>
+            <w:rStyle w:val="Hyperlink"/>
+          </w:rPr>
+          <w:t xml:space="preserve">Black Holes and Entropy</w:t>
+        </w:r>
+      </w:hyperlink>
+      <w:r>
+        <w:t xml:space="preserve">.” Physical Review D, vol. 7, no. 8, 1973, pp. 2333–2346.</w:t>
       </w:r>
     </w:p>
     <w:p>
@@ -35770,7 +35778,18 @@
         <w:spacing w:line="240" w:lineRule="auto"/>
       </w:pPr>
       <w:r>
-        <w:t>Bell, J. S. Speakable and Unspeakable in Quantum Mechanics. 2nd ed., Cambridge University Press, 2004.</w:t>
+        <w:t xml:space="preserve">Bell, J. S. </w:t>
+      </w:r>
+      <w:hyperlink r:id="rId132" w:history="1">
+        <w:r>
+          <w:rPr>
+            <w:rStyle w:val="Hyperlink"/>
+          </w:rPr>
+          <w:t xml:space="preserve">Speakable and Unspeakable in Quantum Mechanics</w:t>
+        </w:r>
+      </w:hyperlink>
+      <w:r>
+        <w:t xml:space="preserve">. 2nd ed., Cambridge University Press, 2004.</w:t>
       </w:r>
     </w:p>
     <w:p>
@@ -35797,7 +35816,29 @@
         <w:spacing w:line="240" w:lineRule="auto"/>
       </w:pPr>
       <w:r>
-        <w:t>Bohm, David. “A Suggested Interpretation of the Quantum Theory in Terms of ‘Hidden’ Variables, I &amp; II.” Physical Review, vol. 85, no. 2, 1952, pp. 166–193.</w:t>
+        <w:t xml:space="preserve">Bohm, David. “A Suggested Interpretation of the Quantum Theory in Terms of ‘Hidden’ Variables, </w:t>
+      </w:r>
+      <w:hyperlink r:id="rId133" w:history="1">
+        <w:r>
+          <w:rPr>
+            <w:rStyle w:val="Hyperlink"/>
+          </w:rPr>
+          <w:t xml:space="preserve">I</w:t>
+        </w:r>
+      </w:hyperlink>
+      <w:r>
+        <w:t xml:space="preserve"> &amp; </w:t>
+      </w:r>
+      <w:hyperlink r:id="rId134" w:history="1">
+        <w:r>
+          <w:rPr>
+            <w:rStyle w:val="Hyperlink"/>
+          </w:rPr>
+          <w:t xml:space="preserve">II</w:t>
+        </w:r>
+      </w:hyperlink>
+      <w:r>
+        <w:t xml:space="preserve">.” Physical Review, vol. 85, no. 2, 1952, pp. 166–193.</w:t>
       </w:r>
     </w:p>
     <w:p>
@@ -35820,94 +35861,83 @@
       </w:r>
     </w:p>
     <w:p>
+      <w:pPr>
+        <w:spacing w:line="240" w:lineRule="auto"/>
+      </w:pPr>
       <w:bookmarkStart w:id="329" w:name="frCarrollSomethingDeeplyHidden"/>
+      <w:r>
+        <w:rPr>
+          <w:b/>
+        </w:rPr>
+        <w:t xml:space="preserve">Carroll, Sean. </w:t>
+      </w:r>
+      <w:hyperlink r:id="rId135" w:history="1">
+        <w:r>
+          <w:rPr>
+            <w:rStyle w:val="Hyperlink"/>
+            <w:b/>
+          </w:rPr>
+          <w:t xml:space="preserve">Something Deeply Hidden: Quantum Worlds and the Emergence of Spacetime</w:t>
+        </w:r>
+      </w:hyperlink>
+      <w:r>
+        <w:rPr>
+          <w:b/>
+        </w:rPr>
+        <w:t xml:space="preserve">. Dutton, 2019.</w:t>
+      </w:r>
       <w:bookmarkEnd w:id="329"/>
-      <w:pPr>
-        <w:spacing w:line="240" w:lineRule="auto"/>
-      </w:pPr>
+    </w:p>
+    <w:p>
+      <w:pPr>
+        <w:spacing w:after="240" w:line="240" w:lineRule="auto"/>
+        <w:rPr>
+          <w:i/>
+          <w:iCs/>
+        </w:rPr>
+      </w:pPr>
+      <w:r>
+        <w:rPr>
+          <w:i/>
+          <w:iCs/>
+        </w:rPr>
+        <w:t xml:space="preserve">The many-worlds refusal to collapse anything at all. Written so the argument can be followed. Watch: </w:t>
+      </w:r>
       <w:hyperlink r:id="rId86" w:history="1">
         <w:r>
           <w:rPr>
             <w:rStyle w:val="Hyperlink"/>
+            <w:i/>
+            <w:iCs/>
           </w:rPr>
-          <w:t>Carroll, Sean</w:t>
+          <w:t xml:space="preserve">Carroll’s book talk at Harvard</w:t>
         </w:r>
       </w:hyperlink>
       <w:r>
         <w:rPr>
-          <w:b/>
-        </w:rPr>
-        <w:t>.</w:t>
-      </w:r>
-      <w:r>
-        <w:t xml:space="preserve"> Something Deeply Hidden: Quantum Worlds and the Emergence of Spacetime. Dutton, 2019.</w:t>
-      </w:r>
-    </w:p>
-    <w:p>
-      <w:pPr>
-        <w:spacing w:after="240" w:line="240" w:lineRule="auto"/>
-        <w:rPr>
           <w:i/>
           <w:iCs/>
         </w:rPr>
-      </w:pPr>
-      <w:r>
-        <w:rPr>
-          <w:i/>
-          <w:iCs/>
-        </w:rPr>
-        <w:t>The many-worlds refusal to collapse anything at all</w:t>
-      </w:r>
-      <w:r>
-        <w:rPr>
-          <w:i/>
-          <w:iCs/>
-        </w:rPr>
-        <w:t>.</w:t>
-      </w:r>
-      <w:r>
-        <w:rPr>
-          <w:i/>
-          <w:iCs/>
-        </w:rPr>
-        <w:t xml:space="preserve"> </w:t>
-      </w:r>
-      <w:r>
-        <w:rPr>
-          <w:i/>
-          <w:iCs/>
-        </w:rPr>
-        <w:t>W</w:t>
-      </w:r>
-      <w:r>
-        <w:rPr>
-          <w:i/>
-          <w:iCs/>
-        </w:rPr>
-        <w:t>ritten so the argument can be followed</w:t>
-      </w:r>
-      <w:r>
-        <w:rPr>
-          <w:i/>
-          <w:iCs/>
-        </w:rPr>
-        <w:t>.</w:t>
+        <w:t xml:space="preserve">.</w:t>
       </w:r>
     </w:p>
     <w:p>
       <w:pPr>
         <w:spacing w:line="240" w:lineRule="auto"/>
       </w:pPr>
-      <w:hyperlink r:id="rId87" w:history="1">
+      <w:r>
+        <w:t xml:space="preserve">Feynman, Richard P. </w:t>
+      </w:r>
+      <w:hyperlink r:id="rId136" w:history="1">
         <w:r>
           <w:rPr>
             <w:rStyle w:val="Hyperlink"/>
           </w:rPr>
-          <w:t>Feynman, Richard P.</w:t>
+          <w:t xml:space="preserve">The Character of Physical Law</w:t>
         </w:r>
       </w:hyperlink>
       <w:r>
-        <w:t xml:space="preserve"> The Character of Physical Law. MIT Press, 1967.</w:t>
+        <w:t xml:space="preserve">. MIT Press, 1967.</w:t>
       </w:r>
     </w:p>
     <w:p>
@@ -35958,16 +35988,19 @@
       <w:pPr>
         <w:spacing w:line="240" w:lineRule="auto"/>
       </w:pPr>
-      <w:hyperlink r:id="rId88" w:history="1">
+      <w:r>
+        <w:t xml:space="preserve">Feynman, Richard P. </w:t>
+      </w:r>
+      <w:hyperlink r:id="rId137" w:history="1">
         <w:r>
           <w:rPr>
             <w:rStyle w:val="Hyperlink"/>
           </w:rPr>
-          <w:t>Feynman, Richard P.</w:t>
+          <w:t xml:space="preserve">QED: The Strange Theory of Light and Matter</w:t>
         </w:r>
       </w:hyperlink>
       <w:r>
-        <w:t xml:space="preserve"> QED: The Strange Theory of Light and Matter. Princeton University Press, 1985.</w:t>
+        <w:t xml:space="preserve">. Princeton University Press, 1985.</w:t>
       </w:r>
     </w:p>
     <w:p>
@@ -35985,155 +36018,247 @@
       <w:pPr>
         <w:spacing w:line="240" w:lineRule="auto"/>
       </w:pPr>
+      <w:r>
+        <w:rPr>
+          <w:b/>
+        </w:rPr>
+        <w:t xml:space="preserve">Gamow, George. </w:t>
+      </w:r>
+      <w:hyperlink r:id="rId138" w:history="1">
+        <w:r>
+          <w:rPr>
+            <w:rStyle w:val="Hyperlink"/>
+            <w:b/>
+          </w:rPr>
+          <w:t xml:space="preserve">Mr Tompkins in Wonderland</w:t>
+        </w:r>
+      </w:hyperlink>
+      <w:r>
+        <w:rPr>
+          <w:b/>
+        </w:rPr>
+        <w:t xml:space="preserve">. Cambridge University Press, 1940.</w:t>
+      </w:r>
+    </w:p>
+    <w:p>
+      <w:pPr>
+        <w:spacing w:after="240" w:line="240" w:lineRule="auto"/>
+        <w:rPr>
+          <w:rFonts w:ascii="Times New Roman" w:hAnsi="Times New Roman"/>
+          <w:i/>
+          <w:iCs/>
+        </w:rPr>
+      </w:pPr>
+      <w:r>
+        <w:rPr>
+          <w:i/>
+          <w:iCs/>
+        </w:rPr>
+        <w:t xml:space="preserve">A physicist shrinks the speed of light and Planck’s constant down to walking pace, so tunnelling through a wall looks as ordinary as it apparently is. The oldest trick in this list, and still the friendliest. Watch: </w:t>
+      </w:r>
       <w:hyperlink r:id="rId89" w:history="1">
         <w:r>
           <w:rPr>
             <w:rStyle w:val="Hyperlink"/>
+            <w:i/>
+            <w:iCs/>
           </w:rPr>
-          <w:t>Gamow, George</w:t>
+          <w:t xml:space="preserve">an old educational film of Mr Tompkins</w:t>
         </w:r>
       </w:hyperlink>
       <w:r>
         <w:rPr>
-          <w:b/>
-        </w:rPr>
-        <w:t>.</w:t>
-      </w:r>
-      <w:r>
-        <w:t xml:space="preserve"> Mr Tompkins in Wonderland. Cambridge University Press, 1940.</w:t>
-      </w:r>
-    </w:p>
-    <w:p>
-      <w:pPr>
-        <w:spacing w:after="240" w:line="240" w:lineRule="auto"/>
-        <w:rPr>
-          <w:rFonts w:ascii="Times New Roman" w:hAnsi="Times New Roman"/>
           <w:i/>
           <w:iCs/>
         </w:rPr>
-      </w:pPr>
-      <w:r>
+        <w:t xml:space="preserve">.</w:t>
+      </w:r>
+    </w:p>
+    <w:p>
+      <w:r>
+        <w:rPr>
+          <w:b/>
+        </w:rPr>
+        <w:t xml:space="preserve">Gell-Mann, Murray. </w:t>
+      </w:r>
+      <w:hyperlink r:id="rId139" w:history="1">
+        <w:r>
+          <w:rPr>
+            <w:rStyle w:val="Hyperlink"/>
+            <w:b/>
+          </w:rPr>
+          <w:t xml:space="preserve">The Quark and the Jaguar: Adventures in the Simple and the Complex</w:t>
+        </w:r>
+      </w:hyperlink>
+      <w:r>
+        <w:rPr>
+          <w:b/>
+        </w:rPr>
+        <w:t xml:space="preserve">. W. H. Freeman, 1994.</w:t>
+      </w:r>
+    </w:p>
+    <w:p>
+      <w:pPr>
+        <w:spacing w:line="240" w:lineRule="auto"/>
         <w:rPr>
           <w:i/>
-          <w:iCs/>
-        </w:rPr>
-        <w:t>A physicist shrinks the speed of light and Planck’s constant down to walking pace, so tunnelling through a wall looks as ordinary as it apparently is. The oldest trick in this list, and still the friendliest.</w:t>
-      </w:r>
-    </w:p>
-    <w:p>
+        </w:rPr>
+      </w:pPr>
+      <w:r>
+        <w:rPr>
+          <w:i/>
+        </w:rPr>
+        <w:t xml:space="preserve">The man who named the quark, writing about complexity, emergence, and why simple rules produce a complicated universe. He mentions Joyce. Watch: </w:t>
+      </w:r>
       <w:hyperlink r:id="rId90" w:history="1">
         <w:r>
           <w:rPr>
             <w:rStyle w:val="Hyperlink"/>
+            <w:i/>
           </w:rPr>
-          <w:t>Gell-Mann, Murray</w:t>
+          <w:t xml:space="preserve">Gell-Mann on simplicity and complexity</w:t>
         </w:r>
       </w:hyperlink>
       <w:r>
         <w:rPr>
-          <w:b/>
-        </w:rPr>
-        <w:t>.</w:t>
-      </w:r>
-      <w:r>
-        <w:t xml:space="preserve"> The Quark and the Jaguar: Adventures in the Simple and the Complex. W. H. Freeman, 1994.</w:t>
-      </w:r>
-    </w:p>
+          <w:i/>
+        </w:rPr>
+        <w:t xml:space="preserve">.</w:t>
+      </w:r>
+    </w:p>
+    <w:p/>
     <w:p>
       <w:pPr>
         <w:spacing w:line="240" w:lineRule="auto"/>
-        <w:rPr>
+      </w:pPr>
+      <w:r>
+        <w:rPr>
+          <w:b/>
+        </w:rPr>
+        <w:t xml:space="preserve">Greene, Brian. </w:t>
+      </w:r>
+      <w:hyperlink r:id="rId140" w:history="1">
+        <w:r>
+          <w:rPr>
+            <w:rStyle w:val="Hyperlink"/>
+            <w:b/>
+          </w:rPr>
+          <w:t xml:space="preserve">The Elegant Universe: Superstrings, Hidden Dimensions, and the Quest for the Ultimate Theory</w:t>
+        </w:r>
+      </w:hyperlink>
+      <w:r>
+        <w:rPr>
+          <w:b/>
+        </w:rPr>
+        <w:t xml:space="preserve">. W. W. Norton, 1999.</w:t>
+      </w:r>
+    </w:p>
+    <w:p>
+      <w:pPr>
+        <w:spacing w:after="240" w:line="240" w:lineRule="auto"/>
+        <w:rPr>
+          <w:rFonts w:ascii="Times New Roman" w:hAnsi="Times New Roman"/>
           <w:i/>
+          <w:iCs/>
         </w:rPr>
       </w:pPr>
       <w:r>
         <w:rPr>
           <w:i/>
-        </w:rPr>
-        <w:t>The man who named the quark, writing about complexity, emergence, and why simple rules produce a complicated universe. He mentions Joyce.</w:t>
-      </w:r>
-    </w:p>
-    <w:p/>
-    <w:p>
-      <w:pPr>
-        <w:spacing w:line="240" w:lineRule="auto"/>
-      </w:pPr>
+          <w:iCs/>
+        </w:rPr>
+        <w:t xml:space="preserve">A nod to strings and extra dimensions in a form you can actually finish. Watch: </w:t>
+      </w:r>
       <w:hyperlink r:id="rId91" w:history="1">
         <w:r>
           <w:rPr>
             <w:rStyle w:val="Hyperlink"/>
+            <w:i/>
+            <w:iCs/>
           </w:rPr>
-          <w:t>Greene, Brian</w:t>
+          <w:t xml:space="preserve">Greene’s TED talk on string theory</w:t>
         </w:r>
       </w:hyperlink>
       <w:r>
         <w:rPr>
-          <w:b/>
-        </w:rPr>
-        <w:t>.</w:t>
-      </w:r>
-      <w:r>
-        <w:t xml:space="preserve"> The Elegant Universe: Superstrings, Hidden Dimensions, and the Quest for the Ultimate Theory. W. W. Norton, 1999.</w:t>
-      </w:r>
-    </w:p>
-    <w:p>
-      <w:pPr>
-        <w:spacing w:after="240" w:line="240" w:lineRule="auto"/>
-        <w:rPr>
-          <w:rFonts w:ascii="Times New Roman" w:hAnsi="Times New Roman"/>
           <w:i/>
           <w:iCs/>
         </w:rPr>
-      </w:pPr>
-      <w:r>
+        <w:t xml:space="preserve">.</w:t>
+      </w:r>
+    </w:p>
+    <w:p>
+      <w:pPr>
+        <w:spacing w:line="240" w:lineRule="auto"/>
+        <w:rPr>
+          <w:rFonts w:ascii="Times New Roman" w:eastAsia="Times New Roman" w:hAnsi="Times New Roman" w:cs="Times New Roman"/>
+          <w:lang w:val="en-US" w:eastAsia="en-US"/>
+        </w:rPr>
+      </w:pPr>
+      <w:bookmarkStart w:id="433" w:name="frGribbinSchrodingersCat"/>
+      <w:r>
+        <w:rPr>
+          <w:b/>
+          <w:bCs/>
+          <w:lang w:val="en-US" w:eastAsia="en-US"/>
+        </w:rPr>
+        <w:t xml:space="preserve">Gribbin, John. </w:t>
+      </w:r>
+      <w:hyperlink r:id="rId141" w:history="1">
+        <w:r>
+          <w:rPr>
+            <w:rStyle w:val="Hyperlink"/>
+            <w:b/>
+            <w:bCs/>
+            <w:lang w:val="en-US" w:eastAsia="en-US"/>
+          </w:rPr>
+          <w:t xml:space="preserve">In Search of Schrödinger’s Cat: Quantum Physics and Reality</w:t>
+        </w:r>
+      </w:hyperlink>
+      <w:r>
+        <w:rPr>
+          <w:b/>
+          <w:bCs/>
+          <w:lang w:val="en-US" w:eastAsia="en-US"/>
+        </w:rPr>
+        <w:t xml:space="preserve">. Bantam Books, 1984.</w:t>
+      </w:r>
+      <w:bookmarkEnd w:id="433"/>
+    </w:p>
+    <w:p>
+      <w:pPr>
+        <w:spacing w:after="240" w:line="240" w:lineRule="auto"/>
         <w:rPr>
           <w:i/>
           <w:iCs/>
         </w:rPr>
-        <w:t>A nod to strings and extra dimensions in a form you can actually finish.</w:t>
-      </w:r>
-    </w:p>
-    <w:p>
-      <w:pPr>
-        <w:spacing w:line="240" w:lineRule="auto"/>
-        <w:rPr>
-          <w:rFonts w:ascii="Times New Roman" w:eastAsia="Times New Roman" w:hAnsi="Times New Roman" w:cs="Times New Roman"/>
+      </w:pPr>
+      <w:r>
+        <w:rPr>
+          <w:i/>
+          <w:iCs/>
           <w:lang w:val="en-US" w:eastAsia="en-US"/>
         </w:rPr>
-      </w:pPr>
+        <w:t xml:space="preserve">The book that made the cat a celebrity outside physics departments — minimal maths, plenty of explanation. It tidies the live-dead cat into one answer. This book does not. Watch: </w:t>
+      </w:r>
       <w:hyperlink r:id="rId92" w:history="1">
         <w:r>
           <w:rPr>
             <w:rStyle w:val="Hyperlink"/>
+            <w:i/>
+            <w:iCs/>
+            <w:lang w:val="en-US" w:eastAsia="en-US"/>
           </w:rPr>
-          <w:t>Gribbin, John</w:t>
+          <w:t xml:space="preserve">Gribbin at the Royal Institution</w:t>
         </w:r>
       </w:hyperlink>
-      <w:r>
-        <w:rPr>
-          <w:b/>
-          <w:bCs/>
-          <w:lang w:val="en-US" w:eastAsia="en-US"/>
-        </w:rPr>
-        <w:t>. In Search of Schrödinger’s Cat: Quantum Physics and Reality. Bantam Books, 1984.</w:t>
-      </w:r>
-    </w:p>
-    <w:p>
-      <w:pPr>
-        <w:spacing w:after="240" w:line="240" w:lineRule="auto"/>
-        <w:rPr>
-          <w:i/>
-          <w:iCs/>
-        </w:rPr>
-      </w:pPr>
       <w:r>
         <w:rPr>
           <w:i/>
           <w:iCs/>
           <w:lang w:val="en-US" w:eastAsia="en-US"/>
         </w:rPr>
-        <w:lastRenderedPageBreak/>
-        <w:t>The book that made the cat a celebrity outside physics departments — minimal maths, plenty of explanation. It tidies the live-dead cat into one answer. This book does not.</w:t>
+        <w:t xml:space="preserve">.</w:t>
       </w:r>
     </w:p>
     <w:p>
@@ -36143,22 +36268,235 @@
           <w:rFonts w:ascii="Times New Roman" w:hAnsi="Times New Roman"/>
         </w:rPr>
       </w:pPr>
+      <w:r>
+        <w:rPr>
+          <w:b/>
+        </w:rPr>
+        <w:t xml:space="preserve">Griffiths, David J., and Darrell F. Schroeter. </w:t>
+      </w:r>
+      <w:hyperlink r:id="rId142" w:history="1">
+        <w:r>
+          <w:rPr>
+            <w:rStyle w:val="Hyperlink"/>
+            <w:b/>
+          </w:rPr>
+          <w:t xml:space="preserve">Introduction to Quantum Mechanics</w:t>
+        </w:r>
+      </w:hyperlink>
+      <w:r>
+        <w:rPr>
+          <w:b/>
+        </w:rPr>
+        <w:t xml:space="preserve">. 3rd ed., Cambridge University Press, 2018.</w:t>
+      </w:r>
+    </w:p>
+    <w:p>
+      <w:pPr>
+        <w:spacing w:line="240" w:lineRule="auto"/>
+        <w:rPr>
+          <w:rFonts w:ascii="Times New Roman" w:eastAsia="Times New Roman" w:hAnsi="Times New Roman" w:cs="Times New Roman"/>
+          <w:i/>
+          <w:iCs/>
+          <w:lang w:val="en-US" w:eastAsia="en-US"/>
+        </w:rPr>
+      </w:pPr>
+      <w:r>
+        <w:rPr>
+          <w:i/>
+          <w:iCs/>
+          <w:lang w:val="en-US" w:eastAsia="en-US"/>
+        </w:rPr>
+        <w:t xml:space="preserve">A clear and widely used undergraduate introduction to quantum mechanics, for a reader who wants the mathematics after the lectures. It is difficult. Watch: </w:t>
+      </w:r>
       <w:hyperlink r:id="rId93" w:history="1">
         <w:r>
           <w:rPr>
             <w:rStyle w:val="Hyperlink"/>
+            <w:i/>
+            <w:iCs/>
+            <w:lang w:val="en-US" w:eastAsia="en-US"/>
           </w:rPr>
-          <w:t>Griffiths, David J.</w:t>
+          <w:t xml:space="preserve">Griffiths lecturing at IIT Bombay</w:t>
         </w:r>
       </w:hyperlink>
       <w:r>
         <w:rPr>
-          <w:b/>
-        </w:rPr>
-        <w:t>, and Darrell F. Schroeter.</w:t>
-      </w:r>
-      <w:r>
-        <w:t xml:space="preserve"> Introduction to Quantum Mechanics. 3rd ed., Cambridge University Press, 2018.</w:t>
+          <w:i/>
+          <w:iCs/>
+          <w:lang w:val="en-US" w:eastAsia="en-US"/>
+        </w:rPr>
+        <w:t xml:space="preserve">.</w:t>
+      </w:r>
+    </w:p>
+    <w:p>
+      <w:pPr>
+        <w:spacing w:line="240" w:lineRule="auto"/>
+        <w:rPr>
+          <w:lang w:val="en-US"/>
+        </w:rPr>
+      </w:pPr>
+    </w:p>
+    <w:p>
+      <w:pPr>
+        <w:spacing w:line="240" w:lineRule="auto"/>
+      </w:pPr>
+      <w:r>
+        <w:t xml:space="preserve">Hawking, Stephen W. </w:t>
+      </w:r>
+      <w:hyperlink r:id="rId143" w:history="1">
+        <w:r>
+          <w:rPr>
+            <w:rStyle w:val="Hyperlink"/>
+          </w:rPr>
+          <w:t xml:space="preserve">A Brief History of Time</w:t>
+        </w:r>
+      </w:hyperlink>
+      <w:r>
+        <w:t xml:space="preserve">. Bantam Books, 1988.</w:t>
+      </w:r>
+    </w:p>
+    <w:p>
+      <w:pPr>
+        <w:spacing w:after="240" w:line="240" w:lineRule="auto"/>
+        <w:rPr>
+          <w:i/>
+          <w:iCs/>
+        </w:rPr>
+      </w:pPr>
+      <w:r>
+        <w:rPr>
+          <w:i/>
+          <w:iCs/>
+        </w:rPr>
+        <w:t xml:space="preserve">Black holes radiate. Entropy follows the area of the horizon, not the volume inside. Watch: </w:t>
+      </w:r>
+      <w:hyperlink r:id="rId94" w:history="1">
+        <w:r>
+          <w:rPr>
+            <w:rStyle w:val="Hyperlink"/>
+            <w:i/>
+            <w:iCs/>
+          </w:rPr>
+          <w:t xml:space="preserve">Hawking’s Reith Lecture on black holes, from BBC Radio 4</w:t>
+        </w:r>
+      </w:hyperlink>
+      <w:r>
+        <w:rPr>
+          <w:i/>
+          <w:iCs/>
+        </w:rPr>
+        <w:t xml:space="preserve">.</w:t>
+      </w:r>
+    </w:p>
+    <w:p>
+      <w:r>
+        <w:rPr>
+          <w:b/>
+        </w:rPr>
+        <w:t xml:space="preserve">Hawking, Stephen, ed. </w:t>
+      </w:r>
+      <w:hyperlink r:id="rId144" w:history="1">
+        <w:r>
+          <w:rPr>
+            <w:rStyle w:val="Hyperlink"/>
+            <w:b/>
+          </w:rPr>
+          <w:t xml:space="preserve">The Dreams That Stuff Is Made Of: The Most Astounding Papers of Quantum Physics—and How They Shook the Scientific World</w:t>
+        </w:r>
+      </w:hyperlink>
+      <w:r>
+        <w:rPr>
+          <w:b/>
+        </w:rPr>
+        <w:t xml:space="preserve">. Running Press, 2011.</w:t>
+      </w:r>
+    </w:p>
+    <w:p>
+      <w:pPr>
+        <w:spacing w:line="240" w:lineRule="auto"/>
+        <w:rPr>
+          <w:i/>
+        </w:rPr>
+      </w:pPr>
+      <w:r>
+        <w:rPr>
+          <w:i/>
+        </w:rPr>
+        <w:t>The original papers themselves, with commentary — including the fine-structure constant, which the backlog states plainly and does not pretend to derive. The epilogue’s reference number is that constant’s famous approximation, not a solution.</w:t>
+      </w:r>
+    </w:p>
+    <w:p/>
+    <w:p>
+      <w:pPr>
+        <w:spacing w:line="240" w:lineRule="auto"/>
+      </w:pPr>
+      <w:r>
+        <w:rPr>
+          <w:b/>
+        </w:rPr>
+        <w:t xml:space="preserve">Heisenberg, Werner. </w:t>
+      </w:r>
+      <w:hyperlink r:id="rId145" w:history="1">
+        <w:r>
+          <w:rPr>
+            <w:rStyle w:val="Hyperlink"/>
+            <w:b/>
+          </w:rPr>
+          <w:t xml:space="preserve">Physics and Philosophy: The Revolution in Modern Science</w:t>
+        </w:r>
+      </w:hyperlink>
+      <w:r>
+        <w:rPr>
+          <w:b/>
+        </w:rPr>
+        <w:t xml:space="preserve">. Harper &amp; Row, 1958.</w:t>
+      </w:r>
+    </w:p>
+    <w:p>
+      <w:pPr>
+        <w:spacing w:after="240" w:line="240" w:lineRule="auto"/>
+        <w:rPr>
+          <w:i/>
+          <w:iCs/>
+        </w:rPr>
+      </w:pPr>
+      <w:r>
+        <w:rPr>
+          <w:i/>
+          <w:iCs/>
+        </w:rPr>
+        <w:t>Uncertainty as a feature of physical states, not merely a consequence of clumsy observation.</w:t>
+      </w:r>
+    </w:p>
+    <w:p>
+      <w:pPr>
+        <w:spacing w:line="240" w:lineRule="auto"/>
+        <w:rPr>
+          <w:rFonts w:ascii="Segoe UI" w:hAnsi="Segoe UI" w:cs="Segoe UI"/>
+          <w:sz w:val="21"/>
+          <w:szCs w:val="21"/>
+        </w:rPr>
+      </w:pPr>
+      <w:r>
+        <w:rPr>
+          <w:b/>
+        </w:rPr>
+        <w:t xml:space="preserve">McFadden, Johnjoe, and Jim Al-Khalili. </w:t>
+      </w:r>
+      <w:hyperlink r:id="rId146" w:history="1">
+        <w:r>
+          <w:rPr>
+            <w:rStyle w:val="Hyperlink"/>
+            <w:b/>
+          </w:rPr>
+          <w:t xml:space="preserve">Life on the Edge: The Coming of Age of Quantum Biology</w:t>
+        </w:r>
+      </w:hyperlink>
+      <w:r>
+        <w:rPr>
+          <w:b/>
+        </w:rPr>
+        <w:t xml:space="preserve">. Crown, 2015.</w:t>
       </w:r>
     </w:p>
     <w:p>
@@ -36177,257 +36515,45 @@
           <w:iCs/>
           <w:lang w:val="en-US" w:eastAsia="en-US"/>
         </w:rPr>
-        <w:t>A clear and widely used undergraduate introduction to quantum mechanics, for a reader who wants the mathematics after the lectures. It is difficult.</w:t>
-      </w:r>
+        <w:t xml:space="preserve">Whether a living cell can use a quantum effect, written for a reader who is not a biologist. Watch: </w:t>
+      </w:r>
+      <w:hyperlink r:id="rId97" w:history="1">
+        <w:r>
+          <w:rPr>
+            <w:rStyle w:val="Hyperlink"/>
+            <w:i/>
+            <w:iCs/>
+            <w:lang w:val="en-US" w:eastAsia="en-US"/>
+          </w:rPr>
+          <w:t xml:space="preserve">Al-Khalili’s talk on quantum biology at Oxford</w:t>
+        </w:r>
+      </w:hyperlink>
       <w:r>
         <w:rPr>
           <w:i/>
           <w:iCs/>
           <w:lang w:val="en-US" w:eastAsia="en-US"/>
         </w:rPr>
-        <w:t xml:space="preserve"/>
-      </w:r>
-      <w:r>
-        <w:rPr>
-          <w:i/>
-          <w:iCs/>
-          <w:lang w:val="en-US" w:eastAsia="en-US"/>
-        </w:rPr>
-        <w:t/>
-      </w:r>
-      <w:r>
-        <w:rPr>
-          <w:i/>
-          <w:iCs/>
-          <w:lang w:val="en-US" w:eastAsia="en-US"/>
-        </w:rPr>
-        <w:t xml:space="preserve"/>
-      </w:r>
-      <w:r>
-        <w:rPr>
-          <w:i/>
-          <w:iCs/>
-          <w:lang w:val="en-US" w:eastAsia="en-US"/>
-        </w:rPr>
-        <w:t/>
-      </w:r>
-      <w:r>
-        <w:rPr>
-          <w:i/>
-          <w:iCs/>
-          <w:lang w:val="en-US" w:eastAsia="en-US"/>
-        </w:rPr>
-        <w:t xml:space="preserve"/>
-      </w:r>
-      <w:r>
-        <w:rPr>
-          <w:i/>
-          <w:iCs/>
-          <w:lang w:val="en-US" w:eastAsia="en-US"/>
-        </w:rPr>
-        <w:t/>
-      </w:r>
-      <w:r>
-        <w:rPr>
-          <w:i/>
-          <w:iCs/>
-          <w:lang w:val="en-US" w:eastAsia="en-US"/>
-        </w:rPr>
-        <w:t xml:space="preserve"/>
+        <w:t xml:space="preserve">.</w:t>
       </w:r>
     </w:p>
     <w:p>
       <w:pPr>
         <w:spacing w:line="240" w:lineRule="auto"/>
-        <w:rPr>
-          <w:lang w:val="en-US"/>
-        </w:rPr>
-      </w:pPr>
-    </w:p>
-    <w:p>
-      <w:pPr>
-        <w:spacing w:line="240" w:lineRule="auto"/>
-      </w:pPr>
-      <w:hyperlink r:id="rId94" w:history="1">
+      </w:pPr>
+      <w:r>
+        <w:t xml:space="preserve">Nielsen, Michael A., and Isaac L. Chuang. </w:t>
+      </w:r>
+      <w:hyperlink r:id="rId147" w:history="1">
         <w:r>
           <w:rPr>
             <w:rStyle w:val="Hyperlink"/>
           </w:rPr>
-          <w:t>Hawking, Stephen W.</w:t>
+          <w:t xml:space="preserve">Quantum Computation and Quantum Information</w:t>
         </w:r>
       </w:hyperlink>
       <w:r>
-        <w:t xml:space="preserve"> A Brief History of Time. Bantam Books, 1988.</w:t>
-      </w:r>
-    </w:p>
-    <w:p>
-      <w:pPr>
-        <w:spacing w:after="240" w:line="240" w:lineRule="auto"/>
-        <w:rPr>
-          <w:i/>
-          <w:iCs/>
-        </w:rPr>
-      </w:pPr>
-      <w:r>
-        <w:rPr>
-          <w:i/>
-          <w:iCs/>
-        </w:rPr>
-        <w:t>Black holes radiate. Entropy follows the area of the horizon, not the volume inside</w:t>
-      </w:r>
-      <w:r>
-        <w:rPr>
-          <w:i/>
-          <w:iCs/>
-        </w:rPr>
-        <w:t/>
-      </w:r>
-      <w:r>
-        <w:rPr>
-          <w:i/>
-          <w:iCs/>
-        </w:rPr>
-        <w:t xml:space="preserve"/>
-      </w:r>
-      <w:r>
-        <w:rPr>
-          <w:i/>
-          <w:iCs/>
-        </w:rPr>
-        <w:t>.</w:t>
-      </w:r>
-    </w:p>
-    <w:p>
-      <w:hyperlink r:id="rId95" w:history="1">
-        <w:r>
-          <w:rPr>
-            <w:rStyle w:val="Hyperlink"/>
-          </w:rPr>
-          <w:t>Hawking, Stephen</w:t>
-        </w:r>
-      </w:hyperlink>
-      <w:r>
-        <w:rPr>
-          <w:b/>
-        </w:rPr>
-        <w:t>, ed.</w:t>
-      </w:r>
-      <w:r>
-        <w:t xml:space="preserve"> The Dreams That Stuff Is Made Of: The Most Astounding Papers of Quantum Physics—and How They Shook the Scientific World. Running Press, 2011.</w:t>
-      </w:r>
-    </w:p>
-    <w:p>
-      <w:pPr>
-        <w:spacing w:line="240" w:lineRule="auto"/>
-        <w:rPr>
-          <w:i/>
-        </w:rPr>
-      </w:pPr>
-      <w:r>
-        <w:rPr>
-          <w:i/>
-        </w:rPr>
-        <w:t>The original papers themselves, with commentary — including the fine-structure constant, which the backlog states plainly and does not pretend to derive. The epilogue’s reference number is that constant’s famous approximation, not a solution.</w:t>
-      </w:r>
-    </w:p>
-    <w:p/>
-    <w:p>
-      <w:pPr>
-        <w:spacing w:line="240" w:lineRule="auto"/>
-      </w:pPr>
-      <w:hyperlink r:id="rId96" w:history="1">
-        <w:r>
-          <w:rPr>
-            <w:rStyle w:val="Hyperlink"/>
-          </w:rPr>
-          <w:t>Heisenberg, Werner</w:t>
-        </w:r>
-      </w:hyperlink>
-      <w:r>
-        <w:rPr>
-          <w:b/>
-        </w:rPr>
-        <w:t>.</w:t>
-      </w:r>
-      <w:r>
-        <w:t xml:space="preserve"> Physics and Philosophy: The Revolution in Modern Science. Harper &amp; Row, 1958.</w:t>
-      </w:r>
-    </w:p>
-    <w:p>
-      <w:pPr>
-        <w:spacing w:after="240" w:line="240" w:lineRule="auto"/>
-        <w:rPr>
-          <w:i/>
-          <w:iCs/>
-        </w:rPr>
-      </w:pPr>
-      <w:r>
-        <w:rPr>
-          <w:i/>
-          <w:iCs/>
-        </w:rPr>
-        <w:t>Uncertainty as a feature of physical states, not merely a consequence of clumsy observation.</w:t>
-      </w:r>
-    </w:p>
-    <w:p>
-      <w:pPr>
-        <w:spacing w:line="240" w:lineRule="auto"/>
-        <w:rPr>
-          <w:rFonts w:ascii="Segoe UI" w:hAnsi="Segoe UI" w:cs="Segoe UI"/>
-          <w:sz w:val="21"/>
-          <w:szCs w:val="21"/>
-        </w:rPr>
-      </w:pPr>
-      <w:hyperlink r:id="rId97" w:history="1">
-        <w:r>
-          <w:rPr>
-            <w:rStyle w:val="Hyperlink"/>
-          </w:rPr>
-          <w:t>McFadden, Johnjoe</w:t>
-        </w:r>
-      </w:hyperlink>
-      <w:r>
-        <w:rPr>
-          <w:b/>
-        </w:rPr>
-        <w:t>, and Jim Al-Khalili.</w:t>
-      </w:r>
-      <w:r>
-        <w:t xml:space="preserve"> Life on the Edge: The Coming of Age of Quantum Biology. Crown, 2015.</w:t>
-      </w:r>
-      <w:r>
-        <w:rPr>
-          <w:sz w:val="21"/>
-          <w:szCs w:val="21"/>
-        </w:rPr>
-        <w:t xml:space="preserve"> </w:t>
-      </w:r>
-    </w:p>
-    <w:p>
-      <w:pPr>
-        <w:spacing w:line="240" w:lineRule="auto"/>
-        <w:rPr>
-          <w:rFonts w:ascii="Times New Roman" w:eastAsia="Times New Roman" w:hAnsi="Times New Roman" w:cs="Times New Roman"/>
-          <w:i/>
-          <w:iCs/>
-          <w:lang w:val="en-US" w:eastAsia="en-US"/>
-        </w:rPr>
-      </w:pPr>
-      <w:r>
-        <w:rPr>
-          <w:i/>
-          <w:iCs/>
-          <w:lang w:val="en-US" w:eastAsia="en-US"/>
-        </w:rPr>
-        <w:t>Whether a living cell can use a quantum effect, written for a reader who is not a biologist.</w:t>
-      </w:r>
-    </w:p>
-    <w:p>
-      <w:pPr>
-        <w:spacing w:line="240" w:lineRule="auto"/>
-      </w:pPr>
-      <w:r>
-        <w:t>Nielsen, Michael A., and Isaac L. Chuang. Quantum Computation and Quantum Information. Cambridge University Press, 2010.</w:t>
+        <w:t xml:space="preserve">. Cambridge University Press, 2010.</w:t>
       </w:r>
     </w:p>
     <w:p>
@@ -36446,7 +36572,37 @@
         <w:rPr>
           <w:i/>
         </w:rPr>
-        <w:t>The standard door into no-cloning, syndromes, and thresholds. Lecture 8 and Lecture 15’s grown-up cousin.</w:t>
+        <w:t xml:space="preserve">The standard door into no-cloning, syndromes, and thresholds. The grown-up cousin of </w:t>
+      </w:r>
+      <w:hyperlink w:anchor="Lecture08NoCloning" w:history="1">
+        <w:r>
+          <w:rPr>
+            <w:rStyle w:val="Hyperlink"/>
+            <w:i/>
+          </w:rPr>
+          <w:t xml:space="preserve">Lesson 8</w:t>
+        </w:r>
+      </w:hyperlink>
+      <w:r>
+        <w:rPr>
+          <w:i/>
+        </w:rPr>
+        <w:t xml:space="preserve"> and </w:t>
+      </w:r>
+      <w:hyperlink w:anchor="Lecture15ErrorCorrection" w:history="1">
+        <w:r>
+          <w:rPr>
+            <w:rStyle w:val="Hyperlink"/>
+            <w:i/>
+          </w:rPr>
+          <w:t xml:space="preserve">Lesson 15</w:t>
+        </w:r>
+      </w:hyperlink>
+      <w:r>
+        <w:rPr>
+          <w:i/>
+        </w:rPr>
+        <w:t xml:space="preserve">.</w:t>
       </w:r>
     </w:p>
     <w:p>
@@ -36454,7 +36610,18 @@
         <w:spacing w:line="240" w:lineRule="auto"/>
       </w:pPr>
       <w:r>
-        <w:t>Penrose, Roger. The Emperor’s New Mind. Oxford University Press, 1989.</w:t>
+        <w:t xml:space="preserve">Penrose, Roger. </w:t>
+      </w:r>
+      <w:hyperlink r:id="rId148" w:history="1">
+        <w:r>
+          <w:rPr>
+            <w:rStyle w:val="Hyperlink"/>
+          </w:rPr>
+          <w:t xml:space="preserve">The Emperor’s New Mind</w:t>
+        </w:r>
+      </w:hyperlink>
+      <w:r>
+        <w:t xml:space="preserve">. Oxford University Press, 1989.</w:t>
       </w:r>
     </w:p>
     <w:p>
@@ -36481,7 +36648,18 @@
         <w:spacing w:line="240" w:lineRule="auto"/>
       </w:pPr>
       <w:r>
-        <w:t>Preskill, John. Lecture notes on Quantum Computation. Caltech, various years. Freely available at preskill.caltech.edu/ph219/.</w:t>
+        <w:t xml:space="preserve">Preskill, John. </w:t>
+      </w:r>
+      <w:hyperlink r:id="rId149" w:history="1">
+        <w:r>
+          <w:rPr>
+            <w:rStyle w:val="Hyperlink"/>
+          </w:rPr>
+          <w:t xml:space="preserve">Lecture notes on Quantum Computation</w:t>
+        </w:r>
+      </w:hyperlink>
+      <w:r>
+        <w:t xml:space="preserve">. Caltech, various years. Freely available online.</w:t>
       </w:r>
     </w:p>
     <w:p>
@@ -36515,85 +36693,129 @@
       </w:pPr>
     </w:p>
     <w:p>
+      <w:pPr>
+        <w:spacing w:line="240" w:lineRule="auto"/>
+      </w:pPr>
       <w:bookmarkStart w:id="330" w:name="frRovelliHelgoland"/>
+      <w:r>
+        <w:rPr>
+          <w:b/>
+        </w:rPr>
+        <w:t xml:space="preserve">Rovelli, Carlo. </w:t>
+      </w:r>
+      <w:hyperlink r:id="rId150" w:history="1">
+        <w:r>
+          <w:rPr>
+            <w:rStyle w:val="Hyperlink"/>
+            <w:b/>
+          </w:rPr>
+          <w:t xml:space="preserve">Helgoland: Making Sense of the Quantum Revolution</w:t>
+        </w:r>
+      </w:hyperlink>
+      <w:r>
+        <w:rPr>
+          <w:b/>
+        </w:rPr>
+        <w:t xml:space="preserve">. Riverhead Books, 2021.</w:t>
+      </w:r>
       <w:bookmarkEnd w:id="330"/>
-      <w:pPr>
-        <w:spacing w:line="240" w:lineRule="auto"/>
-      </w:pPr>
+    </w:p>
+    <w:p>
+      <w:pPr>
+        <w:spacing w:after="240" w:line="240" w:lineRule="auto"/>
+        <w:rPr>
+          <w:rFonts w:ascii="Times New Roman" w:hAnsi="Times New Roman"/>
+          <w:i/>
+          <w:iCs/>
+        </w:rPr>
+      </w:pPr>
+      <w:r>
+        <w:rPr>
+          <w:i/>
+          <w:iCs/>
+        </w:rPr>
+        <w:t xml:space="preserve">Wigner’s friend taken seriously: what counts as a measurement depends on who you ask, and the book makes peace with that instead of panicking about it. Watch: </w:t>
+      </w:r>
       <w:hyperlink r:id="rId98" w:history="1">
         <w:r>
           <w:rPr>
             <w:rStyle w:val="Hyperlink"/>
+            <w:i/>
+            <w:iCs/>
           </w:rPr>
-          <w:t>Rovelli, Carlo</w:t>
+          <w:t xml:space="preserve">Rovelli’s talk at Google</w:t>
         </w:r>
       </w:hyperlink>
       <w:r>
         <w:rPr>
-          <w:b/>
-        </w:rPr>
-        <w:t>.</w:t>
-      </w:r>
-      <w:r>
-        <w:t xml:space="preserve"> Helgoland: Making Sense of the Quantum Revolution. Riverhead Books, 2021.</w:t>
-      </w:r>
-    </w:p>
-    <w:p>
-      <w:pPr>
-        <w:spacing w:after="240" w:line="240" w:lineRule="auto"/>
-        <w:rPr>
-          <w:rFonts w:ascii="Times New Roman" w:hAnsi="Times New Roman"/>
           <w:i/>
           <w:iCs/>
         </w:rPr>
-      </w:pPr>
-      <w:r>
+        <w:t xml:space="preserve">.</w:t>
+      </w:r>
+    </w:p>
+    <w:p>
+      <w:pPr>
+        <w:spacing w:line="240" w:lineRule="auto"/>
+        <w:rPr>
+          <w:rFonts w:ascii="Times New Roman" w:hAnsi="Times New Roman"/>
+        </w:rPr>
+      </w:pPr>
+      <w:bookmarkStart w:id="434" w:name="frSchrodingerWhatIsLife"/>
+      <w:r>
+        <w:rPr>
+          <w:b/>
+        </w:rPr>
+        <w:t xml:space="preserve">Schrödinger, Erwin. </w:t>
+      </w:r>
+      <w:hyperlink r:id="rId151" w:history="1">
+        <w:r>
+          <w:rPr>
+            <w:rStyle w:val="Hyperlink"/>
+            <w:b/>
+          </w:rPr>
+          <w:t xml:space="preserve">What Is Life? The Physical Aspect of the Living Cell</w:t>
+        </w:r>
+      </w:hyperlink>
+      <w:r>
+        <w:rPr>
+          <w:b/>
+        </w:rPr>
+        <w:t xml:space="preserve">. Cambridge University Press, 1944.</w:t>
+      </w:r>
+      <w:bookmarkEnd w:id="434"/>
+    </w:p>
+    <w:p>
+      <w:pPr>
+        <w:spacing w:line="240" w:lineRule="auto"/>
         <w:rPr>
           <w:i/>
           <w:iCs/>
         </w:rPr>
-        <w:t>Wigner’s friend taken seriously: what counts as a measurement depends on who you ask, and the book makes peace with that instead of panicking about it.</w:t>
-      </w:r>
-    </w:p>
-    <w:p>
-      <w:pPr>
-        <w:spacing w:line="240" w:lineRule="auto"/>
-        <w:rPr>
-          <w:rFonts w:ascii="Times New Roman" w:hAnsi="Times New Roman"/>
-        </w:rPr>
-      </w:pPr>
+      </w:pPr>
+      <w:r>
+        <w:rPr>
+          <w:i/>
+          <w:iCs/>
+        </w:rPr>
+        <w:t xml:space="preserve">How a living cell stays so orderly in a world that runs towards disorder. Schrödinger’s answers were hereditary information stored in an “aperiodic crystal” and life’s ability to feed from its environment. Watch: </w:t>
+      </w:r>
       <w:hyperlink r:id="rId99" w:history="1">
         <w:r>
           <w:rPr>
             <w:rStyle w:val="Hyperlink"/>
+            <w:i/>
+            <w:iCs/>
           </w:rPr>
-          <w:t>Schrödinger, Erwin</w:t>
+          <w:t xml:space="preserve">a lecture on the book’s legacy from the Dublin Institute for Advanced Studies</w:t>
         </w:r>
       </w:hyperlink>
       <w:r>
         <w:rPr>
-          <w:b/>
-        </w:rPr>
-        <w:t>.</w:t>
-      </w:r>
-      <w:r>
-        <w:t xml:space="preserve"> What Is Life? The Physical Aspect of the Living Cell. Cambridge University Press, 1944.</w:t>
-      </w:r>
-    </w:p>
-    <w:p>
-      <w:pPr>
-        <w:spacing w:line="240" w:lineRule="auto"/>
-        <w:rPr>
           <w:i/>
           <w:iCs/>
         </w:rPr>
-      </w:pPr>
-      <w:r>
-        <w:rPr>
-          <w:i/>
-          <w:iCs/>
-        </w:rPr>
-        <w:t>How a living cell stays so orderly in a world that runs towards disorder. Schrödinger’s answers were hereditary information stored in an “aperiodic crystal” and life’s ability to feed from its environment.</w:t>
+        <w:t xml:space="preserve">.</w:t>
       </w:r>
     </w:p>
     <w:p>
@@ -36601,7 +36823,18 @@
         <w:spacing w:line="240" w:lineRule="auto"/>
       </w:pPr>
       <w:r>
-        <w:t>Susskind, Leonard. The Black Hole War. Little, Brown, 2008.</w:t>
+        <w:t xml:space="preserve">Susskind, Leonard. </w:t>
+      </w:r>
+      <w:hyperlink r:id="rId152" w:history="1">
+        <w:r>
+          <w:rPr>
+            <w:rStyle w:val="Hyperlink"/>
+          </w:rPr>
+          <w:t xml:space="preserve">The Black Hole War</w:t>
+        </w:r>
+      </w:hyperlink>
+      <w:r>
+        <w:t xml:space="preserve">. Little, Brown, 2008.</w:t>
       </w:r>
     </w:p>
     <w:p>
@@ -36620,7 +36853,22 @@
         <w:rPr>
           <w:i/>
         </w:rPr>
-        <w:t>Holography as an argument people actually had. Pair with Lecture 14 Part 2.</w:t>
+        <w:t xml:space="preserve">Holography as an argument people actually had. Pair with </w:t>
+      </w:r>
+      <w:hyperlink w:anchor="Lecture14bHolography" w:history="1">
+        <w:r>
+          <w:rPr>
+            <w:rStyle w:val="Hyperlink"/>
+            <w:i/>
+          </w:rPr>
+          <w:t xml:space="preserve">Lesson 14b</w:t>
+        </w:r>
+      </w:hyperlink>
+      <w:r>
+        <w:rPr>
+          <w:i/>
+        </w:rPr>
+        <w:t xml:space="preserve">.</w:t>
       </w:r>
     </w:p>
     <w:p>
@@ -36628,7 +36876,18 @@
         <w:spacing w:line="240" w:lineRule="auto"/>
       </w:pPr>
       <w:r>
-        <w:t>Wallace, David. The Emergent Multiverse. Oxford University Press, 2012.</w:t>
+        <w:t xml:space="preserve">Wallace, David. </w:t>
+      </w:r>
+      <w:hyperlink r:id="rId153" w:history="1">
+        <w:r>
+          <w:rPr>
+            <w:rStyle w:val="Hyperlink"/>
+          </w:rPr>
+          <w:t xml:space="preserve">The Emergent Multiverse</w:t>
+        </w:r>
+      </w:hyperlink>
+      <w:r>
+        <w:t xml:space="preserve">. Oxford University Press, 2012.</w:t>
       </w:r>
     </w:p>
     <w:p>
@@ -36671,40 +36930,63 @@
           <w:rFonts w:ascii="Times New Roman" w:hAnsi="Times New Roman"/>
         </w:rPr>
       </w:pPr>
+      <w:r>
+        <w:rPr>
+          <w:b/>
+        </w:rPr>
+        <w:t xml:space="preserve">Wheeler, John Archibald, with Kenneth Ford. </w:t>
+      </w:r>
+      <w:hyperlink r:id="rId154" w:history="1">
+        <w:r>
+          <w:rPr>
+            <w:rStyle w:val="Hyperlink"/>
+            <w:b/>
+          </w:rPr>
+          <w:t xml:space="preserve">Geons, Black Holes, and Quantum Foam: A Life in Physics</w:t>
+        </w:r>
+      </w:hyperlink>
+      <w:r>
+        <w:rPr>
+          <w:b/>
+        </w:rPr>
+        <w:t xml:space="preserve">. W. W. Norton &amp; Company, 1998.</w:t>
+      </w:r>
+    </w:p>
+    <w:p>
+      <w:pPr>
+        <w:spacing w:line="240" w:lineRule="auto"/>
+        <w:rPr>
+          <w:i/>
+          <w:iCs/>
+          <w:lang w:val="en-US" w:eastAsia="en-US"/>
+        </w:rPr>
+      </w:pPr>
+      <w:r>
+        <w:rPr>
+          <w:i/>
+          <w:iCs/>
+          <w:lang w:val="en-US" w:eastAsia="en-US"/>
+        </w:rPr>
+        <w:t xml:space="preserve">Wheeler’s own memoir, told as a life rather than a lecture — black holes, wormholes, and where ‘it from bit’ actually came from. The friendliest way in. Watch: </w:t>
+      </w:r>
       <w:hyperlink r:id="rId100" w:history="1">
         <w:r>
           <w:rPr>
             <w:rStyle w:val="Hyperlink"/>
+            <w:i/>
+            <w:iCs/>
+            <w:lang w:val="en-US" w:eastAsia="en-US"/>
           </w:rPr>
-          <w:t>Wheeler, John Archibald</w:t>
+          <w:t xml:space="preserve">Wheeler on naming the black hole</w:t>
         </w:r>
       </w:hyperlink>
       <w:r>
-        <w:rPr>
-          <w:b/>
-        </w:rPr>
-        <w:t>, with Kenneth Ford.</w:t>
-      </w:r>
-      <w:r>
-        <w:t xml:space="preserve"> Geons, Black Holes, and Quantum Foam: A Life in Physics. W. W. Norton &amp; Company, 1998.</w:t>
-      </w:r>
-    </w:p>
-    <w:p>
-      <w:pPr>
-        <w:spacing w:line="240" w:lineRule="auto"/>
         <w:rPr>
           <w:i/>
           <w:iCs/>
           <w:lang w:val="en-US" w:eastAsia="en-US"/>
         </w:rPr>
-      </w:pPr>
-      <w:r>
-        <w:rPr>
-          <w:i/>
-          <w:iCs/>
-          <w:lang w:val="en-US" w:eastAsia="en-US"/>
-        </w:rPr>
-        <w:t>Wheeler’s own memoir, told as a life rather than a lecture — black holes, wormholes, and where ‘it from bit’ actually came from. The friendliest way in.</w:t>
+        <w:t xml:space="preserve">.</w:t>
       </w:r>
     </w:p>
     <w:p>
@@ -36725,28 +37007,38 @@
           <w:rFonts w:ascii="Times New Roman" w:hAnsi="Times New Roman"/>
         </w:rPr>
       </w:pPr>
-      <w:hyperlink r:id="rId101" w:history="1">
+      <w:r>
+        <w:t xml:space="preserve">Zurek, Wojciech H. “</w:t>
+      </w:r>
+      <w:hyperlink r:id="rId155" w:history="1">
         <w:r>
           <w:rPr>
             <w:rStyle w:val="Hyperlink"/>
           </w:rPr>
-          <w:t>Zurek, Wojciech H.</w:t>
+          <w:t xml:space="preserve">Quantum Darwinism</w:t>
         </w:r>
       </w:hyperlink>
       <w:r>
-        <w:t xml:space="preserve"> Quantum Darwinism. Nature Physics, vol. 5, 2009, pp. 181–188.</w:t>
+        <w:t xml:space="preserve">.” Nature Physics, vol. 5, 2009, pp. 181–188. </w:t>
+      </w:r>
+      <w:hyperlink r:id="rId156" w:history="1">
+        <w:r>
+          <w:rPr>
+            <w:rStyle w:val="Hyperlink"/>
+          </w:rPr>
+          <w:t xml:space="preserve">Free preprint on arXiv</w:t>
+        </w:r>
+      </w:hyperlink>
+      <w:r>
+        <w:t xml:space="preserve">.</w:t>
       </w:r>
     </w:p>
     <w:p>
       <w:pPr>
         <w:spacing w:line="240" w:lineRule="auto"/>
         <w:rPr>
-          <w:rFonts w:ascii="Segoe UI" w:eastAsia="Times New Roman" w:hAnsi="Segoe UI" w:cs="Segoe UI"/>
           <w:i/>
           <w:iCs/>
-          <w:sz w:val="21"/>
-          <w:szCs w:val="21"/>
-          <w:lang w:val="en-US" w:eastAsia="en-US"/>
         </w:rPr>
       </w:pPr>
       <w:r>
@@ -36754,33 +37046,8 @@
           <w:i/>
           <w:iCs/>
         </w:rPr>
-        <w:t>https://arxiv.org/pdf/0903.5082</w:t>
-      </w:r>
-    </w:p>
-    <w:p>
-      <w:pPr>
-        <w:spacing w:line="240" w:lineRule="auto"/>
-        <w:rPr>
-          <w:i/>
-          <w:iCs/>
-        </w:rPr>
-      </w:pPr>
-      <w:r>
-        <w:rPr>
-          <w:i/>
-          <w:iCs/>
-        </w:rPr>
         <w:t>The paper that gives that phrase about gossip its real name: why the everyday world looks so solidly agreed-upon to anyone who checks.</w:t>
       </w:r>
-    </w:p>
-    <w:p>
-      <w:pPr>
-        <w:spacing w:line="240" w:lineRule="auto"/>
-        <w:rPr>
-          <w:i/>
-          <w:iCs/>
-        </w:rPr>
-      </w:pPr>
     </w:p>
     <w:p>
       <w:pPr>
@@ -36816,10 +37083,10 @@
         </w:r>
       </w:hyperlink>
       <w:r>
-        <w:t xml:space="preserve"> YouTube, 16 Mar. 2020, </w:t>
-      </w:r>
-      <w:r>
-        <w:t>youtube.com/watch?v=vSnq5Hs3_wI.</w:t>
+        <w:t xml:space="preserve"> YouTube, 16 Mar. 2020.</w:t>
+      </w:r>
+      <w:r>
+        <w:t/>
       </w:r>
     </w:p>
     <w:p>
@@ -36846,19 +37113,6 @@
         <w:rPr>
           <w:i/>
           <w:iCs/>
-          <w:lang w:val="en-US" w:eastAsia="en-US"/>
-        </w:rPr>
-      </w:pPr>
-    </w:p>
-    <w:p>
-      <w:pPr>
-        <w:spacing w:line="240" w:lineRule="auto"/>
-        <w:rPr>
-          <w:rFonts w:ascii="Segoe UI" w:eastAsia="Times New Roman" w:hAnsi="Segoe UI" w:cs="Segoe UI"/>
-          <w:i/>
-          <w:iCs/>
-          <w:sz w:val="21"/>
-          <w:szCs w:val="21"/>
           <w:lang w:val="en-US" w:eastAsia="en-US"/>
         </w:rPr>
       </w:pPr>
@@ -36919,7 +37173,7 @@
           <w:sz w:val="26"/>
           <w:szCs w:val="26"/>
         </w:rPr>
-        <w:t xml:space="preserve">Characters in this book say the names of real scientists without the faintest idea who they are. A woman whose crockery has been administratively altered will demand to know who Hawking is, and be told, correctly, that he is a physicist and not a department. </w:t>
+        <w:t xml:space="preserve">Characters in this book say the names of real scientists without the faintest idea who they are. A woman whose crockery has been administratively altered will demand to know who Hawking is, and be told, correctly, that he is a physicist and not a department.</w:t>
       </w:r>
     </w:p>
     <w:p>
@@ -36953,7 +37207,7 @@
           <w:sz w:val="26"/>
           <w:szCs w:val="26"/>
         </w:rPr>
-        <w:t xml:space="preserve">The consultants are some of the greatest physicists of the twentieth century, lightly disguised, mildly inconvenienced, and required to explain themselves to a Third Grade officer with a green notebook. </w:t>
+        <w:t xml:space="preserve">The consultants are some of the greatest physicists of the twentieth century, lightly disguised, mildly inconvenienced, and required to explain themselves to a Third Grade officer with a green notebook.</w:t>
       </w:r>
     </w:p>
     <w:p>
@@ -36987,25 +37241,6 @@
         </w:rPr>
         <w:br w:type="page"/>
       </w:r>
-    </w:p>
-    <w:p>
-      <w:pPr>
-        <w:spacing w:after="160"/>
-        <w:jc w:val="both"/>
-        <w:rPr>
-          <w:sz w:val="8"/>
-          <w:szCs w:val="8"/>
-        </w:rPr>
-      </w:pPr>
-    </w:p>
-    <w:p>
-      <w:pPr>
-        <w:spacing w:after="200"/>
-        <w:rPr>
-          <w:sz w:val="14"/>
-          <w:szCs w:val="14"/>
-        </w:rPr>
-      </w:pPr>
     </w:p>
     <w:p>
       <w:pPr>
@@ -37581,7 +37816,7 @@
           <w:sz w:val="26"/>
           <w:szCs w:val="26"/>
         </w:rPr>
-        <w:t xml:space="preserve">In Love with Murder, Actually: A Comic Mystery, Lothar J. Musiol writing as Romuald Livingston</w:t>
+        <w:t xml:space="preserve">In Love with Murder, Actually: A Derailed Mystery in Provence, Lothar J. Musiol writing as Romuald Livingston</w:t>
       </w:r>
     </w:p>
     <w:p>
@@ -37688,7 +37923,7 @@
           <w:sz w:val="26"/>
           <w:szCs w:val="26"/>
         </w:rPr>
-        <w:t xml:space="preserve">It stands, depending on whom you ask, </w:t>
+        <w:t xml:space="preserve">It stands, depending on whom you ask,</w:t>
       </w:r>
     </w:p>
     <w:p>
@@ -37706,7 +37941,7 @@
           <w:sz w:val="26"/>
           <w:szCs w:val="26"/>
         </w:rPr>
-        <w:t xml:space="preserve">for </w:t>
+        <w:t xml:space="preserve">for</w:t>
       </w:r>
     </w:p>
     <w:p>
@@ -37725,7 +37960,7 @@
           <w:sz w:val="26"/>
           <w:szCs w:val="26"/>
         </w:rPr>
-        <w:t xml:space="preserve">Quod Erat Demonstrandum — Latin for “which was to be demonstrated” </w:t>
+        <w:t xml:space="preserve">Quod Erat Demonstrandum — Latin for “which was to be demonstrated”</w:t>
       </w:r>
     </w:p>
     <w:p>
@@ -37743,7 +37978,7 @@
           <w:sz w:val="26"/>
           <w:szCs w:val="26"/>
         </w:rPr>
-        <w:t xml:space="preserve">or for </w:t>
+        <w:t xml:space="preserve">or for</w:t>
       </w:r>
     </w:p>
     <w:p>
@@ -37854,7 +38089,7 @@
           <w:sz w:val="26"/>
           <w:szCs w:val="26"/>
         </w:rPr>
-        <w:t xml:space="preserve">The name behind the pseudonym is </w:t>
+        <w:t xml:space="preserve">The name behind the pseudonym is</w:t>
       </w:r>
     </w:p>
     <w:p>
@@ -38168,7 +38403,7 @@
           <w:sz w:val="26"/>
           <w:szCs w:val="26"/>
         </w:rPr>
-        <w:t xml:space="preserve">None of the physics in this book was invented for the joke. If you would like to go further than a Ministry can take you, three places are worth the trip — two of them already named above, one not: </w:t>
+        <w:t xml:space="preserve">None of the physics in this book was invented for the joke. If you would like to go further than a Ministry can take you, three places are worth the trip — two of them already named above, one not:</w:t>
       </w:r>
     </w:p>
     <w:p>
@@ -38240,7 +38475,7 @@
           <w:sz w:val="26"/>
           <w:szCs w:val="26"/>
         </w:rPr>
-        <w:t xml:space="preserve"> makes the case for relational quantum mechanics in prose good enough to make you forgive him for being persuasive. And if you want the same territory covered at considerably greater length and with far less bureaucracy, </w:t>
+        <w:t xml:space="preserve"> makes the case for relational quantum mechanics in prose good enough to make you forgive him for being persuasive.</w:t>
       </w:r>
     </w:p>
     <w:p>
@@ -38256,7 +38491,26 @@
           <w:sz w:val="26"/>
           <w:szCs w:val="26"/>
         </w:rPr>
-        <w:t>Kenneth Ford’s The Quantum World goes much further into most of the questions this book only had time to dramatise.</w:t>
+        <w:t xml:space="preserve">And if you want the same territory covered at considerably greater length and with far less bureaucracy, Kenneth Ford’s </w:t>
+      </w:r>
+      <w:hyperlink r:id="rId157" w:history="1">
+        <w:r>
+          <w:rPr>
+            <w:rStyle w:val="Hyperlink"/>
+            <w:i/>
+            <w:sz w:val="26"/>
+            <w:szCs w:val="26"/>
+          </w:rPr>
+          <w:t xml:space="preserve">The Quantum World</w:t>
+        </w:r>
+      </w:hyperlink>
+      <w:r>
+        <w:rPr>
+          <w:i/>
+          <w:sz w:val="26"/>
+          <w:szCs w:val="26"/>
+        </w:rPr>
+        <w:t xml:space="preserve"> goes much further into most of the questions this book only had time to dramatise.</w:t>
       </w:r>
     </w:p>
     <w:p>
@@ -38267,18 +38521,6 @@
           <w:color w:val="0070C0"/>
           <w:sz w:val="8"/>
           <w:szCs w:val="8"/>
-        </w:rPr>
-      </w:pPr>
-    </w:p>
-    <w:p>
-      <w:pPr>
-        <w:rPr>
-          <w:rFonts w:ascii="Amazon Ember" w:hAnsi="Amazon Ember"/>
-          <w:b/>
-          <w:bCs/>
-          <w:color w:val="0070C0"/>
-          <w:sz w:val="26"/>
-          <w:szCs w:val="26"/>
         </w:rPr>
       </w:pPr>
     </w:p>
@@ -38301,7 +38543,7 @@
           <w:sz w:val="36"/>
         </w:rPr>
         <w:lastRenderedPageBreak/>
-        <w:t>If You Enjoyed This Book</w:t>
+        <w:t>Before You Go</w:t>
       </w:r>
       <w:bookmarkEnd w:id="328"/>
     </w:p>
@@ -38320,42 +38562,7 @@
           <w:sz w:val="26"/>
           <w:szCs w:val="28"/>
         </w:rPr>
-        <w:t xml:space="preserve">Reviews are how small books find their readers. If </w:t>
-      </w:r>
-      <w:r>
-        <w:rPr>
-          <w:rStyle w:val="Emphasis"/>
-          <w:rFonts w:cs="Segoe UI"/>
-          <w:sz w:val="26"/>
-          <w:szCs w:val="28"/>
-        </w:rPr>
-        <w:t>Schrödinger’s Paperwork</w:t>
-      </w:r>
-      <w:r>
-        <w:rPr>
-          <w:rFonts w:cs="Segoe UI"/>
-          <w:sz w:val="26"/>
-          <w:szCs w:val="28"/>
-        </w:rPr>
-        <w:t xml:space="preserve"> made you laugh, or helped you understand something you had always been told was impossible to grasp, a few honest sentences on the store page will do more good than the author ever could alone.</w:t>
-      </w:r>
-    </w:p>
-    <w:p>
-      <w:pPr>
-        <w:spacing w:line="300" w:lineRule="atLeast"/>
-        <w:rPr>
-          <w:rFonts w:cs="Segoe UI"/>
-          <w:sz w:val="26"/>
-          <w:szCs w:val="28"/>
-        </w:rPr>
-      </w:pPr>
-      <w:r>
-        <w:rPr>
-          <w:rFonts w:cs="Segoe UI"/>
-          <w:sz w:val="26"/>
-          <w:szCs w:val="28"/>
-        </w:rPr>
-        <w:t xml:space="preserve">And if you want more paperwork failing at physics, Book 2 of </w:t>
+        <w:t xml:space="preserve">If you want more paperwork failing at physics, Book 2 of </w:t>
       </w:r>
       <w:r>
         <w:rPr>

</xml_diff>

<commit_message>
Lolly Wren series: editorial review and Kindle handoff
</commit_message>
<xml_diff>
--- a/Lolly Wren's Curious Science Adventures - SERIES/Book 1 - Schrodingers Paperwork/Schrodingers_Paperwork_BOOK_1_KINDLE_FINAL.docx
+++ b/Lolly Wren's Curious Science Adventures - SERIES/Book 1 - Schrodingers Paperwork/Schrodingers_Paperwork_BOOK_1_KINDLE_FINAL.docx
@@ -3838,7 +3838,7 @@
     </w:p>
     <w:p>
       <w:r>
-        <w:t>Lolly opened the green notebook and wrote only one sentence.</w:t>
+        <w:t>Lolly put one sentence in the green notebook.</w:t>
       </w:r>
     </w:p>
     <w:p>
@@ -4704,7 +4704,7 @@
     </w:p>
     <w:p>
       <w:r>
-        <w:t>Lolly opened the green notebook and wrote:</w:t>
+        <w:t>She reached for the notebook and recorded:</w:t>
       </w:r>
     </w:p>
     <w:p>
@@ -5541,7 +5541,7 @@
     </w:p>
     <w:p>
       <w:r>
-        <w:t>She opened the green notebook and wrote quickly:</w:t>
+        <w:t>She wrote the sequence in the margin:</w:t>
       </w:r>
     </w:p>
     <w:p>
@@ -11764,7 +11764,7 @@
     </w:p>
     <w:p>
       <w:r>
-        <w:t xml:space="preserve">“I am sorry to intrude,” he began. His English was slow and careful, and made Lolly realise how quickly everybody else had been speaking, these last three days. “Louis-Raymond-Victor, Duc de Broccoli, entirely at your service.”</w:t>
+        <w:t>“I am sorry to intrude,” he began. He spoke slowly and carefully, making Lolly realise how quickly everybody else had been speaking these last three days. “Louis-Raymond-Victor, Duc de Broccoli, entirely at your service.”</w:t>
       </w:r>
     </w:p>
     <w:p>
@@ -12248,7 +12248,7 @@
     </w:p>
     <w:p>
       <w:r>
-        <w:t xml:space="preserve">The third came in last and quietly, and the room’s temperature dropped to meet him. He was a smallish man with a red beard going white, in a jumper. His Belfast accent had been sanded down by decades of being right at people who wished he wasn’t, and he sat down without shaking hands.</w:t>
+        <w:t>The third came in last and quietly, and the room’s temperature dropped to meet him. He was a smallish man with a red beard going white, in a jumper. His Belfast accent marked his voice; he sat down without shaking hands.</w:t>
       </w:r>
     </w:p>
     <w:p>
@@ -17411,7 +17411,7 @@
     </w:p>
     <w:p>
       <w:r>
-        <w:t>Measurement is an intervention. It changes the thing measured. Officers who measure repeatedly in order to be thorough should be aware that they are not observing a system; they are pinning one.</w:t>
+        <w:t>The apparatus couples physically to the system; depending on what is measured and in which state, it can alter the system or suppress interference. Repeated measurement is therefore not a neutral audit: the instrument may change the evidence.</w:t>
       </w:r>
     </w:p>
     <w:p>
@@ -17440,7 +17440,7 @@
     </w:p>
     <w:p>
       <w:r>
-        <w:t>Black holes are not permanent. They radiate, cool the universe’s patience, and evaporate. A small one does this fast, and faster as it shrinks. This is a law, not a fault, and cannot be appealed.</w:t>
+        <w:t>Hawking's semiclassical calculation predicts that black holes radiate and can evaporate; smaller holes evaporate faster. This is a robust theoretical prediction, not an observed process for astrophysical black holes. The Ministry treats the prediction as law, not a fault, and cannot appeal it.</w:t>
       </w:r>
     </w:p>
     <w:p>
@@ -17536,16 +17536,14 @@
       <w:pPr>
         <w:spacing w:after="240"/>
       </w:pPr>
-      <w:r>
-        <w:t>Information can nonetheless be protected, by spreading it redundantly across many parts without ever copying it. This is </w:t>
-      </w:r>
+      <w:r/>
       <w:hyperlink w:anchor="glQuantumErrorCorrection">
         <w:r>
-          <w:t xml:space="preserve">quantum error correction</w:t>
+          <w:t xml:space="preserve">Quantum error correction</w:t>
         </w:r>
       </w:hyperlink>
       <w:r>
-        <w:t xml:space="preserve">, and it works up to a threshold, beyond which it does not.</w:t>
+        <w:t xml:space="preserve"> can protect information by encoding it across many physical parts. It can recover the state from limited noise, but only below a threshold.</w:t>
       </w:r>
     </w:p>
     <w:p>
@@ -17636,7 +17634,7 @@
           <w:sz w:val="22"/>
           <w:szCs w:val="22"/>
         </w:rPr>
-        <w:t xml:space="preserve"> proves that no theory in which distant things have their own separate pre-existing properties can reproduce the correlations we measure.</w:t>
+        <w:t xml:space="preserve"> shows that local hidden-variable theories obey correlation bounds that quantum mechanics can violate.</w:t>
       </w:r>
     </w:p>
     <w:p>
@@ -17655,7 +17653,7 @@
           <w:sz w:val="22"/>
           <w:szCs w:val="22"/>
         </w:rPr>
-        <w:t>Experiment has confirmed the violation repeatedly and, since 2015, without loopholes.</w:t>
+        <w:t>Bell-test experiments have repeatedly observed violations; tests reported in 2015 closed the major locality and detection loopholes.</w:t>
       </w:r>
     </w:p>
     <w:p>
@@ -17677,16 +17675,14 @@
         </w:rPr>
       </w:pPr>
       <w:r>
-        <w:t>This rules out local </w:t>
+        <w:t>These tests rule out local hidden-variable explanations under their assumptions. They do not rule out all hidden-variable theories: pilot-wave theory reproduces quantum predictions by being nonlocal.</w:t>
       </w:r>
       <w:hyperlink w:anchor="glHidden">
         <w:r>
-          <w:t xml:space="preserve">hidden variables</w:t>
+          <w:t/>
         </w:r>
       </w:hyperlink>
-      <w:r>
-        <w:t xml:space="preserve">. It does not rule out all hidden variables. Pilot-wave theory survives precisely because it never claimed to be local.</w:t>
-      </w:r>
+      <w:r/>
     </w:p>
     <w:p>
       <w:pPr>
@@ -17798,7 +17794,7 @@
     </w:p>
     <w:p>
       <w:r>
-        <w:t>A black hole’s entropy is proportional to the area of its horizon, not to its volume. What a region contains can apparently be accounted for on its boundary. This is the </w:t>
+        <w:t xml:space="preserve">The entropy of a black hole is proportional to the area of its horizon, not its volume. This area law motivates the </w:t>
       </w:r>
       <w:hyperlink w:anchor="glHolographicPrinciple">
         <w:r>
@@ -17806,7 +17802,7 @@
         </w:r>
       </w:hyperlink>
       <w:r>
-        <w:t xml:space="preserve">, and it is the reason evaporation may constitute disclosure rather than destruction.</w:t>
+        <w:t xml:space="preserve"> and related bounds and dualities: in certain theories, a region can be described by information on a lower-dimensional boundary. Whether evaporation preserves information remains a major theoretical problem.</w:t>
       </w:r>
     </w:p>
     <w:p>
@@ -17827,7 +17823,7 @@
         </w:r>
       </w:hyperlink>
       <w:r>
-        <w:t xml:space="preserve"> and pilot-wave are interpretations, not competing products, and that no experiment has yet distinguished between them. The Ministry has no position. The Ministry is not entitled to one.</w:t>
+        <w:t xml:space="preserve"> and pilot-wave are interpretations, not competing products; in their standard forms they reproduce the same quantum predictions, and experiments have not selected among them. The Ministry has no position. The Ministry is not entitled to one.</w:t>
       </w:r>
     </w:p>
     <w:p>
@@ -17857,7 +17853,7 @@
     </w:p>
     <w:p>
       <w:r>
-        <w:t>The </w:t>
+        <w:t xml:space="preserve">The </w:t>
       </w:r>
       <w:hyperlink w:anchor="glSecond">
         <w:r>
@@ -17865,7 +17861,7 @@
         </w:r>
       </w:hyperlink>
       <w:r>
-        <w:t xml:space="preserve"> stands: total entropy does not decrease. Local order is always paid for by exporting disorder somewhere else.</w:t>
+        <w:t xml:space="preserve"> says total entropy in an isolated system cannot decrease. A subsystem may become more ordered if greater entropy is produced in its surroundings or carried across its boundary.</w:t>
       </w:r>
     </w:p>
     <w:p>
@@ -20285,7 +20281,7 @@
     </w:p>
     <w:p>
       <w:r>
-        <w:t xml:space="preserve">When you walk out, you should be able to: Say why </w:t>
+        <w:t xml:space="preserve">When you walk out, you should be able to: Explain how </w:t>
       </w:r>
       <w:hyperlink w:anchor="glMeasurement" w:history="1">
         <w:r>
@@ -20296,7 +20292,7 @@
         </w:r>
       </w:hyperlink>
       <w:r>
-        <w:t xml:space="preserve"> is an intervention, and how asking too soon can destroy coherence that cannot be recovered by declaring the result settled.</w:t>
+        <w:t xml:space="preserve"> is a physical interaction, and how some measurements can suppress coherence or change a system.</w:t>
       </w:r>
     </w:p>
     <w:p>
@@ -22791,14 +22787,7 @@
       <w:bookmarkStart w:id="125" w:name="glWherethepopularversiongoeswr_6"/>
       <w:bookmarkEnd w:id="125"/>
       <w:r>
-        <w:rPr>
-          <w:b/>
-          <w:bCs/>
-        </w:rPr>
-        <w:t>Where the popular version goes wrong.</w:t>
-      </w:r>
-      <w:r>
-        <w:t xml:space="preserve"> The usual tale says that a pair of “virtual particles” appears at the horizon, one falls in and one escapes. It can gesture towards the answer, but it is only a heuristic and is widely criticised as a literal account; it suggests little particles popping out at one special place and can get the energy bookkeeping badly wrong. The better framing is about quantum fields in curved spacetime. What counts as an empty vacuum, and even what counts as a particle, is not observer-independent there; comparing the field’s distant past and distant future around a black hole yields radiation for a far-away observer. No little horizon factory is required. A separate, more calculable derivation treats the process as quantum tunnelling — the same barrier-crossing mechanism behind alpha decay and the scanning tunnelling microscope, where a particle has some probability of crossing a region classical physics says it cannot reach — applied to the horizon itself; it reproduces Hawking’s temperature at leading order (with small corrections as the hole recoils), with no factory and no story about where the pair was born.</w:t>
+        <w:t>The usual tale says that a pair of virtual particles appears at the horizon, one falls in and one escapes. This is a heuristic, not a literal account, and it can obscure the energy bookkeeping. The clearer framework is quantum field theory in curved spacetime: what counts as an empty vacuum or a particle can depend on the observer. Comparing the field in the distant past and future around a black hole yields radiation for a distant observer; no horizon factory is required. A separate calculation, often called the tunnelling method, derives Hawking radiation by modelling emission across the horizon. It reproduces the Hawking temperature at leading order, but it is not a literal account of a particle crossing an ordinary potential barrier and does not replace the field-theory explanation.</w:t>
       </w:r>
     </w:p>
     <w:p>
@@ -22918,7 +22907,7 @@
         <w:jc w:val="both"/>
       </w:pPr>
       <w:r>
-        <w:t xml:space="preserve">Put a number on it: for one solar mass, that formula gives a Hawking temperature of roughly 60 billionths of a kelvin — colder than the cosmic microwave background it sits in, which is why no astrophysical black hole has ever been caught evaporating. In the semiclassical treatment, the evaporation time of an isolated, non-rotating, uncharged black hole scales as tevap ∝ M3. That calculation creates the information problem: quantum evolution normally preserves distinctions between initial states, but exactly thermal final radiation seems not to display them. Most modern work expects information to be preserved, yet the complete mechanism requires quantum gravity and is not settled in a simple textbook picture. A closely related result, </w:t>
+        <w:t xml:space="preserve">Put a number on it: for a one-solar-mass black hole, the Hawking formula gives roughly 60 nanokelvin, far below the cosmic microwave background at about 2.7 kelvin. It would absorb more background energy than it emits, so it would not currently lose mass overall. Hawking radiation from an astrophysical black hole has not been directly detected. In the semiclassical treatment, the lifetime of an isolated, non-rotating, uncharged black hole scales as the cube of its mass. This prediction raises the information problem: quantum evolution normally preserves distinctions between initial states, while exactly thermal final radiation appears not to. Many physicists expect information to be preserved, but the complete mechanism requires quantum gravity and remains unsettled. A closely related result, </w:t>
       </w:r>
       <w:hyperlink w:anchor="glUnruh" w:history="1">
         <w:r>
@@ -25536,13 +25525,12 @@
         <w:jc w:val="both"/>
       </w:pPr>
       <w:r>
-        <w:rPr>
-          <w:b/>
-          <w:bCs/>
-        </w:rPr>
-        <w:t xml:space="preserve">A representative estimate puts a number on it: for a one-gram object held in a superposition of two positions a centimetre apart, at room temperature, the decoherence time works out to a small fraction of a second at most, and can be many orders of magnitude faster still depending on which environmental effect dominates — a conclusion that exists mainly to explain why nobody has ever caught a coin, a moon, or a filing cabinet mid-superposition.</w:t>
+        <w:t>A representative estimate illustrates how rapidly decoherence can occur. For a one-gr</w:t>
       </w:r>
       <w:hyperlink w:anchor="glMeasurementProblem" w:history="1"/>
+      <w:r>
+        <w:t>am object in a superposition of positions a centimetre apart at room temperature, some models give a decoherence time below a fraction of a second. Other environmental effects can make it many orders of magnitude shorter. The precise value depends on the assumptions; the larger point is why we do not see coins, moons or filing cabinets in sustained superpositions.</w:t>
+      </w:r>
     </w:p>
     <w:p>
       <w:r>
@@ -25608,7 +25596,7 @@
         <w:jc w:val="both"/>
       </w:pPr>
       <w:r>
-        <w:t>Einselection is not a committee. It is the environment’s habit of keeping the records that survive being copied. Pointer states are the ones that photocopy well. Superpositions of wildly different positions do not. The moon, to its credit, has always photocopied well.</w:t>
+        <w:t>Einselection is not a committee. Interactions with the environment suppress interference between many superpositions and can favour robust pointer states. Quantum Darwinism studies how information about those states may be recorded redundantly in the environment. The photocopying metaphor is useful, but the environment does not literally select states because they copy well.</w:t>
       </w:r>
     </w:p>
     <w:p>
@@ -26099,10 +26087,6 @@
       <w:bookmarkStart w:id="172" w:name="glAcloserlooktheEverettmanywor"/>
       <w:bookmarkEnd w:id="172"/>
       <w:r>
-        <w:rPr>
-          <w:b/>
-          <w:bCs/>
-        </w:rPr>
         <w:t>A closer look (skip freely): the Everett (</w:t>
       </w:r>
       <w:hyperlink w:anchor="glMany" w:history="1">
@@ -26114,14 +26098,7 @@
         </w:r>
       </w:hyperlink>
       <w:r>
-        <w:rPr>
-          <w:b/>
-          <w:bCs/>
-        </w:rPr>
-        <w:t>) interpretation</w:t>
-      </w:r>
-      <w:r>
-        <w:t xml:space="preserve">. One way to resolve the measurement problem is to deny that anything special happens at measurement at all. On this view — Everett’s 1957 proposal, later called many-worlds — the smooth quantum law never breaks down and never needs to: when Wigner’s friend measures YES or NO, both outcomes occur, in branches of one universal wavefunction that have stopped interacting with each other because they now differ in enormous, physically irreversible detail — a </w:t>
+        <w:t xml:space="preserve">) interpretation. One way to address the measurement problem is to say that nothing special happens at measurement. On Everett's 1957 proposal, later called many-worlds, the smooth quantum law never breaks down. When Wigner's friend measures YES or NO, both outcomes occur in branches of the universal wavefunction. Decoherence suppresses interference between branches as they become physically distinct: a </w:t>
       </w:r>
       <w:hyperlink w:anchor="glDecoherence" w:history="1">
         <w:r>
@@ -26132,7 +26109,7 @@
         </w:r>
       </w:hyperlink>
       <w:r>
-        <w:t xml:space="preserve"> friend, a decohered notebook, a decohered you. There is no collapse to explain and no boundary to locate, only a universe that was always described in full by the smooth law, branching every time a measurement-like interaction happens. Its cost is generosity taken to an extreme: every possible outcome is realised somewhere. That is not obviously a comfort. A theory in which nothing is ever truly lost does not, on its own, tell you which losses are still worth grieving — and readers who continue on to Chapter 13 will meet that exact tension argued out in person, by people with a considerable stake in the answer.</w:t>
+        <w:t xml:space="preserve"> friend, a decohered notebook, a decohered observer. There is no collapse to explain and no boundary to locate; measurement-like interactions produce branching descriptions. Every outcome with non-zero amplitude is realised somewhere. That is not obviously a comfort. The theory does not, by itself, tell us which losses are worth grieving. Readers who continue to Chapter 13 will meet that tension argued out by people with a considerable stake in the answer.</w:t>
       </w:r>
     </w:p>
     <w:p>
@@ -28788,14 +28765,7 @@
       <w:bookmarkStart w:id="213" w:name="glInonebreath_14"/>
       <w:bookmarkEnd w:id="213"/>
       <w:r>
-        <w:rPr>
-          <w:b/>
-          <w:bCs/>
-        </w:rPr>
-        <w:t>In one breath.</w:t>
-      </w:r>
-      <w:r>
-        <w:t xml:space="preserve"> A black hole’s information capacity follows the area of its horizon, not its volume — and this area law motivates the holographic principle, the idea that a region’s full description might live on its boundary. Together they turn evaporation from a simple ending into a slow, scrambled disclosure.</w:t>
+        <w:t>A black hole's information capacity follows the area of its horizon, not its volume. That area law motivates the holographic principle: in certain theories, a region's full description may be encoded on a lower-dimensional boundary. This idea turns evaporation from a simple ending into a possible, slow, scrambled disclosure.</w:t>
       </w:r>
     </w:p>
     <w:p>
@@ -30058,7 +30028,7 @@
         <w:jc w:val="both"/>
       </w:pPr>
       <w:r>
-        <w:t>In one breath. The second law says that total entropy does not decrease: local order can be produced only by releasing greater disorder elsewhere. That is why Asset 4C could never be storage, and why cutting the coupling does not cancel the bill — it stops you pretending the hole was a filing cabinet.</w:t>
+        <w:t>In an isolated system, entropy cannot fall overall. Local order can increase only if greater disorder is produced or exported elsewhere. That is why Asset 4C could never be storage, and why cutting the coupling does not cancel the bill; it stops you pretending the hole was a filing cabinet.</w:t>
       </w:r>
     </w:p>
     <w:p>
@@ -30252,7 +30222,7 @@
         <w:jc w:val="both"/>
       </w:pPr>
       <w:r>
-        <w:t>• Total entropy does not decrease. Local order is paid for by exporting disorder somewhere else.</w:t>
+        <w:t>? For an isolated system, total entropy does not decrease. Local order requires greater entropy production or export elsewhere.</w:t>
       </w:r>
     </w:p>
     <w:p>
@@ -30421,7 +30391,7 @@
     </w:p>
     <w:p>
       <w:r>
-        <w:t xml:space="preserve">When you walk out, you should be able to: Define Schrödinger’s </w:t>
+        <w:t xml:space="preserve">When you walk out, you should be able to: Explain Schrödinger’s </w:t>
       </w:r>
       <w:hyperlink w:anchor="glNegentropy" w:history="1">
         <w:r>
@@ -30432,7 +30402,7 @@
         </w:r>
       </w:hyperlink>
       <w:r>
-        <w:t xml:space="preserve"> as a scheme within the </w:t>
+        <w:t xml:space="preserve"> as a way to describe how living systems maintain local order by taking in energy and exporting entropy, without escaping the </w:t>
       </w:r>
       <w:hyperlink w:anchor="glSecond" w:history="1">
         <w:r>
@@ -30443,7 +30413,7 @@
         </w:r>
       </w:hyperlink>
       <w:r>
-        <w:t>’s accounts, not an exemption from them.</w:t>
+        <w:t>.</w:t>
       </w:r>
     </w:p>
     <w:p>
@@ -32743,28 +32713,7 @@
       <w:bookmarkStart w:id="275" w:name="glHawking"/>
       <w:bookmarkEnd w:id="275"/>
       <w:r>
-        <w:rPr>
-          <w:b/>
-          <w:bCs/>
-        </w:rPr>
-        <w:t xml:space="preserve">Hawking </w:t>
-      </w:r>
-      <w:r>
-        <w:rPr>
-          <w:b/>
-          <w:bCs/>
-        </w:rPr>
-        <w:t>R</w:t>
-      </w:r>
-      <w:r>
-        <w:rPr>
-          <w:b/>
-          <w:bCs/>
-        </w:rPr>
-        <w:t>adiation</w:t>
-      </w:r>
-      <w:r>
-        <w:t xml:space="preserve"> — The faint thermal radiation a black hole emits by quantum processes, causing it to lose mass. Smaller black holes are hotter and evaporate faster.  (Chapter 6)</w:t>
+        <w:t>Hawking Radiation — Thermal radiation predicted from quantum fields around a black hole; as it emits energy, its mass falls. That loss accelerates as the hole shrinks and its temperature rises. (Chapter 6)</w:t>
       </w:r>
     </w:p>
     <w:p>
@@ -34578,28 +34527,7 @@
       <w:bookmarkStart w:id="310" w:name="glSchrdinger"/>
       <w:bookmarkEnd w:id="310"/>
       <w:r>
-        <w:rPr>
-          <w:b/>
-          <w:bCs/>
-        </w:rPr>
-        <w:t xml:space="preserve">Schrödinger </w:t>
-      </w:r>
-      <w:r>
-        <w:rPr>
-          <w:b/>
-          <w:bCs/>
-        </w:rPr>
-        <w:t>E</w:t>
-      </w:r>
-      <w:r>
-        <w:rPr>
-          <w:b/>
-          <w:bCs/>
-        </w:rPr>
-        <w:t>quation</w:t>
-      </w:r>
-      <w:r>
-        <w:t xml:space="preserve"> — The rule governing how an isolated quantum state changes between measurements: smoothly, predictably and reversibly. The least mysterious part of the subject.  (Chapter 5)</w:t>
+        <w:t>Schrödinger Equation — The rule governing how an isolated quantum state changes between measurements: smoothly, predictably and reversibly. The mathematical rule is clear; what counts as a measurement is not. (Chapter 5)</w:t>
       </w:r>
     </w:p>
     <w:p>

</xml_diff>

<commit_message>
Lolly Wren series: make science welcoming to new readers
</commit_message>
<xml_diff>
--- a/Lolly Wren's Curious Science Adventures - SERIES/Book 1 - Schrodingers Paperwork/Schrodingers_Paperwork_BOOK_1_KINDLE_FINAL.docx
+++ b/Lolly Wren's Curious Science Adventures - SERIES/Book 1 - Schrodingers Paperwork/Schrodingers_Paperwork_BOOK_1_KINDLE_FINAL.docx
@@ -303,11 +303,7 @@
         </w:rPr>
       </w:pPr>
       <w:r>
-        <w:rPr>
-          <w:sz w:val="18"/>
-          <w:szCs w:val="18"/>
-        </w:rPr>
-        <w:t>The physics explained in the lessons at the back of the book is presented in good faith and to the best of the author’s understanding. Where the science is unsettled, the text says so. Readers intending to sit an examination are warmly encouraged to consult a textbook as well.</w:t>
+        <w:t>No physics background is needed: the story stands on its own. If it makes you curious, optional lessons at the back explain the real science and flag what remains unsettled.</w:t>
       </w:r>
     </w:p>
     <w:p>

</xml_diff>

<commit_message>
Lolly Wren: literary review and Kindle polish
</commit_message>
<xml_diff>
--- a/Lolly Wren's Curious Science Adventures - SERIES/Book 1 - Schrodingers Paperwork/Schrodingers_Paperwork_BOOK_1_KINDLE_FINAL.docx
+++ b/Lolly Wren's Curious Science Adventures - SERIES/Book 1 - Schrodingers Paperwork/Schrodingers_Paperwork_BOOK_1_KINDLE_FINAL.docx
@@ -1550,7 +1550,7 @@
     </w:p>
     <w:p>
       <w:r>
-        <w:t xml:space="preserve">She was thirty-four, dark-haired, and built along economical lines by a decade spent standing at a workbench rather than sitting behind a desk — she still reached for things the way a person reaches for a tool, quick and unshowy, rather than the way people reach for things in offices.</w:t>
+        <w:t xml:space="preserve">She was thirty-four, dark-haired, and built along economical lines by a decade at the workbench. She still reached for things as she had learned there: quickly, without fuss, already thinking of what they could do.</w:t>
       </w:r>
     </w:p>
     <w:p>
@@ -31610,7 +31610,7 @@
         <w:t>Amplitude (probability)</w:t>
       </w:r>
       <w:r>
-        <w:t xml:space="preserve"> — The complex weight attached to an alternative in a superposition. Square its size for a probability; keep the phase if you want interference. Lose the phase and you have only a list of odds, which is what decoherence sells you.  (Chapter 1)</w:t>
+        <w:t xml:space="preserve"> — The complex weight attached to an alternative in a superposition. Square its size for a probability; keep the phase if you want interference. Lose the phase and you have only a list of odds, which is what decoherence sells you. (Chapter 1)</w:t>
       </w:r>
     </w:p>
     <w:p>
@@ -31670,7 +31670,7 @@
         <w:t>Bell’s theorem</w:t>
       </w:r>
       <w:r>
-        <w:t xml:space="preserve"> — The proof that no theory in which separated things carry their own pre-existing properties and cannot influence one another faster than light can reproduce the correlations quantum mechanics predicts. Experiment sides with quantum mechanics.  (Chapter 13)</w:t>
+        <w:t xml:space="preserve"> — The proof that no theory in which separated things carry their own pre-existing properties and cannot influence one another faster than light can reproduce the correlations quantum mechanics predicts. Experiment sides with quantum mechanics. (Chapter 13)</w:t>
       </w:r>
     </w:p>
     <w:p>
@@ -31735,7 +31735,7 @@
         <w:t>Black Hole</w:t>
       </w:r>
       <w:r>
-        <w:t xml:space="preserve"> — A region whose gravity is strong enough that light cannot escape past its event horizon, once formed. Despite the name, not perfectly black: it emits Hawking radiation and slowly evaporates.  (Chapter 6)</w:t>
+        <w:t xml:space="preserve"> — A region whose gravity is strong enough that light cannot escape past its event horizon, once formed. Despite the name, not perfectly black: it emits Hawking radiation and slowly evaporates. (Chapter 6)</w:t>
       </w:r>
     </w:p>
     <w:p>
@@ -31783,10 +31783,10 @@
           <w:b/>
           <w:bCs/>
         </w:rPr>
-        <w:t xml:space="preserve">ntropy  </w:t>
-      </w:r>
-      <w:r>
-        <w:t>—  A black hole’s entropy, proportional to the area of its event horizon rather than the volume inside. It counts how many microscopic configurations look identical from outside. Often written with Hawking’s 1974 prefactor.  (Chapter 14)</w:t>
+        <w:t xml:space="preserve">ntropy </w:t>
+      </w:r>
+      <w:r>
+        <w:t>— A black hole’s entropy, proportional to the area of its event horizon rather than the volume inside. It counts how many microscopic configurations look identical from outside. Often written with Hawking’s 1974 prefactor. (Chapter 14)</w:t>
       </w:r>
     </w:p>
     <w:p>
@@ -31850,7 +31850,7 @@
         <w:t>Born rule</w:t>
       </w:r>
       <w:r>
-        <w:t xml:space="preserve"> — The working rule that the squared size of an amplitude is the probability of that outcome. It is how a superposition becomes a set of odds rather than a mood.  (Chapter 1)</w:t>
+        <w:t xml:space="preserve"> — The working rule that the squared size of an amplitude is the probability of that outcome. It is how a superposition becomes a set of odds rather than a mood. (Chapter 1)</w:t>
       </w:r>
     </w:p>
     <w:p>
@@ -31886,7 +31886,7 @@
           <w:b/>
           <w:bCs/>
         </w:rPr>
-        <w:t>Bra–Ket Notation — The standard shorthand for quantum states, written |like this⟩. Lolly writes in it when frightened, which turns out to be often.  (Chapter 1)</w:t>
+        <w:t>Bra–Ket Notation — The standard shorthand for quantum states, written |like this⟩. Lolly writes in it when frightened, which turns out to be often. (Chapter 1)</w:t>
       </w:r>
     </w:p>
     <w:p>
@@ -31966,7 +31966,7 @@
         <w:t>nequality</w:t>
       </w:r>
       <w:r>
-        <w:t xml:space="preserve"> — A testable four-setting form of Bell’s theorem. Local hidden-variable theories cannot push the combined correlation S above 2; quantum mechanics reaches 2√2 ≈ 2.83.  (Chapter 13)</w:t>
+        <w:t xml:space="preserve"> — A testable four-setting form of Bell’s theorem. Local hidden-variable theories cannot push the combined correlation S above 2; quantum mechanics reaches 2√2 ≈ 2.83. (Chapter 13)</w:t>
       </w:r>
     </w:p>
     <w:p>
@@ -32028,7 +32028,7 @@
           <w:b/>
           <w:bCs/>
         </w:rPr>
-        <w:t>Collapse — Textbook shorthand for the abrupt update of a state to one definite outcome when a measurement records a result. Whether it is a real physical event is the measurement problem. See also State Reduction, the idealised version of the same update.  (Chapter 2)</w:t>
+        <w:t>Collapse — Textbook shorthand for the abrupt update of a state to one definite outcome when a measurement records a result. Whether it is a real physical event is the measurement problem. See also State Reduction, the idealised version of the same update. (Chapter 2)</w:t>
       </w:r>
     </w:p>
     <w:p>
@@ -32068,7 +32068,7 @@
         <w:rPr>
           <w:bCs/>
         </w:rPr>
-        <w:t xml:space="preserve"> — The historically dominant account, associated with Bohr and Heisenberg: quantum mechanics gives the probabilities for what a measurement will show, and treats questions about what is ‘really’ happening in between as outside what physics can answer. Often paired, in practice, with the collapse postulate as a working rule rather than a claim about physical mechanism.  (Chapter 11)</w:t>
+        <w:t xml:space="preserve"> — The historically dominant account, associated with Bohr and Heisenberg: quantum mechanics gives the probabilities for what a measurement will show, and treats questions about what is ‘really’ happening in between as outside what physics can answer. Often paired, in practice, with the collapse postulate as a working rule rather than a claim about physical mechanism. (Chapter 11)</w:t>
       </w:r>
     </w:p>
     <w:p>
@@ -32147,7 +32147,7 @@
         <w:t>avelength</w:t>
       </w:r>
       <w:r>
-        <w:t xml:space="preserve"> — The wavelength associated with any moving object, shorter for greater momentum: λ = h/p. Far too small to notice for anything larger than a molecule.  (Chapter 12)</w:t>
+        <w:t xml:space="preserve"> — The wavelength associated with any moving object, shorter for greater momentum: λ = h/p. Far too small to notice for anything larger than a molecule. (Chapter 12)</w:t>
       </w:r>
     </w:p>
     <w:p>
@@ -32212,7 +32212,7 @@
         <w:t>Decoherence</w:t>
       </w:r>
       <w:r>
-        <w:t xml:space="preserve"> — The leakage of a system’s quantum relationships into its uncontrolled surroundings, which makes interference between alternatives practically unrecoverable and is why large objects look definite. Not a solution to the measurement problem.  (Chapter 10)</w:t>
+        <w:t xml:space="preserve"> — The leakage of a system’s quantum relationships into its uncontrolled surroundings, which makes interference between alternatives practically unrecoverable and is why large objects look definite. Not a solution to the measurement problem. (Chapter 10)</w:t>
       </w:r>
     </w:p>
     <w:p>
@@ -32277,7 +32277,7 @@
         <w:t>Determinism</w:t>
       </w:r>
       <w:r>
-        <w:t xml:space="preserve"> — The property of a theory in which the present state fixes the future exactly. Quantum evolution is deterministic between measurements; pilot-wave theory is deterministic throughout.  (Chapter 5)</w:t>
+        <w:t xml:space="preserve"> — The property of a theory in which the present state fixes the future exactly. Quantum evolution is deterministic between measurements; pilot-wave theory is deterministic throughout. (Chapter 5)</w:t>
       </w:r>
     </w:p>
     <w:p>
@@ -32342,7 +32342,7 @@
         <w:t>Duality</w:t>
       </w:r>
       <w:r>
-        <w:t xml:space="preserve"> — A relation showing that two apparently different physical descriptions are one theory seen from different sides — the reason the five string theories turned out to be one.  (Chapter 14)</w:t>
+        <w:t xml:space="preserve"> — A relation showing that two apparently different physical descriptions are one theory seen from different sides — the reason the five string theories turned out to be one. (Chapter 14)</w:t>
       </w:r>
     </w:p>
     <w:p>
@@ -32408,7 +32408,7 @@
         <w:t>Einselection</w:t>
       </w:r>
       <w:r>
-        <w:t xml:space="preserve"> — Environment-induced superselection: the way constant environmental interaction singles out a small set of robust, stable pointer states from all the states a system could in principle occupy.  (Chapter 10)</w:t>
+        <w:t xml:space="preserve"> — Environment-induced superselection: the way constant environmental interaction singles out a small set of robust, stable pointer states from all the states a system could in principle occupy. (Chapter 10)</w:t>
       </w:r>
     </w:p>
     <w:p>
@@ -32445,7 +32445,7 @@
         <w:t>Entanglement</w:t>
       </w:r>
       <w:r>
-        <w:t xml:space="preserve"> — A single quantum description shared by two or more objects, so that neither has a definite individual value for the relevant property — only a shared, correlated one. It sends no usable signal faster than light.  (Chapter 7)</w:t>
+        <w:t xml:space="preserve"> — A single quantum description shared by two or more objects, so that neither has a definite individual value for the relevant property — only a shared, correlated one. It sends no usable signal faster than light. (Chapter 7)</w:t>
       </w:r>
     </w:p>
     <w:p>
@@ -32510,7 +32510,7 @@
         <w:t>Entropy</w:t>
       </w:r>
       <w:r>
-        <w:t xml:space="preserve"> — A measure of how many microscopic arrangements are consistent with a system’s observable, large-scale state; more such arrangements means higher entropy. The quantity the second law of thermodynamics says cannot, overall, decrease.  (Chapter 17)</w:t>
+        <w:t xml:space="preserve"> — A measure of how many microscopic arrangements are consistent with a system’s observable, large-scale state; more such arrangements means higher entropy. The quantity the second law of thermodynamics says cannot, overall, decrease. (Chapter 17)</w:t>
       </w:r>
     </w:p>
     <w:p>
@@ -32589,7 +32589,7 @@
         <w:t>orizon</w:t>
       </w:r>
       <w:r>
-        <w:t xml:space="preserve"> — The surface of a black hole: the boundary past which nothing, light included, can return to a distant observer. It is a boundary for distant observers, not a steel lid: nothing piles up against it like post at a closed office.  (Chapter 6)</w:t>
+        <w:t xml:space="preserve"> — The surface of a black hole: the boundary past which nothing, light included, can return to a distant observer. It is a boundary for distant observers, not a steel lid: nothing piles up against it like post at a closed office. (Chapter 6)</w:t>
       </w:r>
     </w:p>
     <w:p>
@@ -32651,7 +32651,7 @@
           <w:b/>
           <w:bCs/>
         </w:rPr>
-        <w:t>Fine-Structure Constant — The dimensionless number (α ≈ 1/137.036) that fixes how strongly an electron and a photon interact. Measured to about ten significant figures; never derived from anything more basic.  (Backlog)</w:t>
+        <w:t>Fine-Structure Constant — The dimensionless number (α ≈ 1/137.036) that fixes how strongly an electron and a photon interact. Measured to about ten significant figures; never derived from anything more basic. (Backlog)</w:t>
       </w:r>
     </w:p>
     <w:p>
@@ -32789,7 +32789,7 @@
         <w:t>ariables</w:t>
       </w:r>
       <w:r>
-        <w:t xml:space="preserve"> — Proposed extra properties a system carries in advance that would fix measurement outcomes. Bell’s theorem rules out the local kind; pilot-wave theory is a surviving nonlocal kind.  (Chapter 13)</w:t>
+        <w:t xml:space="preserve"> — Proposed extra properties a system carries in advance that would fix measurement outcomes. Bell’s theorem rules out the local kind; pilot-wave theory is a surviving nonlocal kind. (Chapter 13)</w:t>
       </w:r>
     </w:p>
     <w:p>
@@ -32853,7 +32853,7 @@
         <w:t>Hilbert space</w:t>
       </w:r>
       <w:r>
-        <w:t xml:space="preserve"> — The mathematical room in which quantum states live as vectors. Superposition is addition in that room. It is not a building in Coldharrow, though several clerks have asked.  (Chapter 1)</w:t>
+        <w:t xml:space="preserve"> — The mathematical room in which quantum states live as vectors. Superposition is addition in that room. It is not a building in Coldharrow, though several clerks have asked. (Chapter 1)</w:t>
       </w:r>
     </w:p>
     <w:p>
@@ -32885,7 +32885,7 @@
           <w:b/>
           <w:bCs/>
         </w:rPr>
-        <w:t xml:space="preserve">Holographic Duality (sometimes labelled AdS/CFT) — A fully worked example of holography: gravity in a curved box of space is exactly equivalent to an ordinary quantum theory, with no gravity, living only on that box’s boundary. Same physics, two descriptions; the boundary carries the whole story. See also Holographic Principle, the general claim this entry makes good on.  (Chapter 14)</w:t>
+        <w:t xml:space="preserve">Holographic Duality (sometimes labelled AdS/CFT) — A fully worked example of holography: gravity in a curved box of space is exactly equivalent to an ordinary quantum theory, with no gravity, living only on that box’s boundary. Same physics, two descriptions; the boundary carries the whole story. See also Holographic Principle, the general claim this entry makes good on. (Chapter 14)</w:t>
       </w:r>
       <w:r>
         <w:rPr>
@@ -32964,7 +32964,7 @@
           <w:b/>
           <w:bCs/>
         </w:rPr>
-        <w:t xml:space="preserve">Holographic Principle — The proposal that everything happening inside a region of space, gravity included, can be fully described by information on its lower-dimensional boundary. See also Holographic Duality, the one fully worked example of it.  (Chapter 14)</w:t>
+        <w:t xml:space="preserve">Holographic Principle — The proposal that everything happening inside a region of space, gravity included, can be fully described by information on its lower-dimensional boundary. See also Holographic Duality, the one fully worked example of it. (Chapter 14)</w:t>
       </w:r>
       <w:r>
         <w:rPr>
@@ -33060,7 +33060,7 @@
         <w:t>roblem (black-hole)</w:t>
       </w:r>
       <w:r>
-        <w:t xml:space="preserve"> — The unresolved question of what becomes of the detailed quantum information in everything a black hole swallows, given that its radiation looks merely thermal. Most physicists expect the information survives.  (Chapter 6)</w:t>
+        <w:t xml:space="preserve"> — The unresolved question of what becomes of the detailed quantum information in everything a black hole swallows, given that its radiation looks merely thermal. Most physicists expect the information survives. (Chapter 6)</w:t>
       </w:r>
     </w:p>
     <w:p>
@@ -33125,7 +33125,7 @@
         <w:t>Interference</w:t>
       </w:r>
       <w:r>
-        <w:t xml:space="preserve"> — The reinforcing or cancelling of quantum alternatives that have not been recorded, and the observable sign that a superposition is more than ordinary ignorance.  (Chapter 1)</w:t>
+        <w:t xml:space="preserve"> — The reinforcing or cancelling of quantum alternatives that have not been recorded, and the observable sign that a superposition is more than ordinary ignorance. (Chapter 1)</w:t>
       </w:r>
     </w:p>
     <w:p>
@@ -33159,7 +33159,7 @@
           <w:b/>
           <w:bCs/>
         </w:rPr>
-        <w:t xml:space="preserve">Landauer’s Principle — The result that erasing one bit of information has a minimum unavoidable energy cost, released as heat. The genuine, narrow link between information and thermodynamics. See Lesson 16’s aside on Maxwell’s demon, ancestor of every clerk who thinks information is free.  (Chapter 17)</w:t>
+        <w:t xml:space="preserve">Landauer’s Principle — The result that erasing one bit of information has a minimum unavoidable energy cost, released as heat. The genuine, narrow link between information and thermodynamics. See Lesson 16’s aside on Maxwell’s demon, ancestor of every clerk who thinks information is free. (Chapter 17)</w:t>
       </w:r>
       <w:r>
         <w:rPr>
@@ -33242,7 +33242,7 @@
         <w:t>Locality</w:t>
       </w:r>
       <w:r>
-        <w:t xml:space="preserve"> — The assumption that what is true here cannot depend on a distant, freely chosen measurement except through influences no faster than light. Bell’s theorem shows nature does not respect it in the way local hidden variables would require.  (Chapter 13)</w:t>
+        <w:t xml:space="preserve"> — The assumption that what is true here cannot depend on a distant, freely chosen measurement except through influences no faster than light. Bell’s theorem shows nature does not respect it in the way local hidden variables would require. (Chapter 13)</w:t>
       </w:r>
     </w:p>
     <w:p>
@@ -33307,7 +33307,7 @@
         <w:t>M-theory</w:t>
       </w:r>
       <w:r>
-        <w:t xml:space="preserve"> — The still-incomplete eleven-dimensional framework in which the five string theories are one structure seen five ways, and the fundamental objects include membranes as well as strings.  (Chapter 14)</w:t>
+        <w:t xml:space="preserve"> — The still-incomplete eleven-dimensional framework in which the five string theories are one structure seen five ways, and the fundamental objects include membranes as well as strings. (Chapter 14)</w:t>
       </w:r>
     </w:p>
     <w:p>
@@ -33372,7 +33372,7 @@
         <w:t>nterpretation</w:t>
       </w:r>
       <w:r>
-        <w:t xml:space="preserve"> — The view that the smooth quantum law never breaks down and every measurement-like interaction branches the universe, all outcomes occurring in branches that no longer interact. No collapse; unlimited branches.  (Chapter 11)</w:t>
+        <w:t xml:space="preserve"> — The view that the smooth quantum law never breaks down and every measurement-like interaction branches the universe, all outcomes occurring in branches that no longer interact. No collapse; unlimited branches. (Chapter 11)</w:t>
       </w:r>
     </w:p>
     <w:p>
@@ -33434,7 +33434,7 @@
           <w:b/>
           <w:bCs/>
         </w:rPr>
-        <w:t>Matter Wave — The wave aspect of material particles — the reason electrons produce diffraction and interference patterns.  (Chapter 12)</w:t>
+        <w:t>Matter Wave — The wave aspect of material particles — the reason electrons produce diffraction and interference patterns. (Chapter 12)</w:t>
       </w:r>
     </w:p>
     <w:p>
@@ -33499,7 +33499,7 @@
         <w:t>Measurement</w:t>
       </w:r>
       <w:r>
-        <w:t xml:space="preserve"> — In physics, any physical interaction that records or spreads information about an outcome. Not an act of attention: no mind, eye or clipboard required.  (Chapter 1)</w:t>
+        <w:t xml:space="preserve"> — In physics, any physical interaction that records or spreads information about an outcome. Not an act of attention: no mind, eye or clipboard required. (Chapter 1)</w:t>
       </w:r>
     </w:p>
     <w:p>
@@ -33564,7 +33564,7 @@
         <w:t>Measurement Basis</w:t>
       </w:r>
       <w:r>
-        <w:t xml:space="preserve"> — The particular set of alternatives a given apparatus can tell apart. For incompatible quantum properties there is no basis-independent set of true values waiting to be read off.  (Chapter 2)</w:t>
+        <w:t xml:space="preserve"> — The particular set of alternatives a given apparatus can tell apart. For incompatible quantum properties there is no basis-independent set of true values waiting to be read off. (Chapter 2)</w:t>
       </w:r>
     </w:p>
     <w:p>
@@ -33601,7 +33601,7 @@
         <w:t>Measurement Problem</w:t>
       </w:r>
       <w:r>
-        <w:t xml:space="preserve"> — The open question of what, if anything, turns the smooth quantum description into the single definite outcome an experiment records.  (Chapter 11)</w:t>
+        <w:t xml:space="preserve"> — The open question of what, if anything, turns the smooth quantum description into the single definite outcome an experiment records. (Chapter 11)</w:t>
       </w:r>
     </w:p>
     <w:p>
@@ -33667,7 +33667,7 @@
         <w:t xml:space="preserve">Negentropy — </w:t>
       </w:r>
       <w:r>
-        <w:t>Schrödinger’s phrase for the usable order a living thing takes in to maintain itself while exporting disorder to its surroundings. A scheme within the second law’s accounts, not an exemption from them.  (Chapter 18)</w:t>
+        <w:t>Schrödinger’s phrase for the usable order a living thing takes in to maintain itself while exporting disorder to its surroundings. A scheme within the second law’s accounts, not an exemption from them. (Chapter 18)</w:t>
       </w:r>
     </w:p>
     <w:p>
@@ -33746,7 +33746,7 @@
         <w:t>heorem</w:t>
       </w:r>
       <w:r>
-        <w:t xml:space="preserve"> — The proof that no physical process can make a perfect copy of an unknown arbitrary quantum state. Moving a state, or re-preparing a known one, is still allowed.  (Chapter 8)</w:t>
+        <w:t xml:space="preserve"> — The proof that no physical process can make a perfect copy of an unknown arbitrary quantum state. Moving a state, or re-preparing a known one, is still allowed. (Chapter 8)</w:t>
       </w:r>
     </w:p>
     <w:p>
@@ -33810,7 +33810,7 @@
         <w:t>No-communication theorem</w:t>
       </w:r>
       <w:r>
-        <w:t xml:space="preserve"> — The proof that entanglement’s correlations carry no usable signal between distant parties. Each local notebook looks random until the two are compared later, slowly.  (Chapter 7)</w:t>
+        <w:t xml:space="preserve"> — The proof that entanglement’s correlations carry no usable signal between distant parties. Each local notebook looks random until the two are compared later, slowly. (Chapter 7)</w:t>
       </w:r>
     </w:p>
     <w:p>
@@ -33869,7 +33869,7 @@
         <w:t>No-deleting theorem</w:t>
       </w:r>
       <w:r>
-        <w:t xml:space="preserve"> — The counterpart of no-cloning: from two copies of an unknown quantum state you cannot remove one cleanly, because the missing information has to show up elsewhere. The vault fails in both directions.  (Chapter 8)</w:t>
+        <w:t xml:space="preserve"> — The counterpart of no-cloning: from two copies of an unknown quantum state you cannot remove one cleanly, because the missing information has to show up elsewhere. The vault fails in both directions. (Chapter 8)</w:t>
       </w:r>
     </w:p>
     <w:p>
@@ -33904,7 +33904,7 @@
         <w:t>Nonlocality</w:t>
       </w:r>
       <w:r>
-        <w:t xml:space="preserve"> — A dependence of what is true here on a distant configuration, with no signal passing between. Pilot-wave theory is openly nonlocal; Bell’s theorem shows nature is not locally real.  (Chapter 13)</w:t>
+        <w:t xml:space="preserve"> — A dependence of what is true here on a distant configuration, with no signal passing between. Pilot-wave theory is openly nonlocal; Bell’s theorem shows nature is not locally real. (Chapter 13)</w:t>
       </w:r>
     </w:p>
     <w:p>
@@ -34003,7 +34003,7 @@
         <w:t>Page curve</w:t>
       </w:r>
       <w:r>
-        <w:t xml:space="preserve"> — The expected rise-then-fall of the entropy carried by a black hole’s emitted radiation, if the information is preserved. The early radiation looks thermal, and the later radiation carries correlations with it, which brings the entropy back down.  (Chapter 14)</w:t>
+        <w:t xml:space="preserve"> — The expected rise-then-fall of the entropy carried by a black hole’s emitted radiation, if the information is preserved. The early radiation looks thermal, and the later radiation carries correlations with it, which brings the entropy back down. (Chapter 14)</w:t>
       </w:r>
     </w:p>
     <w:p>
@@ -34066,7 +34066,7 @@
         <w:t>heory (de Broglie–Bohm)</w:t>
       </w:r>
       <w:r>
-        <w:t xml:space="preserve"> — An interpretation in which particles always have definite positions and are guided by a real, non-collapsing wave spread over every possible configuration. Deterministic and explicitly nonlocal.  (Chapter 12)</w:t>
+        <w:t xml:space="preserve"> — An interpretation in which particles always have definite positions and are guided by a real, non-collapsing wave spread over every possible configuration. Deterministic and explicitly nonlocal. (Chapter 12)</w:t>
       </w:r>
     </w:p>
     <w:p>
@@ -34145,7 +34145,7 @@
         <w:t>tates</w:t>
       </w:r>
       <w:r>
-        <w:t xml:space="preserve"> — The robust, stable states — typically well-defined positions — that survive constant environmental monitoring and make up the everyday classical world. They are the states that survive being photocopied by the environment; superpositions of very different positions do not photocopy.  (Chapter 10)</w:t>
+        <w:t xml:space="preserve"> — The robust, stable states — typically well-defined positions — that survive constant environmental monitoring and make up the everyday classical world. They are the states that survive being photocopied by the environment; superpositions of very different positions do not photocopy. (Chapter 10)</w:t>
       </w:r>
     </w:p>
     <w:p>
@@ -34206,7 +34206,7 @@
         <w:rPr>
           <w:b/>
         </w:rPr>
-        <w:t>QBism — An interpretation that treats the quantum state as an agent’s own degree of belief about what they will experience next, not as an objective, mind-independent description of the world.  (Chapter 11)</w:t>
+        <w:t>QBism — An interpretation that treats the quantum state as an agent’s own degree of belief about what they will experience next, not as an objective, mind-independent description of the world. (Chapter 11)</w:t>
       </w:r>
       <w:r>
         <w:t xml:space="preserve"/>
@@ -34247,7 +34247,7 @@
         <w:rPr>
           <w:bCs/>
         </w:rPr>
-        <w:t xml:space="preserve"> — The idea that especially robust states get copied redundantly into many parts of the environment, so that independent observers checking different fragments of it agree on the same outcome. The physical content behind Lolly’s phrase about agreement spreading at the speed of gossip.  (Chapter 11)</w:t>
+        <w:t xml:space="preserve"> — The idea that especially robust states get copied redundantly into many parts of the environment, so that independent observers checking different fragments of it agree on the same outcome. The physical content behind Lolly’s phrase about agreement spreading at the speed of gossip. (Chapter 11)</w:t>
       </w:r>
     </w:p>
     <w:p>
@@ -34312,7 +34312,7 @@
         <w:t>orrection</w:t>
       </w:r>
       <w:r>
-        <w:t xml:space="preserve"> — Protecting information by spreading it across many systems as a pattern, then checking for damage with syndrome measurements that locate errors without reading the protected data. Works below a threshold error rate, not above it.  (Chapter 16)</w:t>
+        <w:t xml:space="preserve"> — Protecting information by spreading it across many systems as a pattern, then checking for damage with syndrome measurements that locate errors without reading the protected data. Works below a threshold error rate, not above it. (Chapter 16)</w:t>
       </w:r>
     </w:p>
     <w:p>
@@ -34373,7 +34373,7 @@
         <w:rPr>
           <w:b/>
         </w:rPr>
-        <w:t>Quantum tunnelling — A system’s amplitude leaks through a barrier that classical energy accounting would call closed. Alpha decay, the scanning tunnelling microscope, and the Sun’s fusion all depend on it.  (Chapter 6 / Backlog)</w:t>
+        <w:t>Quantum tunnelling — A system’s amplitude leaks through a barrier that classical energy accounting would call closed. Alpha decay, the scanning tunnelling microscope, and the Sun’s fusion all depend on it. (Chapter 6 / Backlog)</w:t>
       </w:r>
     </w:p>
     <w:p>
@@ -34431,7 +34431,7 @@
           <w:b/>
           <w:bCs/>
         </w:rPr>
-        <w:t>Quantum Zeno Effect — The real, observed effect by which very frequent measurements of a quantum system can inhibit its normal change. Not a licence for anyone to freeze a thing by watching it.  (Chapter 4)</w:t>
+        <w:t>Quantum Zeno Effect — The real, observed effect by which very frequent measurements of a quantum system can inhibit its normal change. Not a licence for anyone to freeze a thing by watching it. (Chapter 4)</w:t>
       </w:r>
     </w:p>
     <w:p>
@@ -34495,7 +34495,7 @@
         <w:t>Relational quantum mechanics</w:t>
       </w:r>
       <w:r>
-        <w:t xml:space="preserve"> — Rovelli’s account: facts about a system are relative to another system, not absolute. Wigner and his friend need not share one official list.  (Chapter 11)</w:t>
+        <w:t xml:space="preserve"> — Rovelli’s account: facts about a system are relative to another system, not absolute. Wigner and his friend need not share one official list. (Chapter 11)</w:t>
       </w:r>
     </w:p>
     <w:p>
@@ -34602,7 +34602,7 @@
         <w:t xml:space="preserve">at — </w:t>
       </w:r>
       <w:r>
-        <w:t>Schrödinger’s 1935 thought experiment, meant as a reductio ad absurdum of an unexplained measurement process — not a claim that a cat is literally half alive.  (Chapter 19)</w:t>
+        <w:t>Schrödinger’s 1935 thought experiment, meant as a reductio ad absurdum of an unexplained measurement process — not a claim that a cat is literally half alive. (Chapter 19)</w:t>
       </w:r>
     </w:p>
     <w:p>
@@ -34667,7 +34667,7 @@
         <w:t>Second Law of Thermodynamics</w:t>
       </w:r>
       <w:r>
-        <w:t xml:space="preserve"> — Total entropy never decreases, so local order has to be paid for by exporting more disorder elsewhere.  (Chapter 17)</w:t>
+        <w:t xml:space="preserve"> — Total entropy never decreases, so local order has to be paid for by exporting more disorder elsewhere. (Chapter 17)</w:t>
       </w:r>
     </w:p>
     <w:p>
@@ -34718,7 +34718,7 @@
         <w:t>uantum state)</w:t>
       </w:r>
       <w:r>
-        <w:t xml:space="preserve"> — The complete account physics can give of a system: what results its possible measurements can produce, and with what probabilities. Not a location, and not a hidden ledger of answers.  (Chapter 1)</w:t>
+        <w:t xml:space="preserve"> — The complete account physics can give of a system: what results its possible measurements can produce, and with what probabilities. Not a location, and not a hidden ledger of answers. (Chapter 1)</w:t>
       </w:r>
     </w:p>
     <w:p>
@@ -34780,7 +34780,7 @@
           <w:b/>
           <w:bCs/>
         </w:rPr>
-        <w:t xml:space="preserve">State Reduction — The idealised update of a state to the outcome just recorded; an immediate repeat of the same measurement then returns the same result with certainty. See also Collapse, the everyday name for the same jump.  (Chapter 4)</w:t>
+        <w:t xml:space="preserve">State Reduction — The idealised update of a state to the outcome just recorded; an immediate repeat of the same measurement then returns the same result with certainty. See also Collapse, the everyday name for the same jump. (Chapter 4)</w:t>
       </w:r>
       <w:r>
         <w:rPr>
@@ -34860,7 +34860,7 @@
           <w:bCs/>
         </w:rPr>
         <w:lastRenderedPageBreak/>
-        <w:t xml:space="preserve">String Theory — The proposal that the basic objects of nature are tiny vibrating extended things rather than points, with different vibrations appearing as different particles. Five different, independently consistent versions were developed before physicists realised they were one theory seen five ways — see Duality and M-theory. Mathematically rich, experimentally unconfirmed.  (Chapter 14)</w:t>
+        <w:t xml:space="preserve">String Theory — The proposal that the basic objects of nature are tiny vibrating extended things rather than points, with different vibrations appearing as different particles. Five different, independently consistent versions were developed before physicists realised they were one theory seen five ways — see Duality and M-theory. Mathematically rich, experimentally unconfirmed. (Chapter 14)</w:t>
       </w:r>
       <w:r>
         <w:rPr>
@@ -34942,7 +34942,7 @@
         <w:t>Superposition</w:t>
       </w:r>
       <w:r>
-        <w:t xml:space="preserve"> — A quantum state that combines alternatives without secretly holding one definite answer to the question being asked; its alternatives can interfere. Not “two places at once” in the naive sense.  (Chapter 1)</w:t>
+        <w:t xml:space="preserve"> — A quantum state that combines alternatives without secretly holding one definite answer to the question being asked; its alternatives can interfere. Not “two places at once” in the naive sense. (Chapter 1)</w:t>
       </w:r>
     </w:p>
     <w:p>
@@ -35021,7 +35021,7 @@
         <w:t>easurement</w:t>
       </w:r>
       <w:r>
-        <w:t xml:space="preserve"> — A measurement, in quantum error correction, that reveals which kind of damage has occurred without reading out, and so without disturbing, the protected logical state itself.  (Chapter 16)</w:t>
+        <w:t xml:space="preserve"> — A measurement, in quantum error correction, that reveals which kind of damage has occurred without reading out, and so without disturbing, the protected logical state itself. (Chapter 16)</w:t>
       </w:r>
     </w:p>
     <w:p>
@@ -35100,7 +35100,7 @@
         <w:t>ound</w:t>
       </w:r>
       <w:r>
-        <w:t xml:space="preserve"> — The ceiling quantum mechanics puts on its own Bell (CHSH) correlations: S ≤ 2√2 ≈ 2.83 — above the local-realistic limit of 2, but not unlimited.  (Chapter 13)</w:t>
+        <w:t xml:space="preserve"> — The ceiling quantum mechanics puts on its own Bell (CHSH) correlations: S ≤ 2√2 ≈ 2.83 — above the local-realistic limit of 2, but not unlimited. (Chapter 13)</w:t>
       </w:r>
     </w:p>
     <w:p>
@@ -35179,7 +35179,7 @@
         <w:t>rinciple</w:t>
       </w:r>
       <w:r>
-        <w:t xml:space="preserve"> — The intrinsic limit that a quantum system cannot be prepared with arbitrarily sharp values of both position and momentum at once: Δx·Δp ≥ ℏ/2. A fact about states, not about instruments.  (Chapter 9)</w:t>
+        <w:t xml:space="preserve"> — The intrinsic limit that a quantum system cannot be prepared with arbitrarily sharp values of both position and momentum at once: Δx·Δp ≥ ℏ/2. A fact about states, not about instruments. (Chapter 9)</w:t>
       </w:r>
     </w:p>
     <w:p>
@@ -35265,7 +35265,7 @@
         <w:t>volution</w:t>
       </w:r>
       <w:r>
-        <w:t xml:space="preserve"> — The technical name for the smooth, reversible, probability-preserving change a state undergoes under the Schrödinger equation.  (Chapter 5)</w:t>
+        <w:t xml:space="preserve"> — The technical name for the smooth, reversible, probability-preserving change a state undergoes under the Schrödinger equation. (Chapter 5)</w:t>
       </w:r>
     </w:p>
     <w:p>
@@ -35329,7 +35329,7 @@
         <w:t>Unruh effect</w:t>
       </w:r>
       <w:r>
-        <w:t xml:space="preserve"> — An accelerating observer can find a warm bath in a vacuum that an inertial observer calls empty. Cousin to Hawking radiation; a different reason to distrust the word “nothing.”  (Chapter 6)</w:t>
+        <w:t xml:space="preserve"> — An accelerating observer can find a warm bath in a vacuum that an inertial observer calls empty. Cousin to Hawking radiation; a different reason to distrust the word “nothing.” (Chapter 6)</w:t>
       </w:r>
     </w:p>
     <w:p>
@@ -35404,7 +35404,7 @@
         <w:t>riend</w:t>
       </w:r>
       <w:r>
-        <w:t xml:space="preserve"> — A thought experiment in which an observer inside a sealed laboratory records a definite result while an observer outside must still describe the whole laboratory as one unresolved quantum system. It sharpens the measurement problem.  (Chapter 11)</w:t>
+        <w:t xml:space="preserve"> — A thought experiment in which an observer inside a sealed laboratory records a definite result while an observer outside must still describe the whole laboratory as one unresolved quantum system. It sharpens the measurement problem. (Chapter 11)</w:t>
       </w:r>
     </w:p>
     <w:p>
@@ -38629,7 +38629,7 @@
           <w:b/>
           <w:bCs/>
         </w:rPr>
-        <w:t xml:space="preserve">      </w:t>
+        <w:t xml:space="preserve"/>
       </w:r>
     </w:p>
     <w:sectPr>

</xml_diff>

<commit_message>
Lolly Wren: add accessible back covers to Kindle books
</commit_message>
<xml_diff>
--- a/Lolly Wren's Curious Science Adventures - SERIES/Book 1 - Schrodingers Paperwork/Schrodingers_Paperwork_BOOK_1_KINDLE_FINAL.docx
+++ b/Lolly Wren's Curious Science Adventures - SERIES/Book 1 - Schrodingers Paperwork/Schrodingers_Paperwork_BOOK_1_KINDLE_FINAL.docx
@@ -21,7 +21,7 @@
           <wp:inline distT="0" distB="0" distL="114300" distR="114300">
             <wp:extent cx="7825060" cy="10082093"/>
             <wp:effectExtent l="0" t="0" r="5080" b="0"/>
-            <wp:docPr id="1810313803" name="Picture 1"/>
+            <wp:docPr id="1810313803" name="Picture 1" descr="Front cover illustration for Schr?dinger?s Paperwork, showing Lolly and colleagues in the Ministry."/>
             <wp:cNvGraphicFramePr>
               <a:graphicFrameLocks xmlns:a="http://schemas.openxmlformats.org/drawingml/2006/main" noChangeAspect="1"/>
             </wp:cNvGraphicFramePr>
@@ -18778,7 +18778,7 @@
           <wp:inline distT="0" distB="0" distL="0" distR="0" wp14:anchorId="4AAC2BCB" wp14:editId="1B89BFD3">
             <wp:extent cx="5444191" cy="3752603"/>
             <wp:effectExtent l="0" t="0" r="4445" b="635"/>
-            <wp:docPr id="9001" name="Figure 9001"/>
+            <wp:docPr id="9001" name="Figure 9001" descr="Double-slit diagram: both paths contribute until a measurement records which path."/>
             <wp:cNvGraphicFramePr>
               <a:graphicFrameLocks xmlns:a="http://schemas.openxmlformats.org/drawingml/2006/main" noChangeAspect="1"/>
             </wp:cNvGraphicFramePr>
@@ -19502,7 +19502,7 @@
           <wp:inline distT="0" distB="0" distL="0" distR="0" wp14:anchorId="3B3C522E" wp14:editId="142989AD">
             <wp:extent cx="4846320" cy="3340499"/>
             <wp:effectExtent l="0" t="0" r="0" b="0"/>
-            <wp:docPr id="9002" name="Figure 9002"/>
+            <wp:docPr id="9002" name="Figure 9002" descr="Two measurement-basis diagrams show how the apparatus determines which property is measured."/>
             <wp:cNvGraphicFramePr>
               <a:graphicFrameLocks xmlns:a="http://schemas.openxmlformats.org/drawingml/2006/main" noChangeAspect="1"/>
             </wp:cNvGraphicFramePr>
@@ -20217,7 +20217,7 @@
           <wp:inline distT="0" distB="0" distL="0" distR="0" wp14:anchorId="189378F5" wp14:editId="6C9410F0">
             <wp:extent cx="4846320" cy="6140980"/>
             <wp:effectExtent l="0" t="0" r="0" b="0"/>
-            <wp:docPr id="9003" name="Figure 9003"/>
+            <wp:docPr id="9003" name="Figure 9003" descr="Two measurement arrangements route a particle through different paths to a detector."/>
             <wp:cNvGraphicFramePr>
               <a:graphicFrameLocks xmlns:a="http://schemas.openxmlformats.org/drawingml/2006/main" noChangeAspect="1"/>
             </wp:cNvGraphicFramePr>
@@ -21062,7 +21062,7 @@
           <wp:inline distT="0" distB="0" distL="0" distR="0" wp14:anchorId="075AC166" wp14:editId="3B967230">
             <wp:extent cx="4548249" cy="3135043"/>
             <wp:effectExtent l="0" t="0" r="5080" b="8255"/>
-            <wp:docPr id="9004" name="Figure 9004"/>
+            <wp:docPr id="9004" name="Figure 9004" descr="Clock diagram illustrating the quantum Zeno effect: repeated checks slow a state?s change."/>
             <wp:cNvGraphicFramePr>
               <a:graphicFrameLocks xmlns:a="http://schemas.openxmlformats.org/drawingml/2006/main" noChangeAspect="1"/>
             </wp:cNvGraphicFramePr>
@@ -21692,7 +21692,7 @@
           <wp:inline distT="0" distB="0" distL="0" distR="0" wp14:anchorId="62EDB701" wp14:editId="5AC04F25">
             <wp:extent cx="4524498" cy="3277182"/>
             <wp:effectExtent l="0" t="0" r="0" b="0"/>
-            <wp:docPr id="9005" name="Figure 9005"/>
+            <wp:docPr id="9005" name="Figure 9005" descr="Three wave-packet profiles show a localized packet spreading over time."/>
             <wp:cNvGraphicFramePr>
               <a:graphicFrameLocks xmlns:a="http://schemas.openxmlformats.org/drawingml/2006/main" noChangeAspect="1"/>
             </wp:cNvGraphicFramePr>
@@ -22477,7 +22477,7 @@
           <wp:inline distT="0" distB="0" distL="0" distR="0" wp14:anchorId="17335606" wp14:editId="1DF7A381">
             <wp:extent cx="4678877" cy="3027292"/>
             <wp:effectExtent l="0" t="0" r="7620" b="1905"/>
-            <wp:docPr id="9006" name="Figure 9006"/>
+            <wp:docPr id="9006" name="Figure 9006" descr="Plot of black-hole mass decreasing as temperature rises during evaporation."/>
             <wp:cNvGraphicFramePr>
               <a:graphicFrameLocks xmlns:a="http://schemas.openxmlformats.org/drawingml/2006/main" noChangeAspect="1"/>
             </wp:cNvGraphicFramePr>
@@ -23090,7 +23090,7 @@
           <wp:inline distT="0" distB="0" distL="0" distR="0" wp14:anchorId="3E8FF790" wp14:editId="0FBDEFFD">
             <wp:extent cx="4599994" cy="3170712"/>
             <wp:effectExtent l="0" t="0" r="0" b="0"/>
-            <wp:docPr id="9007" name="Figure 9007"/>
+            <wp:docPr id="9007" name="Figure 9007" descr="Two separated stations share an entangled origin; the diagram emphasizes that no signal travels between them."/>
             <wp:cNvGraphicFramePr>
               <a:graphicFrameLocks xmlns:a="http://schemas.openxmlformats.org/drawingml/2006/main" noChangeAspect="1"/>
             </wp:cNvGraphicFramePr>
@@ -23784,7 +23784,7 @@
           <wp:inline distT="0" distB="0" distL="0" distR="0" wp14:anchorId="422A6769" wp14:editId="6031BF09">
             <wp:extent cx="5610722" cy="2256312"/>
             <wp:effectExtent l="0" t="0" r="9525" b="0"/>
-            <wp:docPr id="9008" name="Figure 9008"/>
+            <wp:docPr id="9008" name="Figure 9008" descr="A spread-out unknown quantum state is compared with damaged partial patterns that can be repaired but not copied."/>
             <wp:cNvGraphicFramePr>
               <a:graphicFrameLocks xmlns:a="http://schemas.openxmlformats.org/drawingml/2006/main" noChangeAspect="1"/>
             </wp:cNvGraphicFramePr>
@@ -24544,7 +24544,7 @@
           <wp:inline distT="0" distB="0" distL="0" distR="0" wp14:anchorId="4F52FAD6" wp14:editId="3709DB44">
             <wp:extent cx="4008257" cy="3170712"/>
             <wp:effectExtent l="0" t="0" r="0" b="0"/>
-            <wp:docPr id="9009" name="Figure 9009"/>
+            <wp:docPr id="9009" name="Figure 9009" descr="Four probability curves compare narrow and broad position with broad and narrow momentum."/>
             <wp:cNvGraphicFramePr>
               <a:graphicFrameLocks xmlns:a="http://schemas.openxmlformats.org/drawingml/2006/main" noChangeAspect="1"/>
             </wp:cNvGraphicFramePr>
@@ -25171,7 +25171,7 @@
           <wp:inline distT="0" distB="0" distL="0" distR="0" wp14:anchorId="3681C9A1" wp14:editId="5B4C3871">
             <wp:extent cx="4758388" cy="2933206"/>
             <wp:effectExtent l="0" t="0" r="4445" b="635"/>
-            <wp:docPr id="9010" name="Figure 9010"/>
+            <wp:docPr id="9010" name="Figure 9010" descr="An isolated sphere is contrasted with the Moon interacting with its environment, illustrating decoherence."/>
             <wp:cNvGraphicFramePr>
               <a:graphicFrameLocks xmlns:a="http://schemas.openxmlformats.org/drawingml/2006/main" noChangeAspect="1"/>
             </wp:cNvGraphicFramePr>
@@ -25782,7 +25782,7 @@
           <wp:inline distT="0" distB="0" distL="0" distR="0" wp14:anchorId="0729DFA0" wp14:editId="72FCFA25">
             <wp:extent cx="4238200" cy="2921330"/>
             <wp:effectExtent l="0" t="0" r="0" b="0"/>
-            <wp:docPr id="9011" name="Figure 9011"/>
+            <wp:docPr id="9011" name="Figure 9011" descr="Wigner?s friend records a result inside a laboratory while Wigner observes from outside."/>
             <wp:cNvGraphicFramePr>
               <a:graphicFrameLocks xmlns:a="http://schemas.openxmlformats.org/drawingml/2006/main" noChangeAspect="1"/>
             </wp:cNvGraphicFramePr>
@@ -26488,7 +26488,7 @@
           <wp:inline distT="0" distB="0" distL="0" distR="0" wp14:anchorId="536E5834" wp14:editId="1E62C1F9">
             <wp:extent cx="5082393" cy="3503221"/>
             <wp:effectExtent l="0" t="0" r="4445" b="2540"/>
-            <wp:docPr id="9012" name="Figure 9012"/>
+            <wp:docPr id="9012" name="Figure 9012" descr="Pilot-wave diagram: a particle follows one path while the guiding wave passes through both slits."/>
             <wp:cNvGraphicFramePr>
               <a:graphicFrameLocks xmlns:a="http://schemas.openxmlformats.org/drawingml/2006/main" noChangeAspect="1"/>
             </wp:cNvGraphicFramePr>
@@ -27175,7 +27175,7 @@
           <wp:inline distT="0" distB="0" distL="0" distR="0" wp14:anchorId="236A7A4C" wp14:editId="44F1FE80">
             <wp:extent cx="5015936" cy="3277590"/>
             <wp:effectExtent l="0" t="0" r="0" b="0"/>
-            <wp:docPr id="9013" name="Figure 9013"/>
+            <wp:docPr id="9013" name="Figure 9013" descr="Bell-test diagram and bar chart comparing the local bound of 2 with the quantum CHSH value of 2.83."/>
             <wp:cNvGraphicFramePr>
               <a:graphicFrameLocks xmlns:a="http://schemas.openxmlformats.org/drawingml/2006/main" noChangeAspect="1"/>
             </wp:cNvGraphicFramePr>
@@ -28008,7 +28008,7 @@
           <wp:inline distT="0" distB="0" distL="0" distR="0" wp14:anchorId="785BF1D9" wp14:editId="37C748AF">
             <wp:extent cx="4176198" cy="4707172"/>
             <wp:effectExtent l="0" t="0" r="0" b="0"/>
-            <wp:docPr id="9014" name="Figure 9014"/>
+            <wp:docPr id="9014" name="Figure 9014" descr="A central string-theory diagram connects five formulations to a shared underlying structure."/>
             <wp:cNvGraphicFramePr>
               <a:graphicFrameLocks xmlns:a="http://schemas.openxmlformats.org/drawingml/2006/main" noChangeAspect="1"/>
             </wp:cNvGraphicFramePr>
@@ -28510,7 +28510,7 @@
           <wp:inline distT="0" distB="0" distL="0" distR="0" wp14:anchorId="6C953376" wp14:editId="32E43193">
             <wp:extent cx="4846320" cy="5462495"/>
             <wp:effectExtent l="0" t="0" r="0" b="0"/>
-            <wp:docPr id="9015" name="Figure 9015"/>
+            <wp:docPr id="9015" name="Figure 9015" descr="A holographic illustration contrasts a three-dimensional volume with information represented on its boundary."/>
             <wp:cNvGraphicFramePr>
               <a:graphicFrameLocks xmlns:a="http://schemas.openxmlformats.org/drawingml/2006/main" noChangeAspect="1"/>
             </wp:cNvGraphicFramePr>
@@ -29152,7 +29152,7 @@
           <wp:inline distT="0" distB="0" distL="0" distR="0" wp14:anchorId="774EAA0B" wp14:editId="059F044A">
             <wp:extent cx="4508664" cy="2505694"/>
             <wp:effectExtent l="0" t="0" r="6350" b="9525"/>
-            <wp:docPr id="9016" name="Figure 9016"/>
+            <wp:docPr id="9016" name="Figure 9016" descr="Recovery grid distinguishes recovered, inferred, and named-gone records."/>
             <wp:cNvGraphicFramePr>
               <a:graphicFrameLocks xmlns:a="http://schemas.openxmlformats.org/drawingml/2006/main" noChangeAspect="1"/>
             </wp:cNvGraphicFramePr>
@@ -29797,7 +29797,7 @@
           <wp:inline distT="0" distB="0" distL="0" distR="0" wp14:anchorId="3019F7D4" wp14:editId="7634E78B">
             <wp:extent cx="5172364" cy="2660073"/>
             <wp:effectExtent l="0" t="0" r="9525" b="6985"/>
-            <wp:docPr id="9017" name="Figure 9017"/>
+            <wp:docPr id="9017" name="Figure 9017" descr="Thermodynamics flow diagram: maintaining an ordered kitchen releases heat and waste to the surroundings."/>
             <wp:cNvGraphicFramePr>
               <a:graphicFrameLocks xmlns:a="http://schemas.openxmlformats.org/drawingml/2006/main" noChangeAspect="1"/>
             </wp:cNvGraphicFramePr>
@@ -30327,7 +30327,7 @@
           <wp:inline distT="0" distB="0" distL="0" distR="0" wp14:anchorId="4FC9386F" wp14:editId="2C396F29">
             <wp:extent cx="5464310" cy="2232561"/>
             <wp:effectExtent l="0" t="0" r="3175" b="0"/>
-            <wp:docPr id="9018" name="Figure 9018"/>
+            <wp:docPr id="9018" name="Figure 9018" descr="A living ordered pattern is shown holding together while exporting heat and waste."/>
             <wp:cNvGraphicFramePr>
               <a:graphicFrameLocks xmlns:a="http://schemas.openxmlformats.org/drawingml/2006/main" noChangeAspect="1"/>
             </wp:cNvGraphicFramePr>
@@ -30908,7 +30908,7 @@
           <wp:inline distT="0" distB="0" distL="0" distR="0" wp14:anchorId="4F04F242" wp14:editId="4DCCE34A">
             <wp:extent cx="6772383" cy="2575413"/>
             <wp:effectExtent l="0" t="0" r="0" b="0"/>
-            <wp:docPr id="9019" name="Figure 9019"/>
+            <wp:docPr id="9019" name="Figure 9019" descr="Timeline of the stelliferous, degenerate, black-hole, and dark eras of the universe."/>
             <wp:cNvGraphicFramePr>
               <a:graphicFrameLocks xmlns:a="http://schemas.openxmlformats.org/drawingml/2006/main" noChangeAspect="1"/>
             </wp:cNvGraphicFramePr>
@@ -38556,80 +38556,44 @@
     </w:p>
     <w:p>
       <w:pPr>
-        <w:rPr>
-          <w:b/>
-          <w:bCs/>
-          <w:color w:val="0070C0"/>
-        </w:rPr>
-      </w:pPr>
-      <w:r>
-        <w:rPr>
-          <w:b/>
-          <w:bCs/>
-        </w:rPr>
-        <w:br w:type="page"/>
-      </w:r>
-      <w:r>
-        <w:rPr>
-          <w:b/>
-          <w:bCs/>
-          <w:noProof/>
-        </w:rPr>
-        <w:lastRenderedPageBreak/>
+        <w:keepLines/>
+        <w:pageBreakBefore/>
+        <w:spacing w:before="0" w:after="0"/>
+        <w:jc w:val="center"/>
+      </w:pPr>
+      <w:r>
         <w:drawing>
-          <wp:inline distT="0" distB="0" distL="114300" distR="114300">
-            <wp:extent cx="7741920" cy="10032620"/>
-            <wp:effectExtent l="0" t="0" r="0" b="6985"/>
-            <wp:docPr id="217547780" name="Picture 1"/>
+          <wp:inline xmlns:a="http://schemas.openxmlformats.org/drawingml/2006/main" xmlns:pic="http://schemas.openxmlformats.org/drawingml/2006/picture">
+            <wp:extent cx="6096000" cy="9144000"/>
+            <wp:docPr id="1810313804" name="Picture 1810313804" descr="Back cover panel with the book description, reader comparison, Lolly and Gideon notes, author name, and series description." title="Back cover"/>
             <wp:cNvGraphicFramePr>
-              <a:graphicFrameLocks xmlns:a="http://schemas.openxmlformats.org/drawingml/2006/main" noChangeAspect="1"/>
+              <a:graphicFrameLocks noChangeAspect="1"/>
             </wp:cNvGraphicFramePr>
-            <a:graphic xmlns:a="http://schemas.openxmlformats.org/drawingml/2006/main">
+            <a:graphic>
               <a:graphicData uri="http://schemas.openxmlformats.org/drawingml/2006/picture">
-                <pic:pic xmlns:pic="http://schemas.openxmlformats.org/drawingml/2006/picture">
+                <pic:pic>
                   <pic:nvPicPr>
-                    <pic:cNvPr id="217547780" name="Picture 1"/>
-                    <pic:cNvPicPr>
-                      <a:picLocks noChangeAspect="1" noChangeArrowheads="1"/>
-                    </pic:cNvPicPr>
+                    <pic:cNvPr id="0" name="image.png"/>
+                    <pic:cNvPicPr/>
                   </pic:nvPicPr>
                   <pic:blipFill>
-                    <a:blip r:embed="rId103">
-                      <a:extLst>
-                        <a:ext uri="{28A0092B-C50C-407E-A947-70E740481C1C}">
-                          <a14:useLocalDpi xmlns:a14="http://schemas.microsoft.com/office/drawing/2010/main" val="0"/>
-                        </a:ext>
-                      </a:extLst>
-                    </a:blip>
+                    <a:blip r:embed="rId103"/>
                     <a:stretch>
                       <a:fillRect/>
                     </a:stretch>
                   </pic:blipFill>
-                  <pic:spPr bwMode="auto">
+                  <pic:spPr>
                     <a:xfrm>
                       <a:off x="0" y="0"/>
-                      <a:ext cx="7741920" cy="10032620"/>
+                      <a:ext cx="6096000" cy="9144000"/>
                     </a:xfrm>
-                    <a:prstGeom prst="rect">
-                      <a:avLst/>
-                    </a:prstGeom>
-                    <a:noFill/>
-                    <a:ln>
-                      <a:noFill/>
-                    </a:ln>
+                    <a:prstGeom prst="rect"/>
                   </pic:spPr>
                 </pic:pic>
               </a:graphicData>
             </a:graphic>
           </wp:inline>
         </w:drawing>
-      </w:r>
-      <w:r>
-        <w:rPr>
-          <w:b/>
-          <w:bCs/>
-        </w:rPr>
-        <w:t xml:space="preserve"/>
       </w:r>
     </w:p>
     <w:sectPr>

</xml_diff>

<commit_message>
Switch Book 1 Kindle cover artwork
</commit_message>
<xml_diff>
--- a/Lolly Wren's Curious Science Adventures - SERIES/Book 1 - Schrodingers Paperwork/Schrodingers_Paperwork_BOOK_1_KINDLE_FINAL.docx
+++ b/Lolly Wren's Curious Science Adventures - SERIES/Book 1 - Schrodingers Paperwork/Schrodingers_Paperwork_BOOK_1_KINDLE_FINAL.docx
@@ -38564,7 +38564,7 @@
       <w:r>
         <w:drawing>
           <wp:inline xmlns:a="http://schemas.openxmlformats.org/drawingml/2006/main" xmlns:pic="http://schemas.openxmlformats.org/drawingml/2006/picture">
-            <wp:extent cx="6096000" cy="9144000"/>
+            <wp:extent cx="6096000" cy="9081796"/>
             <wp:docPr id="1810313804" name="Picture 1810313804" descr="Back cover panel with the book description, reader comparison, Lolly and Gideon notes, author name, and series description." title="Back cover"/>
             <wp:cNvGraphicFramePr>
               <a:graphicFrameLocks noChangeAspect="1"/>
@@ -38585,7 +38585,7 @@
                   <pic:spPr>
                     <a:xfrm>
                       <a:off x="0" y="0"/>
-                      <a:ext cx="6096000" cy="9144000"/>
+                      <a:ext cx="6096000" cy="9081796"/>
                     </a:xfrm>
                     <a:prstGeom prst="rect"/>
                   </pic:spPr>

</xml_diff>

<commit_message>
Lolly Wren 1: commit Codex's latest master as is (REV1 = KINDLE_FINAL 4:55 PM), status notes; 2560 cover kept in book bak
</commit_message>
<xml_diff>
--- a/Lolly Wren's Curious Science Adventures - SERIES/Book 1 - Schrodingers Paperwork/Schrodingers_Paperwork_BOOK_1_KINDLE_FINAL.docx
+++ b/Lolly Wren's Curious Science Adventures - SERIES/Book 1 - Schrodingers Paperwork/Schrodingers_Paperwork_BOOK_1_KINDLE_FINAL.docx
@@ -19,9 +19,9 @@
         </w:rPr>
         <w:drawing>
           <wp:inline distT="0" distB="0" distL="114300" distR="114300">
-            <wp:extent cx="7825060" cy="10082093"/>
+            <wp:extent cx="6675120" cy="8404860"/>
             <wp:effectExtent l="0" t="0" r="5080" b="0"/>
-            <wp:docPr id="1810313803" name="Picture 1" descr="Front cover illustration for Schr?dinger?s Paperwork, showing Lolly and colleagues in the Ministry."/>
+            <wp:docPr id="1810313803" name="Picture 1" descr="Front cover: selected Kindle cover artwork."/>
             <wp:cNvGraphicFramePr>
               <a:graphicFrameLocks xmlns:a="http://schemas.openxmlformats.org/drawingml/2006/main" noChangeAspect="1"/>
             </wp:cNvGraphicFramePr>
@@ -49,7 +49,7 @@
                   <pic:spPr bwMode="auto">
                     <a:xfrm>
                       <a:off x="0" y="0"/>
-                      <a:ext cx="7825060" cy="10082093"/>
+                      <a:ext cx="6675120" cy="8404860"/>
                     </a:xfrm>
                     <a:prstGeom prst="rect">
                       <a:avLst/>

</xml_diff>